<commit_message>
Added notes for 24/201
</commit_message>
<xml_diff>
--- a/section24_express.js/section24_expressjsNotes.docx
+++ b/section24_express.js/section24_expressjsNotes.docx
@@ -3,12 +3,33 @@
 <w:document xmlns:wpc="http://schemas.microsoft.com/office/word/2010/wordprocessingCanvas" xmlns:cx="http://schemas.microsoft.com/office/drawing/2014/chartex" xmlns:cx1="http://schemas.microsoft.com/office/drawing/2015/9/8/chartex" xmlns:cx2="http://schemas.microsoft.com/office/drawing/2015/10/21/chartex" xmlns:cx3="http://schemas.microsoft.com/office/drawing/2016/5/9/chartex" xmlns:cx4="http://schemas.microsoft.com/office/drawing/2016/5/10/chartex" xmlns:cx5="http://schemas.microsoft.com/office/drawing/2016/5/11/chartex" xmlns:cx6="http://schemas.microsoft.com/office/drawing/2016/5/12/chartex" xmlns:cx7="http://schemas.microsoft.com/office/drawing/2016/5/13/chartex" xmlns:cx8="http://schemas.microsoft.com/office/drawing/2016/5/14/chartex" xmlns:mc="http://schemas.openxmlformats.org/markup-compatibility/2006" xmlns:aink="http://schemas.microsoft.com/office/drawing/2016/ink" xmlns:am3d="http://schemas.microsoft.com/office/drawing/2017/model3d" xmlns:o="urn:schemas-microsoft-com:office:office" xmlns:oel="http://schemas.microsoft.com/office/2019/extlst" xmlns:r="http://schemas.openxmlformats.org/officeDocument/2006/relationships" xmlns:m="http://schemas.openxmlformats.org/officeDocument/2006/math" xmlns:v="urn:schemas-microsoft-com:vml" xmlns:wp14="http://schemas.microsoft.com/office/word/2010/wordprocessingDrawing" xmlns:wp="http://schemas.openxmlformats.org/drawingml/2006/wordprocessingDrawing" xmlns:w10="urn:schemas-microsoft-com:office:word" xmlns:w="http://schemas.openxmlformats.org/wordprocessingml/2006/main" xmlns:w14="http://schemas.microsoft.com/office/word/2010/wordml" xmlns:w15="http://schemas.microsoft.com/office/word/2012/wordml" xmlns:w16cex="http://schemas.microsoft.com/office/word/2018/wordml/cex" xmlns:w16cid="http://schemas.microsoft.com/office/word/2016/wordml/cid" xmlns:w16="http://schemas.microsoft.com/office/word/2018/wordml" xmlns:w16du="http://schemas.microsoft.com/office/word/2023/wordml/word16du" xmlns:w16sdtdh="http://schemas.microsoft.com/office/word/2020/wordml/sdtdatahash" xmlns:w16se="http://schemas.microsoft.com/office/word/2015/wordml/symex" xmlns:wpg="http://schemas.microsoft.com/office/word/2010/wordprocessingGroup" xmlns:wpi="http://schemas.microsoft.com/office/word/2010/wordprocessingInk" xmlns:wne="http://schemas.microsoft.com/office/word/2006/wordml" xmlns:wps="http://schemas.microsoft.com/office/word/2010/wordprocessingShape" mc:Ignorable="w14 w15 w16se w16cid w16 w16cex w16sdtdh w16du wp14">
   <w:body>
     <w:p>
-      <w:r>
+      <w:pPr>
+        <w:jc w:val="center"/>
+        <w:rPr>
+          <w:b/>
+          <w:bCs/>
+        </w:rPr>
+      </w:pPr>
+      <w:r>
+        <w:rPr>
+          <w:b/>
+          <w:bCs/>
+        </w:rPr>
         <w:t>Section 24: Express.js with Node.js</w:t>
       </w:r>
     </w:p>
     <w:p>
-      <w:r>
+      <w:pPr>
+        <w:rPr>
+          <w:b/>
+          <w:bCs/>
+        </w:rPr>
+      </w:pPr>
+      <w:r>
+        <w:rPr>
+          <w:b/>
+          <w:bCs/>
+        </w:rPr>
         <w:t>200. What is Express?</w:t>
       </w:r>
     </w:p>
@@ -48,6 +69,871 @@
         <w:t>Express streamlines the development process, making it faster and more efficient to build web applications compared to using raw Node.js.</w:t>
       </w:r>
     </w:p>
+    <w:p>
+      <w:pPr>
+        <w:rPr>
+          <w:b/>
+          <w:bCs/>
+        </w:rPr>
+      </w:pPr>
+      <w:r>
+        <w:rPr>
+          <w:b/>
+          <w:bCs/>
+        </w:rPr>
+        <w:t>201. Creating Our First Server with Express</w:t>
+      </w:r>
+    </w:p>
+    <w:p>
+      <w:pPr>
+        <w:pStyle w:val="ListParagraph"/>
+        <w:numPr>
+          <w:ilvl w:val="0"/>
+          <w:numId w:val="2"/>
+        </w:numPr>
+      </w:pPr>
+      <w:r>
+        <w:t>Remembering a backend/server:</w:t>
+      </w:r>
+    </w:p>
+    <w:p>
+      <w:pPr>
+        <w:pStyle w:val="ListParagraph"/>
+        <w:numPr>
+          <w:ilvl w:val="1"/>
+          <w:numId w:val="2"/>
+        </w:numPr>
+      </w:pPr>
+      <w:r>
+        <w:t>The server is simply a computer. On 24x7. Always listening for a particular resource.</w:t>
+      </w:r>
+    </w:p>
+    <w:p>
+      <w:pPr>
+        <w:pStyle w:val="ListParagraph"/>
+        <w:numPr>
+          <w:ilvl w:val="1"/>
+          <w:numId w:val="2"/>
+        </w:numPr>
+      </w:pPr>
+      <w:r>
+        <w:t>Contains an application. Application runs on server.</w:t>
+      </w:r>
+    </w:p>
+    <w:p>
+      <w:pPr>
+        <w:pStyle w:val="ListParagraph"/>
+        <w:numPr>
+          <w:ilvl w:val="1"/>
+          <w:numId w:val="2"/>
+        </w:numPr>
+      </w:pPr>
+      <w:r>
+        <w:t>Contains a Database.</w:t>
+      </w:r>
+    </w:p>
+    <w:p>
+      <w:pPr>
+        <w:pStyle w:val="ListParagraph"/>
+        <w:numPr>
+          <w:ilvl w:val="0"/>
+          <w:numId w:val="2"/>
+        </w:numPr>
+      </w:pPr>
+      <w:r>
+        <w:t>Steps to create an express server:</w:t>
+      </w:r>
+    </w:p>
+    <w:p>
+      <w:pPr>
+        <w:pStyle w:val="ListParagraph"/>
+        <w:numPr>
+          <w:ilvl w:val="1"/>
+          <w:numId w:val="2"/>
+        </w:numPr>
+      </w:pPr>
+      <w:r>
+        <w:t>Create directory.</w:t>
+      </w:r>
+    </w:p>
+    <w:p>
+      <w:pPr>
+        <w:pStyle w:val="ListParagraph"/>
+        <w:numPr>
+          <w:ilvl w:val="1"/>
+          <w:numId w:val="2"/>
+        </w:numPr>
+      </w:pPr>
+      <w:r>
+        <w:t>Create index.js file.</w:t>
+      </w:r>
+    </w:p>
+    <w:p>
+      <w:pPr>
+        <w:pStyle w:val="ListParagraph"/>
+        <w:numPr>
+          <w:ilvl w:val="1"/>
+          <w:numId w:val="2"/>
+        </w:numPr>
+      </w:pPr>
+      <w:r>
+        <w:t>Initialise NPM.</w:t>
+      </w:r>
+    </w:p>
+    <w:p>
+      <w:pPr>
+        <w:pStyle w:val="ListParagraph"/>
+        <w:numPr>
+          <w:ilvl w:val="1"/>
+          <w:numId w:val="2"/>
+        </w:numPr>
+      </w:pPr>
+      <w:r>
+        <w:t>Install Express package.</w:t>
+      </w:r>
+    </w:p>
+    <w:p>
+      <w:pPr>
+        <w:pStyle w:val="ListParagraph"/>
+        <w:numPr>
+          <w:ilvl w:val="1"/>
+          <w:numId w:val="2"/>
+        </w:numPr>
+      </w:pPr>
+      <w:r>
+        <w:t>Write server application in index.js.</w:t>
+      </w:r>
+    </w:p>
+    <w:p>
+      <w:pPr>
+        <w:pStyle w:val="ListParagraph"/>
+        <w:numPr>
+          <w:ilvl w:val="1"/>
+          <w:numId w:val="2"/>
+        </w:numPr>
+      </w:pPr>
+      <w:r>
+        <w:t>Start server</w:t>
+      </w:r>
+      <w:r>
+        <w:t>.</w:t>
+      </w:r>
+    </w:p>
+    <w:p>
+      <w:pPr>
+        <w:pStyle w:val="ListParagraph"/>
+        <w:numPr>
+          <w:ilvl w:val="0"/>
+          <w:numId w:val="2"/>
+        </w:numPr>
+      </w:pPr>
+      <w:r>
+        <w:t>What is localhost?</w:t>
+      </w:r>
+    </w:p>
+    <w:p>
+      <w:pPr>
+        <w:pStyle w:val="ListParagraph"/>
+        <w:numPr>
+          <w:ilvl w:val="1"/>
+          <w:numId w:val="2"/>
+        </w:numPr>
+      </w:pPr>
+      <w:r>
+        <w:t>When we don’t have server on the internet, we host locally on our device.</w:t>
+      </w:r>
+    </w:p>
+    <w:p>
+      <w:pPr>
+        <w:pStyle w:val="ListParagraph"/>
+        <w:numPr>
+          <w:ilvl w:val="1"/>
+          <w:numId w:val="2"/>
+        </w:numPr>
+      </w:pPr>
+      <w:proofErr w:type="spellStart"/>
+      <w:r>
+        <w:t>Eg.</w:t>
+      </w:r>
+      <w:proofErr w:type="spellEnd"/>
+      <w:r>
+        <w:t xml:space="preserve"> localhost:3000. Here, 3000 represents a port on the server i.e. our PC.</w:t>
+      </w:r>
+    </w:p>
+    <w:p>
+      <w:pPr>
+        <w:pStyle w:val="ListParagraph"/>
+        <w:numPr>
+          <w:ilvl w:val="1"/>
+          <w:numId w:val="2"/>
+        </w:numPr>
+      </w:pPr>
+      <w:r>
+        <w:t>Use `netstat -</w:t>
+      </w:r>
+      <w:proofErr w:type="spellStart"/>
+      <w:r>
+        <w:t>ano</w:t>
+      </w:r>
+      <w:proofErr w:type="spellEnd"/>
+      <w:r>
+        <w:t xml:space="preserve"> | </w:t>
+      </w:r>
+      <w:proofErr w:type="spellStart"/>
+      <w:r>
+        <w:t>findstr</w:t>
+      </w:r>
+      <w:proofErr w:type="spellEnd"/>
+      <w:r>
+        <w:t xml:space="preserve"> “LISTENING” ` to view active ports.</w:t>
+      </w:r>
+    </w:p>
+    <w:p>
+      <w:r>
+        <w:t>Example usage:</w:t>
+      </w:r>
+    </w:p>
+    <w:p>
+      <w:pPr>
+        <w:shd w:val="clear" w:color="auto" w:fill="1F1F1F"/>
+        <w:spacing w:after="0" w:line="360" w:lineRule="atLeast"/>
+        <w:rPr>
+          <w:rFonts w:ascii="Consolas" w:eastAsia="Times New Roman" w:hAnsi="Consolas" w:cs="Times New Roman"/>
+          <w:color w:val="CCCCCC"/>
+          <w:kern w:val="0"/>
+          <w:sz w:val="27"/>
+          <w:szCs w:val="27"/>
+          <w:lang w:eastAsia="en-IN"/>
+          <w14:ligatures w14:val="none"/>
+        </w:rPr>
+      </w:pPr>
+      <w:r>
+        <w:rPr>
+          <w:rFonts w:ascii="Consolas" w:eastAsia="Times New Roman" w:hAnsi="Consolas" w:cs="Times New Roman"/>
+          <w:color w:val="C586C0"/>
+          <w:kern w:val="0"/>
+          <w:sz w:val="27"/>
+          <w:szCs w:val="27"/>
+          <w:lang w:eastAsia="en-IN"/>
+          <w14:ligatures w14:val="none"/>
+        </w:rPr>
+        <w:t>import</w:t>
+      </w:r>
+      <w:r>
+        <w:rPr>
+          <w:rFonts w:ascii="Consolas" w:eastAsia="Times New Roman" w:hAnsi="Consolas" w:cs="Times New Roman"/>
+          <w:color w:val="CCCCCC"/>
+          <w:kern w:val="0"/>
+          <w:sz w:val="27"/>
+          <w:szCs w:val="27"/>
+          <w:lang w:eastAsia="en-IN"/>
+          <w14:ligatures w14:val="none"/>
+        </w:rPr>
+        <w:t xml:space="preserve"> </w:t>
+      </w:r>
+      <w:r>
+        <w:rPr>
+          <w:rFonts w:ascii="Consolas" w:eastAsia="Times New Roman" w:hAnsi="Consolas" w:cs="Times New Roman"/>
+          <w:color w:val="9CDCFE"/>
+          <w:kern w:val="0"/>
+          <w:sz w:val="27"/>
+          <w:szCs w:val="27"/>
+          <w:lang w:eastAsia="en-IN"/>
+          <w14:ligatures w14:val="none"/>
+        </w:rPr>
+        <w:t>express</w:t>
+      </w:r>
+      <w:r>
+        <w:rPr>
+          <w:rFonts w:ascii="Consolas" w:eastAsia="Times New Roman" w:hAnsi="Consolas" w:cs="Times New Roman"/>
+          <w:color w:val="CCCCCC"/>
+          <w:kern w:val="0"/>
+          <w:sz w:val="27"/>
+          <w:szCs w:val="27"/>
+          <w:lang w:eastAsia="en-IN"/>
+          <w14:ligatures w14:val="none"/>
+        </w:rPr>
+        <w:t xml:space="preserve"> </w:t>
+      </w:r>
+      <w:r>
+        <w:rPr>
+          <w:rFonts w:ascii="Consolas" w:eastAsia="Times New Roman" w:hAnsi="Consolas" w:cs="Times New Roman"/>
+          <w:color w:val="C586C0"/>
+          <w:kern w:val="0"/>
+          <w:sz w:val="27"/>
+          <w:szCs w:val="27"/>
+          <w:lang w:eastAsia="en-IN"/>
+          <w14:ligatures w14:val="none"/>
+        </w:rPr>
+        <w:t>from</w:t>
+      </w:r>
+      <w:r>
+        <w:rPr>
+          <w:rFonts w:ascii="Consolas" w:eastAsia="Times New Roman" w:hAnsi="Consolas" w:cs="Times New Roman"/>
+          <w:color w:val="CCCCCC"/>
+          <w:kern w:val="0"/>
+          <w:sz w:val="27"/>
+          <w:szCs w:val="27"/>
+          <w:lang w:eastAsia="en-IN"/>
+          <w14:ligatures w14:val="none"/>
+        </w:rPr>
+        <w:t xml:space="preserve"> </w:t>
+      </w:r>
+      <w:r>
+        <w:rPr>
+          <w:rFonts w:ascii="Consolas" w:eastAsia="Times New Roman" w:hAnsi="Consolas" w:cs="Times New Roman"/>
+          <w:color w:val="CE9178"/>
+          <w:kern w:val="0"/>
+          <w:sz w:val="27"/>
+          <w:szCs w:val="27"/>
+          <w:lang w:eastAsia="en-IN"/>
+          <w14:ligatures w14:val="none"/>
+        </w:rPr>
+        <w:t>"express"</w:t>
+      </w:r>
+      <w:r>
+        <w:rPr>
+          <w:rFonts w:ascii="Consolas" w:eastAsia="Times New Roman" w:hAnsi="Consolas" w:cs="Times New Roman"/>
+          <w:color w:val="CCCCCC"/>
+          <w:kern w:val="0"/>
+          <w:sz w:val="27"/>
+          <w:szCs w:val="27"/>
+          <w:lang w:eastAsia="en-IN"/>
+          <w14:ligatures w14:val="none"/>
+        </w:rPr>
+        <w:t>;</w:t>
+      </w:r>
+    </w:p>
+    <w:p>
+      <w:pPr>
+        <w:shd w:val="clear" w:color="auto" w:fill="1F1F1F"/>
+        <w:spacing w:after="0" w:line="360" w:lineRule="atLeast"/>
+        <w:rPr>
+          <w:rFonts w:ascii="Consolas" w:eastAsia="Times New Roman" w:hAnsi="Consolas" w:cs="Times New Roman"/>
+          <w:color w:val="CCCCCC"/>
+          <w:kern w:val="0"/>
+          <w:sz w:val="27"/>
+          <w:szCs w:val="27"/>
+          <w:lang w:eastAsia="en-IN"/>
+          <w14:ligatures w14:val="none"/>
+        </w:rPr>
+      </w:pPr>
+      <w:proofErr w:type="spellStart"/>
+      <w:r>
+        <w:rPr>
+          <w:rFonts w:ascii="Consolas" w:eastAsia="Times New Roman" w:hAnsi="Consolas" w:cs="Times New Roman"/>
+          <w:color w:val="569CD6"/>
+          <w:kern w:val="0"/>
+          <w:sz w:val="27"/>
+          <w:szCs w:val="27"/>
+          <w:lang w:eastAsia="en-IN"/>
+          <w14:ligatures w14:val="none"/>
+        </w:rPr>
+        <w:t>const</w:t>
+      </w:r>
+      <w:proofErr w:type="spellEnd"/>
+      <w:r>
+        <w:rPr>
+          <w:rFonts w:ascii="Consolas" w:eastAsia="Times New Roman" w:hAnsi="Consolas" w:cs="Times New Roman"/>
+          <w:color w:val="CCCCCC"/>
+          <w:kern w:val="0"/>
+          <w:sz w:val="27"/>
+          <w:szCs w:val="27"/>
+          <w:lang w:eastAsia="en-IN"/>
+          <w14:ligatures w14:val="none"/>
+        </w:rPr>
+        <w:t xml:space="preserve"> </w:t>
+      </w:r>
+      <w:r>
+        <w:rPr>
+          <w:rFonts w:ascii="Consolas" w:eastAsia="Times New Roman" w:hAnsi="Consolas" w:cs="Times New Roman"/>
+          <w:color w:val="4FC1FF"/>
+          <w:kern w:val="0"/>
+          <w:sz w:val="27"/>
+          <w:szCs w:val="27"/>
+          <w:lang w:eastAsia="en-IN"/>
+          <w14:ligatures w14:val="none"/>
+        </w:rPr>
+        <w:t>APP</w:t>
+      </w:r>
+      <w:r>
+        <w:rPr>
+          <w:rFonts w:ascii="Consolas" w:eastAsia="Times New Roman" w:hAnsi="Consolas" w:cs="Times New Roman"/>
+          <w:color w:val="CCCCCC"/>
+          <w:kern w:val="0"/>
+          <w:sz w:val="27"/>
+          <w:szCs w:val="27"/>
+          <w:lang w:eastAsia="en-IN"/>
+          <w14:ligatures w14:val="none"/>
+        </w:rPr>
+        <w:t xml:space="preserve"> </w:t>
+      </w:r>
+      <w:r>
+        <w:rPr>
+          <w:rFonts w:ascii="Consolas" w:eastAsia="Times New Roman" w:hAnsi="Consolas" w:cs="Times New Roman"/>
+          <w:color w:val="D4D4D4"/>
+          <w:kern w:val="0"/>
+          <w:sz w:val="27"/>
+          <w:szCs w:val="27"/>
+          <w:lang w:eastAsia="en-IN"/>
+          <w14:ligatures w14:val="none"/>
+        </w:rPr>
+        <w:t>=</w:t>
+      </w:r>
+      <w:r>
+        <w:rPr>
+          <w:rFonts w:ascii="Consolas" w:eastAsia="Times New Roman" w:hAnsi="Consolas" w:cs="Times New Roman"/>
+          <w:color w:val="CCCCCC"/>
+          <w:kern w:val="0"/>
+          <w:sz w:val="27"/>
+          <w:szCs w:val="27"/>
+          <w:lang w:eastAsia="en-IN"/>
+          <w14:ligatures w14:val="none"/>
+        </w:rPr>
+        <w:t xml:space="preserve"> </w:t>
+      </w:r>
+      <w:r>
+        <w:rPr>
+          <w:rFonts w:ascii="Consolas" w:eastAsia="Times New Roman" w:hAnsi="Consolas" w:cs="Times New Roman"/>
+          <w:color w:val="DCDCAA"/>
+          <w:kern w:val="0"/>
+          <w:sz w:val="27"/>
+          <w:szCs w:val="27"/>
+          <w:lang w:eastAsia="en-IN"/>
+          <w14:ligatures w14:val="none"/>
+        </w:rPr>
+        <w:t>express</w:t>
+      </w:r>
+      <w:r>
+        <w:rPr>
+          <w:rFonts w:ascii="Consolas" w:eastAsia="Times New Roman" w:hAnsi="Consolas" w:cs="Times New Roman"/>
+          <w:color w:val="CCCCCC"/>
+          <w:kern w:val="0"/>
+          <w:sz w:val="27"/>
+          <w:szCs w:val="27"/>
+          <w:lang w:eastAsia="en-IN"/>
+          <w14:ligatures w14:val="none"/>
+        </w:rPr>
+        <w:t>();</w:t>
+      </w:r>
+    </w:p>
+    <w:p>
+      <w:pPr>
+        <w:shd w:val="clear" w:color="auto" w:fill="1F1F1F"/>
+        <w:spacing w:after="0" w:line="360" w:lineRule="atLeast"/>
+        <w:rPr>
+          <w:rFonts w:ascii="Consolas" w:eastAsia="Times New Roman" w:hAnsi="Consolas" w:cs="Times New Roman"/>
+          <w:color w:val="CCCCCC"/>
+          <w:kern w:val="0"/>
+          <w:sz w:val="27"/>
+          <w:szCs w:val="27"/>
+          <w:lang w:eastAsia="en-IN"/>
+          <w14:ligatures w14:val="none"/>
+        </w:rPr>
+      </w:pPr>
+      <w:proofErr w:type="spellStart"/>
+      <w:r>
+        <w:rPr>
+          <w:rFonts w:ascii="Consolas" w:eastAsia="Times New Roman" w:hAnsi="Consolas" w:cs="Times New Roman"/>
+          <w:color w:val="569CD6"/>
+          <w:kern w:val="0"/>
+          <w:sz w:val="27"/>
+          <w:szCs w:val="27"/>
+          <w:lang w:eastAsia="en-IN"/>
+          <w14:ligatures w14:val="none"/>
+        </w:rPr>
+        <w:t>const</w:t>
+      </w:r>
+      <w:proofErr w:type="spellEnd"/>
+      <w:r>
+        <w:rPr>
+          <w:rFonts w:ascii="Consolas" w:eastAsia="Times New Roman" w:hAnsi="Consolas" w:cs="Times New Roman"/>
+          <w:color w:val="CCCCCC"/>
+          <w:kern w:val="0"/>
+          <w:sz w:val="27"/>
+          <w:szCs w:val="27"/>
+          <w:lang w:eastAsia="en-IN"/>
+          <w14:ligatures w14:val="none"/>
+        </w:rPr>
+        <w:t xml:space="preserve"> </w:t>
+      </w:r>
+      <w:r>
+        <w:rPr>
+          <w:rFonts w:ascii="Consolas" w:eastAsia="Times New Roman" w:hAnsi="Consolas" w:cs="Times New Roman"/>
+          <w:color w:val="4FC1FF"/>
+          <w:kern w:val="0"/>
+          <w:sz w:val="27"/>
+          <w:szCs w:val="27"/>
+          <w:lang w:eastAsia="en-IN"/>
+          <w14:ligatures w14:val="none"/>
+        </w:rPr>
+        <w:t>PORT</w:t>
+      </w:r>
+      <w:r>
+        <w:rPr>
+          <w:rFonts w:ascii="Consolas" w:eastAsia="Times New Roman" w:hAnsi="Consolas" w:cs="Times New Roman"/>
+          <w:color w:val="CCCCCC"/>
+          <w:kern w:val="0"/>
+          <w:sz w:val="27"/>
+          <w:szCs w:val="27"/>
+          <w:lang w:eastAsia="en-IN"/>
+          <w14:ligatures w14:val="none"/>
+        </w:rPr>
+        <w:t xml:space="preserve"> </w:t>
+      </w:r>
+      <w:r>
+        <w:rPr>
+          <w:rFonts w:ascii="Consolas" w:eastAsia="Times New Roman" w:hAnsi="Consolas" w:cs="Times New Roman"/>
+          <w:color w:val="D4D4D4"/>
+          <w:kern w:val="0"/>
+          <w:sz w:val="27"/>
+          <w:szCs w:val="27"/>
+          <w:lang w:eastAsia="en-IN"/>
+          <w14:ligatures w14:val="none"/>
+        </w:rPr>
+        <w:t>=</w:t>
+      </w:r>
+      <w:r>
+        <w:rPr>
+          <w:rFonts w:ascii="Consolas" w:eastAsia="Times New Roman" w:hAnsi="Consolas" w:cs="Times New Roman"/>
+          <w:color w:val="CCCCCC"/>
+          <w:kern w:val="0"/>
+          <w:sz w:val="27"/>
+          <w:szCs w:val="27"/>
+          <w:lang w:eastAsia="en-IN"/>
+          <w14:ligatures w14:val="none"/>
+        </w:rPr>
+        <w:t xml:space="preserve"> </w:t>
+      </w:r>
+      <w:r>
+        <w:rPr>
+          <w:rFonts w:ascii="Consolas" w:eastAsia="Times New Roman" w:hAnsi="Consolas" w:cs="Times New Roman"/>
+          <w:color w:val="B5CEA8"/>
+          <w:kern w:val="0"/>
+          <w:sz w:val="27"/>
+          <w:szCs w:val="27"/>
+          <w:lang w:eastAsia="en-IN"/>
+          <w14:ligatures w14:val="none"/>
+        </w:rPr>
+        <w:t>3000</w:t>
+      </w:r>
+      <w:r>
+        <w:rPr>
+          <w:rFonts w:ascii="Consolas" w:eastAsia="Times New Roman" w:hAnsi="Consolas" w:cs="Times New Roman"/>
+          <w:color w:val="CCCCCC"/>
+          <w:kern w:val="0"/>
+          <w:sz w:val="27"/>
+          <w:szCs w:val="27"/>
+          <w:lang w:eastAsia="en-IN"/>
+          <w14:ligatures w14:val="none"/>
+        </w:rPr>
+        <w:t>;</w:t>
+      </w:r>
+    </w:p>
+    <w:p>
+      <w:pPr>
+        <w:shd w:val="clear" w:color="auto" w:fill="1F1F1F"/>
+        <w:spacing w:after="0" w:line="360" w:lineRule="atLeast"/>
+        <w:rPr>
+          <w:rFonts w:ascii="Consolas" w:eastAsia="Times New Roman" w:hAnsi="Consolas" w:cs="Times New Roman"/>
+          <w:color w:val="CCCCCC"/>
+          <w:kern w:val="0"/>
+          <w:sz w:val="27"/>
+          <w:szCs w:val="27"/>
+          <w:lang w:eastAsia="en-IN"/>
+          <w14:ligatures w14:val="none"/>
+        </w:rPr>
+      </w:pPr>
+    </w:p>
+    <w:p>
+      <w:pPr>
+        <w:shd w:val="clear" w:color="auto" w:fill="1F1F1F"/>
+        <w:spacing w:after="0" w:line="360" w:lineRule="atLeast"/>
+        <w:rPr>
+          <w:rFonts w:ascii="Consolas" w:eastAsia="Times New Roman" w:hAnsi="Consolas" w:cs="Times New Roman"/>
+          <w:color w:val="CCCCCC"/>
+          <w:kern w:val="0"/>
+          <w:sz w:val="27"/>
+          <w:szCs w:val="27"/>
+          <w:lang w:eastAsia="en-IN"/>
+          <w14:ligatures w14:val="none"/>
+        </w:rPr>
+      </w:pPr>
+      <w:proofErr w:type="spellStart"/>
+      <w:r>
+        <w:rPr>
+          <w:rFonts w:ascii="Consolas" w:eastAsia="Times New Roman" w:hAnsi="Consolas" w:cs="Times New Roman"/>
+          <w:color w:val="4FC1FF"/>
+          <w:kern w:val="0"/>
+          <w:sz w:val="27"/>
+          <w:szCs w:val="27"/>
+          <w:lang w:eastAsia="en-IN"/>
+          <w14:ligatures w14:val="none"/>
+        </w:rPr>
+        <w:t>APP</w:t>
+      </w:r>
+      <w:r>
+        <w:rPr>
+          <w:rFonts w:ascii="Consolas" w:eastAsia="Times New Roman" w:hAnsi="Consolas" w:cs="Times New Roman"/>
+          <w:color w:val="CCCCCC"/>
+          <w:kern w:val="0"/>
+          <w:sz w:val="27"/>
+          <w:szCs w:val="27"/>
+          <w:lang w:eastAsia="en-IN"/>
+          <w14:ligatures w14:val="none"/>
+        </w:rPr>
+        <w:t>.</w:t>
+      </w:r>
+      <w:r>
+        <w:rPr>
+          <w:rFonts w:ascii="Consolas" w:eastAsia="Times New Roman" w:hAnsi="Consolas" w:cs="Times New Roman"/>
+          <w:color w:val="DCDCAA"/>
+          <w:kern w:val="0"/>
+          <w:sz w:val="27"/>
+          <w:szCs w:val="27"/>
+          <w:lang w:eastAsia="en-IN"/>
+          <w14:ligatures w14:val="none"/>
+        </w:rPr>
+        <w:t>listen</w:t>
+      </w:r>
+      <w:proofErr w:type="spellEnd"/>
+      <w:r>
+        <w:rPr>
+          <w:rFonts w:ascii="Consolas" w:eastAsia="Times New Roman" w:hAnsi="Consolas" w:cs="Times New Roman"/>
+          <w:color w:val="CCCCCC"/>
+          <w:kern w:val="0"/>
+          <w:sz w:val="27"/>
+          <w:szCs w:val="27"/>
+          <w:lang w:eastAsia="en-IN"/>
+          <w14:ligatures w14:val="none"/>
+        </w:rPr>
+        <w:t>(</w:t>
+      </w:r>
+      <w:r>
+        <w:rPr>
+          <w:rFonts w:ascii="Consolas" w:eastAsia="Times New Roman" w:hAnsi="Consolas" w:cs="Times New Roman"/>
+          <w:color w:val="4FC1FF"/>
+          <w:kern w:val="0"/>
+          <w:sz w:val="27"/>
+          <w:szCs w:val="27"/>
+          <w:lang w:eastAsia="en-IN"/>
+          <w14:ligatures w14:val="none"/>
+        </w:rPr>
+        <w:t>PORT</w:t>
+      </w:r>
+      <w:r>
+        <w:rPr>
+          <w:rFonts w:ascii="Consolas" w:eastAsia="Times New Roman" w:hAnsi="Consolas" w:cs="Times New Roman"/>
+          <w:color w:val="CCCCCC"/>
+          <w:kern w:val="0"/>
+          <w:sz w:val="27"/>
+          <w:szCs w:val="27"/>
+          <w:lang w:eastAsia="en-IN"/>
+          <w14:ligatures w14:val="none"/>
+        </w:rPr>
+        <w:t xml:space="preserve">, () </w:t>
+      </w:r>
+      <w:r>
+        <w:rPr>
+          <w:rFonts w:ascii="Consolas" w:eastAsia="Times New Roman" w:hAnsi="Consolas" w:cs="Times New Roman"/>
+          <w:color w:val="569CD6"/>
+          <w:kern w:val="0"/>
+          <w:sz w:val="27"/>
+          <w:szCs w:val="27"/>
+          <w:lang w:eastAsia="en-IN"/>
+          <w14:ligatures w14:val="none"/>
+        </w:rPr>
+        <w:t>=&gt;</w:t>
+      </w:r>
+      <w:r>
+        <w:rPr>
+          <w:rFonts w:ascii="Consolas" w:eastAsia="Times New Roman" w:hAnsi="Consolas" w:cs="Times New Roman"/>
+          <w:color w:val="CCCCCC"/>
+          <w:kern w:val="0"/>
+          <w:sz w:val="27"/>
+          <w:szCs w:val="27"/>
+          <w:lang w:eastAsia="en-IN"/>
+          <w14:ligatures w14:val="none"/>
+        </w:rPr>
+        <w:t xml:space="preserve"> {</w:t>
+      </w:r>
+    </w:p>
+    <w:p>
+      <w:pPr>
+        <w:shd w:val="clear" w:color="auto" w:fill="1F1F1F"/>
+        <w:spacing w:after="0" w:line="360" w:lineRule="atLeast"/>
+        <w:rPr>
+          <w:rFonts w:ascii="Consolas" w:eastAsia="Times New Roman" w:hAnsi="Consolas" w:cs="Times New Roman"/>
+          <w:color w:val="CCCCCC"/>
+          <w:kern w:val="0"/>
+          <w:sz w:val="27"/>
+          <w:szCs w:val="27"/>
+          <w:lang w:eastAsia="en-IN"/>
+          <w14:ligatures w14:val="none"/>
+        </w:rPr>
+      </w:pPr>
+      <w:r>
+        <w:rPr>
+          <w:rFonts w:ascii="Consolas" w:eastAsia="Times New Roman" w:hAnsi="Consolas" w:cs="Times New Roman"/>
+          <w:color w:val="CCCCCC"/>
+          <w:kern w:val="0"/>
+          <w:sz w:val="27"/>
+          <w:szCs w:val="27"/>
+          <w:lang w:eastAsia="en-IN"/>
+          <w14:ligatures w14:val="none"/>
+        </w:rPr>
+        <w:t xml:space="preserve">    </w:t>
+      </w:r>
+      <w:r>
+        <w:rPr>
+          <w:rFonts w:ascii="Consolas" w:eastAsia="Times New Roman" w:hAnsi="Consolas" w:cs="Times New Roman"/>
+          <w:color w:val="9CDCFE"/>
+          <w:kern w:val="0"/>
+          <w:sz w:val="27"/>
+          <w:szCs w:val="27"/>
+          <w:lang w:eastAsia="en-IN"/>
+          <w14:ligatures w14:val="none"/>
+        </w:rPr>
+        <w:t>console</w:t>
+      </w:r>
+      <w:r>
+        <w:rPr>
+          <w:rFonts w:ascii="Consolas" w:eastAsia="Times New Roman" w:hAnsi="Consolas" w:cs="Times New Roman"/>
+          <w:color w:val="CCCCCC"/>
+          <w:kern w:val="0"/>
+          <w:sz w:val="27"/>
+          <w:szCs w:val="27"/>
+          <w:lang w:eastAsia="en-IN"/>
+          <w14:ligatures w14:val="none"/>
+        </w:rPr>
+        <w:t>.</w:t>
+      </w:r>
+      <w:r>
+        <w:rPr>
+          <w:rFonts w:ascii="Consolas" w:eastAsia="Times New Roman" w:hAnsi="Consolas" w:cs="Times New Roman"/>
+          <w:color w:val="DCDCAA"/>
+          <w:kern w:val="0"/>
+          <w:sz w:val="27"/>
+          <w:szCs w:val="27"/>
+          <w:lang w:eastAsia="en-IN"/>
+          <w14:ligatures w14:val="none"/>
+        </w:rPr>
+        <w:t>log</w:t>
+      </w:r>
+      <w:r>
+        <w:rPr>
+          <w:rFonts w:ascii="Consolas" w:eastAsia="Times New Roman" w:hAnsi="Consolas" w:cs="Times New Roman"/>
+          <w:color w:val="CCCCCC"/>
+          <w:kern w:val="0"/>
+          <w:sz w:val="27"/>
+          <w:szCs w:val="27"/>
+          <w:lang w:eastAsia="en-IN"/>
+          <w14:ligatures w14:val="none"/>
+        </w:rPr>
+        <w:t>(</w:t>
+      </w:r>
+      <w:r>
+        <w:rPr>
+          <w:rFonts w:ascii="Consolas" w:eastAsia="Times New Roman" w:hAnsi="Consolas" w:cs="Times New Roman"/>
+          <w:color w:val="CE9178"/>
+          <w:kern w:val="0"/>
+          <w:sz w:val="27"/>
+          <w:szCs w:val="27"/>
+          <w:lang w:eastAsia="en-IN"/>
+          <w14:ligatures w14:val="none"/>
+        </w:rPr>
+        <w:t xml:space="preserve">`Server running on port </w:t>
+      </w:r>
+      <w:r>
+        <w:rPr>
+          <w:rFonts w:ascii="Consolas" w:eastAsia="Times New Roman" w:hAnsi="Consolas" w:cs="Times New Roman"/>
+          <w:color w:val="569CD6"/>
+          <w:kern w:val="0"/>
+          <w:sz w:val="27"/>
+          <w:szCs w:val="27"/>
+          <w:lang w:eastAsia="en-IN"/>
+          <w14:ligatures w14:val="none"/>
+        </w:rPr>
+        <w:t>${</w:t>
+      </w:r>
+      <w:r>
+        <w:rPr>
+          <w:rFonts w:ascii="Consolas" w:eastAsia="Times New Roman" w:hAnsi="Consolas" w:cs="Times New Roman"/>
+          <w:color w:val="4FC1FF"/>
+          <w:kern w:val="0"/>
+          <w:sz w:val="27"/>
+          <w:szCs w:val="27"/>
+          <w:lang w:eastAsia="en-IN"/>
+          <w14:ligatures w14:val="none"/>
+        </w:rPr>
+        <w:t>PORT</w:t>
+      </w:r>
+      <w:r>
+        <w:rPr>
+          <w:rFonts w:ascii="Consolas" w:eastAsia="Times New Roman" w:hAnsi="Consolas" w:cs="Times New Roman"/>
+          <w:color w:val="569CD6"/>
+          <w:kern w:val="0"/>
+          <w:sz w:val="27"/>
+          <w:szCs w:val="27"/>
+          <w:lang w:eastAsia="en-IN"/>
+          <w14:ligatures w14:val="none"/>
+        </w:rPr>
+        <w:t>}</w:t>
+      </w:r>
+      <w:r>
+        <w:rPr>
+          <w:rFonts w:ascii="Consolas" w:eastAsia="Times New Roman" w:hAnsi="Consolas" w:cs="Times New Roman"/>
+          <w:color w:val="CE9178"/>
+          <w:kern w:val="0"/>
+          <w:sz w:val="27"/>
+          <w:szCs w:val="27"/>
+          <w:lang w:eastAsia="en-IN"/>
+          <w14:ligatures w14:val="none"/>
+        </w:rPr>
+        <w:t>`</w:t>
+      </w:r>
+      <w:r>
+        <w:rPr>
+          <w:rFonts w:ascii="Consolas" w:eastAsia="Times New Roman" w:hAnsi="Consolas" w:cs="Times New Roman"/>
+          <w:color w:val="CCCCCC"/>
+          <w:kern w:val="0"/>
+          <w:sz w:val="27"/>
+          <w:szCs w:val="27"/>
+          <w:lang w:eastAsia="en-IN"/>
+          <w14:ligatures w14:val="none"/>
+        </w:rPr>
+        <w:t>);</w:t>
+      </w:r>
+    </w:p>
+    <w:p>
+      <w:pPr>
+        <w:shd w:val="clear" w:color="auto" w:fill="1F1F1F"/>
+        <w:spacing w:after="0" w:line="360" w:lineRule="atLeast"/>
+        <w:rPr>
+          <w:rFonts w:ascii="Consolas" w:eastAsia="Times New Roman" w:hAnsi="Consolas" w:cs="Times New Roman"/>
+          <w:color w:val="CCCCCC"/>
+          <w:kern w:val="0"/>
+          <w:sz w:val="27"/>
+          <w:szCs w:val="27"/>
+          <w:lang w:eastAsia="en-IN"/>
+          <w14:ligatures w14:val="none"/>
+        </w:rPr>
+      </w:pPr>
+      <w:r>
+        <w:rPr>
+          <w:rFonts w:ascii="Consolas" w:eastAsia="Times New Roman" w:hAnsi="Consolas" w:cs="Times New Roman"/>
+          <w:color w:val="CCCCCC"/>
+          <w:kern w:val="0"/>
+          <w:sz w:val="27"/>
+          <w:szCs w:val="27"/>
+          <w:lang w:eastAsia="en-IN"/>
+          <w14:ligatures w14:val="none"/>
+        </w:rPr>
+        <w:t>});</w:t>
+      </w:r>
+    </w:p>
+    <w:p/>
+    <w:p/>
     <w:sectPr>
       <w:pgSz w:w="11906" w:h="16838"/>
       <w:pgMar w:top="1440" w:right="1440" w:bottom="1440" w:left="1440" w:header="708" w:footer="708" w:gutter="0"/>
@@ -56,6 +942,56 @@
     </w:sectPr>
   </w:body>
 </w:document>
+</file>
+
+<file path=word/endnotes.xml><?xml version="1.0" encoding="utf-8"?>
+<w:endnotes xmlns:wpc="http://schemas.microsoft.com/office/word/2010/wordprocessingCanvas" xmlns:cx="http://schemas.microsoft.com/office/drawing/2014/chartex" xmlns:cx1="http://schemas.microsoft.com/office/drawing/2015/9/8/chartex" xmlns:cx2="http://schemas.microsoft.com/office/drawing/2015/10/21/chartex" xmlns:cx3="http://schemas.microsoft.com/office/drawing/2016/5/9/chartex" xmlns:cx4="http://schemas.microsoft.com/office/drawing/2016/5/10/chartex" xmlns:cx5="http://schemas.microsoft.com/office/drawing/2016/5/11/chartex" xmlns:cx6="http://schemas.microsoft.com/office/drawing/2016/5/12/chartex" xmlns:cx7="http://schemas.microsoft.com/office/drawing/2016/5/13/chartex" xmlns:cx8="http://schemas.microsoft.com/office/drawing/2016/5/14/chartex" xmlns:mc="http://schemas.openxmlformats.org/markup-compatibility/2006" xmlns:aink="http://schemas.microsoft.com/office/drawing/2016/ink" xmlns:am3d="http://schemas.microsoft.com/office/drawing/2017/model3d" xmlns:o="urn:schemas-microsoft-com:office:office" xmlns:oel="http://schemas.microsoft.com/office/2019/extlst" xmlns:r="http://schemas.openxmlformats.org/officeDocument/2006/relationships" xmlns:m="http://schemas.openxmlformats.org/officeDocument/2006/math" xmlns:v="urn:schemas-microsoft-com:vml" xmlns:wp14="http://schemas.microsoft.com/office/word/2010/wordprocessingDrawing" xmlns:wp="http://schemas.openxmlformats.org/drawingml/2006/wordprocessingDrawing" xmlns:w10="urn:schemas-microsoft-com:office:word" xmlns:w="http://schemas.openxmlformats.org/wordprocessingml/2006/main" xmlns:w14="http://schemas.microsoft.com/office/word/2010/wordml" xmlns:w15="http://schemas.microsoft.com/office/word/2012/wordml" xmlns:w16cex="http://schemas.microsoft.com/office/word/2018/wordml/cex" xmlns:w16cid="http://schemas.microsoft.com/office/word/2016/wordml/cid" xmlns:w16="http://schemas.microsoft.com/office/word/2018/wordml" xmlns:w16du="http://schemas.microsoft.com/office/word/2023/wordml/word16du" xmlns:w16sdtdh="http://schemas.microsoft.com/office/word/2020/wordml/sdtdatahash" xmlns:w16se="http://schemas.microsoft.com/office/word/2015/wordml/symex" xmlns:wpg="http://schemas.microsoft.com/office/word/2010/wordprocessingGroup" xmlns:wpi="http://schemas.microsoft.com/office/word/2010/wordprocessingInk" xmlns:wne="http://schemas.microsoft.com/office/word/2006/wordml" xmlns:wps="http://schemas.microsoft.com/office/word/2010/wordprocessingShape" mc:Ignorable="w14 w15 w16se w16cid w16 w16cex w16sdtdh w16du wp14">
+  <w:endnote w:type="separator" w:id="-1">
+    <w:p>
+      <w:pPr>
+        <w:spacing w:after="0" w:line="240" w:lineRule="auto"/>
+      </w:pPr>
+      <w:r>
+        <w:separator/>
+      </w:r>
+    </w:p>
+  </w:endnote>
+  <w:endnote w:type="continuationSeparator" w:id="0">
+    <w:p>
+      <w:pPr>
+        <w:spacing w:after="0" w:line="240" w:lineRule="auto"/>
+      </w:pPr>
+      <w:r>
+        <w:continuationSeparator/>
+      </w:r>
+    </w:p>
+  </w:endnote>
+</w:endnotes>
+</file>
+
+<file path=word/footnotes.xml><?xml version="1.0" encoding="utf-8"?>
+<w:footnotes xmlns:wpc="http://schemas.microsoft.com/office/word/2010/wordprocessingCanvas" xmlns:cx="http://schemas.microsoft.com/office/drawing/2014/chartex" xmlns:cx1="http://schemas.microsoft.com/office/drawing/2015/9/8/chartex" xmlns:cx2="http://schemas.microsoft.com/office/drawing/2015/10/21/chartex" xmlns:cx3="http://schemas.microsoft.com/office/drawing/2016/5/9/chartex" xmlns:cx4="http://schemas.microsoft.com/office/drawing/2016/5/10/chartex" xmlns:cx5="http://schemas.microsoft.com/office/drawing/2016/5/11/chartex" xmlns:cx6="http://schemas.microsoft.com/office/drawing/2016/5/12/chartex" xmlns:cx7="http://schemas.microsoft.com/office/drawing/2016/5/13/chartex" xmlns:cx8="http://schemas.microsoft.com/office/drawing/2016/5/14/chartex" xmlns:mc="http://schemas.openxmlformats.org/markup-compatibility/2006" xmlns:aink="http://schemas.microsoft.com/office/drawing/2016/ink" xmlns:am3d="http://schemas.microsoft.com/office/drawing/2017/model3d" xmlns:o="urn:schemas-microsoft-com:office:office" xmlns:oel="http://schemas.microsoft.com/office/2019/extlst" xmlns:r="http://schemas.openxmlformats.org/officeDocument/2006/relationships" xmlns:m="http://schemas.openxmlformats.org/officeDocument/2006/math" xmlns:v="urn:schemas-microsoft-com:vml" xmlns:wp14="http://schemas.microsoft.com/office/word/2010/wordprocessingDrawing" xmlns:wp="http://schemas.openxmlformats.org/drawingml/2006/wordprocessingDrawing" xmlns:w10="urn:schemas-microsoft-com:office:word" xmlns:w="http://schemas.openxmlformats.org/wordprocessingml/2006/main" xmlns:w14="http://schemas.microsoft.com/office/word/2010/wordml" xmlns:w15="http://schemas.microsoft.com/office/word/2012/wordml" xmlns:w16cex="http://schemas.microsoft.com/office/word/2018/wordml/cex" xmlns:w16cid="http://schemas.microsoft.com/office/word/2016/wordml/cid" xmlns:w16="http://schemas.microsoft.com/office/word/2018/wordml" xmlns:w16du="http://schemas.microsoft.com/office/word/2023/wordml/word16du" xmlns:w16sdtdh="http://schemas.microsoft.com/office/word/2020/wordml/sdtdatahash" xmlns:w16se="http://schemas.microsoft.com/office/word/2015/wordml/symex" xmlns:wpg="http://schemas.microsoft.com/office/word/2010/wordprocessingGroup" xmlns:wpi="http://schemas.microsoft.com/office/word/2010/wordprocessingInk" xmlns:wne="http://schemas.microsoft.com/office/word/2006/wordml" xmlns:wps="http://schemas.microsoft.com/office/word/2010/wordprocessingShape" mc:Ignorable="w14 w15 w16se w16cid w16 w16cex w16sdtdh w16du wp14">
+  <w:footnote w:type="separator" w:id="-1">
+    <w:p>
+      <w:pPr>
+        <w:spacing w:after="0" w:line="240" w:lineRule="auto"/>
+      </w:pPr>
+      <w:r>
+        <w:separator/>
+      </w:r>
+    </w:p>
+  </w:footnote>
+  <w:footnote w:type="continuationSeparator" w:id="0">
+    <w:p>
+      <w:pPr>
+        <w:spacing w:after="0" w:line="240" w:lineRule="auto"/>
+      </w:pPr>
+      <w:r>
+        <w:continuationSeparator/>
+      </w:r>
+    </w:p>
+  </w:footnote>
+</w:footnotes>
 </file>
 
 <file path=word/numbering.xml><?xml version="1.0" encoding="utf-8"?>
@@ -88,7 +1024,7 @@
         <w:rFonts w:ascii="Courier New" w:hAnsi="Courier New" w:cs="Courier New" w:hint="default"/>
       </w:rPr>
     </w:lvl>
-    <w:lvl w:ilvl="2" w:tplc="40090005" w:tentative="1">
+    <w:lvl w:ilvl="2" w:tplc="40090005">
       <w:start w:val="1"/>
       <w:numFmt w:val="bullet"/>
       <w:lvlText w:val=""/>
@@ -733,6 +1669,50 @@
       <w:contextualSpacing/>
     </w:pPr>
   </w:style>
+  <w:style w:type="paragraph" w:styleId="Header">
+    <w:name w:val="header"/>
+    <w:basedOn w:val="Normal"/>
+    <w:link w:val="HeaderChar"/>
+    <w:uiPriority w:val="99"/>
+    <w:unhideWhenUsed/>
+    <w:rsid w:val="00326128"/>
+    <w:pPr>
+      <w:tabs>
+        <w:tab w:val="center" w:pos="4513"/>
+        <w:tab w:val="right" w:pos="9026"/>
+      </w:tabs>
+      <w:spacing w:after="0" w:line="240" w:lineRule="auto"/>
+    </w:pPr>
+  </w:style>
+  <w:style w:type="character" w:customStyle="1" w:styleId="HeaderChar">
+    <w:name w:val="Header Char"/>
+    <w:basedOn w:val="DefaultParagraphFont"/>
+    <w:link w:val="Header"/>
+    <w:uiPriority w:val="99"/>
+    <w:rsid w:val="00326128"/>
+  </w:style>
+  <w:style w:type="paragraph" w:styleId="Footer">
+    <w:name w:val="footer"/>
+    <w:basedOn w:val="Normal"/>
+    <w:link w:val="FooterChar"/>
+    <w:uiPriority w:val="99"/>
+    <w:unhideWhenUsed/>
+    <w:rsid w:val="00326128"/>
+    <w:pPr>
+      <w:tabs>
+        <w:tab w:val="center" w:pos="4513"/>
+        <w:tab w:val="right" w:pos="9026"/>
+      </w:tabs>
+      <w:spacing w:after="0" w:line="240" w:lineRule="auto"/>
+    </w:pPr>
+  </w:style>
+  <w:style w:type="character" w:customStyle="1" w:styleId="FooterChar">
+    <w:name w:val="Footer Char"/>
+    <w:basedOn w:val="DefaultParagraphFont"/>
+    <w:link w:val="Footer"/>
+    <w:uiPriority w:val="99"/>
+    <w:rsid w:val="00326128"/>
+  </w:style>
 </w:styles>
 </file>
 

</xml_diff>

<commit_message>
Add notes for 24/202
</commit_message>
<xml_diff>
--- a/section24_express.js/section24_expressjsNotes.docx
+++ b/section24_express.js/section24_expressjsNotes.docx
@@ -251,13 +251,8 @@
           <w:numId w:val="2"/>
         </w:numPr>
       </w:pPr>
-      <w:proofErr w:type="spellStart"/>
-      <w:r>
-        <w:t>Eg.</w:t>
-      </w:r>
-      <w:proofErr w:type="spellEnd"/>
-      <w:r>
-        <w:t xml:space="preserve"> localhost:3000. Here, 3000 represents a port on the server i.e. our PC.</w:t>
+      <w:r>
+        <w:t>Eg. localhost:3000. Here, 3000 represents a port on the server i.e. our PC.</w:t>
       </w:r>
     </w:p>
     <w:p>
@@ -269,23 +264,7 @@
         </w:numPr>
       </w:pPr>
       <w:r>
-        <w:t>Use `netstat -</w:t>
-      </w:r>
-      <w:proofErr w:type="spellStart"/>
-      <w:r>
-        <w:t>ano</w:t>
-      </w:r>
-      <w:proofErr w:type="spellEnd"/>
-      <w:r>
-        <w:t xml:space="preserve"> | </w:t>
-      </w:r>
-      <w:proofErr w:type="spellStart"/>
-      <w:r>
-        <w:t>findstr</w:t>
-      </w:r>
-      <w:proofErr w:type="spellEnd"/>
-      <w:r>
-        <w:t xml:space="preserve"> “LISTENING” ` to view active ports.</w:t>
+        <w:t>Use `netstat -ano | findstr “LISTENING” ` to view active ports.</w:t>
       </w:r>
     </w:p>
     <w:p>
@@ -418,7 +397,6 @@
           <w14:ligatures w14:val="none"/>
         </w:rPr>
       </w:pPr>
-      <w:proofErr w:type="spellStart"/>
       <w:r>
         <w:rPr>
           <w:rFonts w:ascii="Consolas" w:eastAsia="Times New Roman" w:hAnsi="Consolas" w:cs="Times New Roman"/>
@@ -431,7 +409,6 @@
         </w:rPr>
         <w:t>const</w:t>
       </w:r>
-      <w:proofErr w:type="spellEnd"/>
       <w:r>
         <w:rPr>
           <w:rFonts w:ascii="Consolas" w:eastAsia="Times New Roman" w:hAnsi="Consolas" w:cs="Times New Roman"/>
@@ -531,7 +508,6 @@
           <w14:ligatures w14:val="none"/>
         </w:rPr>
       </w:pPr>
-      <w:proofErr w:type="spellStart"/>
       <w:r>
         <w:rPr>
           <w:rFonts w:ascii="Consolas" w:eastAsia="Times New Roman" w:hAnsi="Consolas" w:cs="Times New Roman"/>
@@ -544,7 +520,6 @@
         </w:rPr>
         <w:t>const</w:t>
       </w:r>
-      <w:proofErr w:type="spellEnd"/>
       <w:r>
         <w:rPr>
           <w:rFonts w:ascii="Consolas" w:eastAsia="Times New Roman" w:hAnsi="Consolas" w:cs="Times New Roman"/>
@@ -659,7 +634,6 @@
           <w14:ligatures w14:val="none"/>
         </w:rPr>
       </w:pPr>
-      <w:proofErr w:type="spellStart"/>
       <w:r>
         <w:rPr>
           <w:rFonts w:ascii="Consolas" w:eastAsia="Times New Roman" w:hAnsi="Consolas" w:cs="Times New Roman"/>
@@ -696,7 +670,6 @@
         </w:rPr>
         <w:t>listen</w:t>
       </w:r>
-      <w:proofErr w:type="spellEnd"/>
       <w:r>
         <w:rPr>
           <w:rFonts w:ascii="Consolas" w:eastAsia="Times New Roman" w:hAnsi="Consolas" w:cs="Times New Roman"/>
@@ -891,6 +864,731 @@
           <w14:ligatures w14:val="none"/>
         </w:rPr>
         <w:t>`</w:t>
+      </w:r>
+      <w:r>
+        <w:rPr>
+          <w:rFonts w:ascii="Consolas" w:eastAsia="Times New Roman" w:hAnsi="Consolas" w:cs="Times New Roman"/>
+          <w:color w:val="CCCCCC"/>
+          <w:kern w:val="0"/>
+          <w:sz w:val="27"/>
+          <w:szCs w:val="27"/>
+          <w:lang w:eastAsia="en-IN"/>
+          <w14:ligatures w14:val="none"/>
+        </w:rPr>
+        <w:t>);</w:t>
+      </w:r>
+    </w:p>
+    <w:p>
+      <w:pPr>
+        <w:shd w:val="clear" w:color="auto" w:fill="1F1F1F"/>
+        <w:spacing w:after="0" w:line="360" w:lineRule="atLeast"/>
+        <w:rPr>
+          <w:rFonts w:ascii="Consolas" w:eastAsia="Times New Roman" w:hAnsi="Consolas" w:cs="Times New Roman"/>
+          <w:color w:val="CCCCCC"/>
+          <w:kern w:val="0"/>
+          <w:sz w:val="27"/>
+          <w:szCs w:val="27"/>
+          <w:lang w:eastAsia="en-IN"/>
+          <w14:ligatures w14:val="none"/>
+        </w:rPr>
+      </w:pPr>
+      <w:r>
+        <w:rPr>
+          <w:rFonts w:ascii="Consolas" w:eastAsia="Times New Roman" w:hAnsi="Consolas" w:cs="Times New Roman"/>
+          <w:color w:val="CCCCCC"/>
+          <w:kern w:val="0"/>
+          <w:sz w:val="27"/>
+          <w:szCs w:val="27"/>
+          <w:lang w:eastAsia="en-IN"/>
+          <w14:ligatures w14:val="none"/>
+        </w:rPr>
+        <w:t>});</w:t>
+      </w:r>
+    </w:p>
+    <w:p/>
+    <w:p>
+      <w:pPr>
+        <w:rPr>
+          <w:b/>
+          <w:bCs/>
+        </w:rPr>
+      </w:pPr>
+      <w:r>
+        <w:rPr>
+          <w:b/>
+          <w:bCs/>
+        </w:rPr>
+        <w:t>202. HTTP Requests</w:t>
+      </w:r>
+    </w:p>
+    <w:p>
+      <w:pPr>
+        <w:pStyle w:val="ListParagraph"/>
+        <w:numPr>
+          <w:ilvl w:val="0"/>
+          <w:numId w:val="3"/>
+        </w:numPr>
+      </w:pPr>
+      <w:r>
+        <w:t>Stands for: HyperText Transfer Protocol</w:t>
+      </w:r>
+    </w:p>
+    <w:p>
+      <w:pPr>
+        <w:pStyle w:val="ListParagraph"/>
+        <w:numPr>
+          <w:ilvl w:val="0"/>
+          <w:numId w:val="3"/>
+        </w:numPr>
+      </w:pPr>
+      <w:r>
+        <w:t>A language that allows computers to talk to each other on the internet.</w:t>
+      </w:r>
+    </w:p>
+    <w:p>
+      <w:pPr>
+        <w:pStyle w:val="ListParagraph"/>
+        <w:numPr>
+          <w:ilvl w:val="0"/>
+          <w:numId w:val="3"/>
+        </w:numPr>
+      </w:pPr>
+      <w:r>
+        <w:t>Main requests:</w:t>
+      </w:r>
+    </w:p>
+    <w:p>
+      <w:pPr>
+        <w:pStyle w:val="ListParagraph"/>
+        <w:numPr>
+          <w:ilvl w:val="1"/>
+          <w:numId w:val="3"/>
+        </w:numPr>
+      </w:pPr>
+      <w:r>
+        <w:t>GET: When you want to request a resource from the server. GET something from the server.</w:t>
+      </w:r>
+    </w:p>
+    <w:p>
+      <w:pPr>
+        <w:shd w:val="clear" w:color="auto" w:fill="1F1F1F"/>
+        <w:spacing w:after="0" w:line="360" w:lineRule="atLeast"/>
+        <w:rPr>
+          <w:rFonts w:ascii="Consolas" w:eastAsia="Times New Roman" w:hAnsi="Consolas" w:cs="Times New Roman"/>
+          <w:color w:val="CCCCCC"/>
+          <w:kern w:val="0"/>
+          <w:sz w:val="27"/>
+          <w:szCs w:val="27"/>
+          <w:lang w:eastAsia="en-IN"/>
+          <w14:ligatures w14:val="none"/>
+        </w:rPr>
+      </w:pPr>
+      <w:r>
+        <w:rPr>
+          <w:rFonts w:ascii="Consolas" w:eastAsia="Times New Roman" w:hAnsi="Consolas" w:cs="Times New Roman"/>
+          <w:color w:val="4FC1FF"/>
+          <w:kern w:val="0"/>
+          <w:sz w:val="27"/>
+          <w:szCs w:val="27"/>
+          <w:lang w:eastAsia="en-IN"/>
+          <w14:ligatures w14:val="none"/>
+        </w:rPr>
+        <w:t>APP</w:t>
+      </w:r>
+      <w:r>
+        <w:rPr>
+          <w:rFonts w:ascii="Consolas" w:eastAsia="Times New Roman" w:hAnsi="Consolas" w:cs="Times New Roman"/>
+          <w:color w:val="CCCCCC"/>
+          <w:kern w:val="0"/>
+          <w:sz w:val="27"/>
+          <w:szCs w:val="27"/>
+          <w:lang w:eastAsia="en-IN"/>
+          <w14:ligatures w14:val="none"/>
+        </w:rPr>
+        <w:t>.</w:t>
+      </w:r>
+      <w:r>
+        <w:rPr>
+          <w:rFonts w:ascii="Consolas" w:eastAsia="Times New Roman" w:hAnsi="Consolas" w:cs="Times New Roman"/>
+          <w:color w:val="DCDCAA"/>
+          <w:kern w:val="0"/>
+          <w:sz w:val="27"/>
+          <w:szCs w:val="27"/>
+          <w:lang w:eastAsia="en-IN"/>
+          <w14:ligatures w14:val="none"/>
+        </w:rPr>
+        <w:t>get</w:t>
+      </w:r>
+      <w:r>
+        <w:rPr>
+          <w:rFonts w:ascii="Consolas" w:eastAsia="Times New Roman" w:hAnsi="Consolas" w:cs="Times New Roman"/>
+          <w:color w:val="CCCCCC"/>
+          <w:kern w:val="0"/>
+          <w:sz w:val="27"/>
+          <w:szCs w:val="27"/>
+          <w:lang w:eastAsia="en-IN"/>
+          <w14:ligatures w14:val="none"/>
+        </w:rPr>
+        <w:t>(</w:t>
+      </w:r>
+      <w:r>
+        <w:rPr>
+          <w:rFonts w:ascii="Consolas" w:eastAsia="Times New Roman" w:hAnsi="Consolas" w:cs="Times New Roman"/>
+          <w:color w:val="CE9178"/>
+          <w:kern w:val="0"/>
+          <w:sz w:val="27"/>
+          <w:szCs w:val="27"/>
+          <w:lang w:eastAsia="en-IN"/>
+          <w14:ligatures w14:val="none"/>
+        </w:rPr>
+        <w:t>"/"</w:t>
+      </w:r>
+      <w:r>
+        <w:rPr>
+          <w:rFonts w:ascii="Consolas" w:eastAsia="Times New Roman" w:hAnsi="Consolas" w:cs="Times New Roman"/>
+          <w:color w:val="CCCCCC"/>
+          <w:kern w:val="0"/>
+          <w:sz w:val="27"/>
+          <w:szCs w:val="27"/>
+          <w:lang w:eastAsia="en-IN"/>
+          <w14:ligatures w14:val="none"/>
+        </w:rPr>
+        <w:t>, (</w:t>
+      </w:r>
+      <w:r>
+        <w:rPr>
+          <w:rFonts w:ascii="Consolas" w:eastAsia="Times New Roman" w:hAnsi="Consolas" w:cs="Times New Roman"/>
+          <w:color w:val="9CDCFE"/>
+          <w:kern w:val="0"/>
+          <w:sz w:val="27"/>
+          <w:szCs w:val="27"/>
+          <w:lang w:eastAsia="en-IN"/>
+          <w14:ligatures w14:val="none"/>
+        </w:rPr>
+        <w:t>req</w:t>
+      </w:r>
+      <w:r>
+        <w:rPr>
+          <w:rFonts w:ascii="Consolas" w:eastAsia="Times New Roman" w:hAnsi="Consolas" w:cs="Times New Roman"/>
+          <w:color w:val="CCCCCC"/>
+          <w:kern w:val="0"/>
+          <w:sz w:val="27"/>
+          <w:szCs w:val="27"/>
+          <w:lang w:eastAsia="en-IN"/>
+          <w14:ligatures w14:val="none"/>
+        </w:rPr>
+        <w:t xml:space="preserve">, </w:t>
+      </w:r>
+      <w:r>
+        <w:rPr>
+          <w:rFonts w:ascii="Consolas" w:eastAsia="Times New Roman" w:hAnsi="Consolas" w:cs="Times New Roman"/>
+          <w:color w:val="9CDCFE"/>
+          <w:kern w:val="0"/>
+          <w:sz w:val="27"/>
+          <w:szCs w:val="27"/>
+          <w:lang w:eastAsia="en-IN"/>
+          <w14:ligatures w14:val="none"/>
+        </w:rPr>
+        <w:t>res</w:t>
+      </w:r>
+      <w:r>
+        <w:rPr>
+          <w:rFonts w:ascii="Consolas" w:eastAsia="Times New Roman" w:hAnsi="Consolas" w:cs="Times New Roman"/>
+          <w:color w:val="CCCCCC"/>
+          <w:kern w:val="0"/>
+          <w:sz w:val="27"/>
+          <w:szCs w:val="27"/>
+          <w:lang w:eastAsia="en-IN"/>
+          <w14:ligatures w14:val="none"/>
+        </w:rPr>
+        <w:t xml:space="preserve">) </w:t>
+      </w:r>
+      <w:r>
+        <w:rPr>
+          <w:rFonts w:ascii="Consolas" w:eastAsia="Times New Roman" w:hAnsi="Consolas" w:cs="Times New Roman"/>
+          <w:color w:val="569CD6"/>
+          <w:kern w:val="0"/>
+          <w:sz w:val="27"/>
+          <w:szCs w:val="27"/>
+          <w:lang w:eastAsia="en-IN"/>
+          <w14:ligatures w14:val="none"/>
+        </w:rPr>
+        <w:t>=&gt;</w:t>
+      </w:r>
+      <w:r>
+        <w:rPr>
+          <w:rFonts w:ascii="Consolas" w:eastAsia="Times New Roman" w:hAnsi="Consolas" w:cs="Times New Roman"/>
+          <w:color w:val="CCCCCC"/>
+          <w:kern w:val="0"/>
+          <w:sz w:val="27"/>
+          <w:szCs w:val="27"/>
+          <w:lang w:eastAsia="en-IN"/>
+          <w14:ligatures w14:val="none"/>
+        </w:rPr>
+        <w:t xml:space="preserve"> {</w:t>
+      </w:r>
+    </w:p>
+    <w:p>
+      <w:pPr>
+        <w:shd w:val="clear" w:color="auto" w:fill="1F1F1F"/>
+        <w:spacing w:after="0" w:line="360" w:lineRule="atLeast"/>
+        <w:rPr>
+          <w:rFonts w:ascii="Consolas" w:eastAsia="Times New Roman" w:hAnsi="Consolas" w:cs="Times New Roman"/>
+          <w:color w:val="CCCCCC"/>
+          <w:kern w:val="0"/>
+          <w:sz w:val="27"/>
+          <w:szCs w:val="27"/>
+          <w:lang w:eastAsia="en-IN"/>
+          <w14:ligatures w14:val="none"/>
+        </w:rPr>
+      </w:pPr>
+      <w:r>
+        <w:rPr>
+          <w:rFonts w:ascii="Consolas" w:eastAsia="Times New Roman" w:hAnsi="Consolas" w:cs="Times New Roman"/>
+          <w:color w:val="CCCCCC"/>
+          <w:kern w:val="0"/>
+          <w:sz w:val="27"/>
+          <w:szCs w:val="27"/>
+          <w:lang w:eastAsia="en-IN"/>
+          <w14:ligatures w14:val="none"/>
+        </w:rPr>
+        <w:t xml:space="preserve">    </w:t>
+      </w:r>
+      <w:r>
+        <w:rPr>
+          <w:rFonts w:ascii="Consolas" w:eastAsia="Times New Roman" w:hAnsi="Consolas" w:cs="Times New Roman"/>
+          <w:color w:val="9CDCFE"/>
+          <w:kern w:val="0"/>
+          <w:sz w:val="27"/>
+          <w:szCs w:val="27"/>
+          <w:lang w:eastAsia="en-IN"/>
+          <w14:ligatures w14:val="none"/>
+        </w:rPr>
+        <w:t>res</w:t>
+      </w:r>
+      <w:r>
+        <w:rPr>
+          <w:rFonts w:ascii="Consolas" w:eastAsia="Times New Roman" w:hAnsi="Consolas" w:cs="Times New Roman"/>
+          <w:color w:val="CCCCCC"/>
+          <w:kern w:val="0"/>
+          <w:sz w:val="27"/>
+          <w:szCs w:val="27"/>
+          <w:lang w:eastAsia="en-IN"/>
+          <w14:ligatures w14:val="none"/>
+        </w:rPr>
+        <w:t>.</w:t>
+      </w:r>
+      <w:r>
+        <w:rPr>
+          <w:rFonts w:ascii="Consolas" w:eastAsia="Times New Roman" w:hAnsi="Consolas" w:cs="Times New Roman"/>
+          <w:color w:val="DCDCAA"/>
+          <w:kern w:val="0"/>
+          <w:sz w:val="27"/>
+          <w:szCs w:val="27"/>
+          <w:lang w:eastAsia="en-IN"/>
+          <w14:ligatures w14:val="none"/>
+        </w:rPr>
+        <w:t>send</w:t>
+      </w:r>
+      <w:r>
+        <w:rPr>
+          <w:rFonts w:ascii="Consolas" w:eastAsia="Times New Roman" w:hAnsi="Consolas" w:cs="Times New Roman"/>
+          <w:color w:val="CCCCCC"/>
+          <w:kern w:val="0"/>
+          <w:sz w:val="27"/>
+          <w:szCs w:val="27"/>
+          <w:lang w:eastAsia="en-IN"/>
+          <w14:ligatures w14:val="none"/>
+        </w:rPr>
+        <w:t>(</w:t>
+      </w:r>
+      <w:r>
+        <w:rPr>
+          <w:rFonts w:ascii="Consolas" w:eastAsia="Times New Roman" w:hAnsi="Consolas" w:cs="Times New Roman"/>
+          <w:color w:val="CE9178"/>
+          <w:kern w:val="0"/>
+          <w:sz w:val="27"/>
+          <w:szCs w:val="27"/>
+          <w:lang w:eastAsia="en-IN"/>
+          <w14:ligatures w14:val="none"/>
+        </w:rPr>
+        <w:t>"Hello World"</w:t>
+      </w:r>
+      <w:r>
+        <w:rPr>
+          <w:rFonts w:ascii="Consolas" w:eastAsia="Times New Roman" w:hAnsi="Consolas" w:cs="Times New Roman"/>
+          <w:color w:val="CCCCCC"/>
+          <w:kern w:val="0"/>
+          <w:sz w:val="27"/>
+          <w:szCs w:val="27"/>
+          <w:lang w:eastAsia="en-IN"/>
+          <w14:ligatures w14:val="none"/>
+        </w:rPr>
+        <w:t>);</w:t>
+      </w:r>
+    </w:p>
+    <w:p>
+      <w:pPr>
+        <w:shd w:val="clear" w:color="auto" w:fill="1F1F1F"/>
+        <w:spacing w:after="0" w:line="360" w:lineRule="atLeast"/>
+        <w:rPr>
+          <w:rFonts w:ascii="Consolas" w:eastAsia="Times New Roman" w:hAnsi="Consolas" w:cs="Times New Roman"/>
+          <w:color w:val="CCCCCC"/>
+          <w:kern w:val="0"/>
+          <w:sz w:val="27"/>
+          <w:szCs w:val="27"/>
+          <w:lang w:eastAsia="en-IN"/>
+          <w14:ligatures w14:val="none"/>
+        </w:rPr>
+      </w:pPr>
+      <w:r>
+        <w:rPr>
+          <w:rFonts w:ascii="Consolas" w:eastAsia="Times New Roman" w:hAnsi="Consolas" w:cs="Times New Roman"/>
+          <w:color w:val="CCCCCC"/>
+          <w:kern w:val="0"/>
+          <w:sz w:val="27"/>
+          <w:szCs w:val="27"/>
+          <w:lang w:eastAsia="en-IN"/>
+          <w14:ligatures w14:val="none"/>
+        </w:rPr>
+        <w:t>});</w:t>
+      </w:r>
+    </w:p>
+    <w:p>
+      <w:pPr>
+        <w:pStyle w:val="ListParagraph"/>
+        <w:numPr>
+          <w:ilvl w:val="1"/>
+          <w:numId w:val="3"/>
+        </w:numPr>
+      </w:pPr>
+      <w:r>
+        <w:lastRenderedPageBreak/>
+        <w:t>POST: Sending a resource to the server. Eg. forms.</w:t>
+      </w:r>
+    </w:p>
+    <w:p>
+      <w:pPr>
+        <w:pStyle w:val="ListParagraph"/>
+        <w:numPr>
+          <w:ilvl w:val="1"/>
+          <w:numId w:val="3"/>
+        </w:numPr>
+      </w:pPr>
+      <w:r>
+        <w:t>PUT: Update method. When you want to replace a resource with whatever we are sending over.</w:t>
+      </w:r>
+    </w:p>
+    <w:p>
+      <w:pPr>
+        <w:pStyle w:val="ListParagraph"/>
+        <w:numPr>
+          <w:ilvl w:val="1"/>
+          <w:numId w:val="3"/>
+        </w:numPr>
+      </w:pPr>
+      <w:r>
+        <w:t>PATCH: Patch-up a resource.</w:t>
+      </w:r>
+    </w:p>
+    <w:p>
+      <w:pPr>
+        <w:pStyle w:val="ListParagraph"/>
+        <w:numPr>
+          <w:ilvl w:val="1"/>
+          <w:numId w:val="3"/>
+        </w:numPr>
+      </w:pPr>
+      <w:r>
+        <w:t>DELETE: Deletes resources from server. Client -&gt; Server request.</w:t>
+      </w:r>
+    </w:p>
+    <w:p>
+      <w:pPr>
+        <w:pStyle w:val="ListParagraph"/>
+        <w:numPr>
+          <w:ilvl w:val="0"/>
+          <w:numId w:val="3"/>
+        </w:numPr>
+      </w:pPr>
+      <w:r>
+        <w:t>Endpoint:</w:t>
+      </w:r>
+    </w:p>
+    <w:p>
+      <w:pPr>
+        <w:pStyle w:val="ListParagraph"/>
+        <w:numPr>
+          <w:ilvl w:val="1"/>
+          <w:numId w:val="3"/>
+        </w:numPr>
+      </w:pPr>
+      <w:r>
+        <w:t>Root: “/”</w:t>
+      </w:r>
+      <w:r>
+        <w:t>.</w:t>
+      </w:r>
+    </w:p>
+    <w:p>
+      <w:pPr>
+        <w:pStyle w:val="ListParagraph"/>
+        <w:numPr>
+          <w:ilvl w:val="1"/>
+          <w:numId w:val="3"/>
+        </w:numPr>
+      </w:pPr>
+      <w:r>
+        <w:t>Other endpoints: “/about”. Need to write GET for every endpoint.</w:t>
+      </w:r>
+      <w:r>
+        <w:t xml:space="preserve"> </w:t>
+      </w:r>
+    </w:p>
+    <w:p>
+      <w:pPr>
+        <w:shd w:val="clear" w:color="auto" w:fill="1F1F1F"/>
+        <w:spacing w:after="0" w:line="360" w:lineRule="atLeast"/>
+        <w:rPr>
+          <w:rFonts w:ascii="Consolas" w:eastAsia="Times New Roman" w:hAnsi="Consolas" w:cs="Times New Roman"/>
+          <w:color w:val="CCCCCC"/>
+          <w:kern w:val="0"/>
+          <w:sz w:val="27"/>
+          <w:szCs w:val="27"/>
+          <w:lang w:eastAsia="en-IN"/>
+          <w14:ligatures w14:val="none"/>
+        </w:rPr>
+      </w:pPr>
+      <w:r>
+        <w:rPr>
+          <w:rFonts w:ascii="Consolas" w:eastAsia="Times New Roman" w:hAnsi="Consolas" w:cs="Times New Roman"/>
+          <w:color w:val="4FC1FF"/>
+          <w:kern w:val="0"/>
+          <w:sz w:val="27"/>
+          <w:szCs w:val="27"/>
+          <w:lang w:eastAsia="en-IN"/>
+          <w14:ligatures w14:val="none"/>
+        </w:rPr>
+        <w:t>APP</w:t>
+      </w:r>
+      <w:r>
+        <w:rPr>
+          <w:rFonts w:ascii="Consolas" w:eastAsia="Times New Roman" w:hAnsi="Consolas" w:cs="Times New Roman"/>
+          <w:color w:val="CCCCCC"/>
+          <w:kern w:val="0"/>
+          <w:sz w:val="27"/>
+          <w:szCs w:val="27"/>
+          <w:lang w:eastAsia="en-IN"/>
+          <w14:ligatures w14:val="none"/>
+        </w:rPr>
+        <w:t>.</w:t>
+      </w:r>
+      <w:r>
+        <w:rPr>
+          <w:rFonts w:ascii="Consolas" w:eastAsia="Times New Roman" w:hAnsi="Consolas" w:cs="Times New Roman"/>
+          <w:color w:val="DCDCAA"/>
+          <w:kern w:val="0"/>
+          <w:sz w:val="27"/>
+          <w:szCs w:val="27"/>
+          <w:lang w:eastAsia="en-IN"/>
+          <w14:ligatures w14:val="none"/>
+        </w:rPr>
+        <w:t>get</w:t>
+      </w:r>
+      <w:r>
+        <w:rPr>
+          <w:rFonts w:ascii="Consolas" w:eastAsia="Times New Roman" w:hAnsi="Consolas" w:cs="Times New Roman"/>
+          <w:color w:val="CCCCCC"/>
+          <w:kern w:val="0"/>
+          <w:sz w:val="27"/>
+          <w:szCs w:val="27"/>
+          <w:lang w:eastAsia="en-IN"/>
+          <w14:ligatures w14:val="none"/>
+        </w:rPr>
+        <w:t>(</w:t>
+      </w:r>
+      <w:r>
+        <w:rPr>
+          <w:rFonts w:ascii="Consolas" w:eastAsia="Times New Roman" w:hAnsi="Consolas" w:cs="Times New Roman"/>
+          <w:color w:val="CE9178"/>
+          <w:kern w:val="0"/>
+          <w:sz w:val="27"/>
+          <w:szCs w:val="27"/>
+          <w:lang w:eastAsia="en-IN"/>
+          <w14:ligatures w14:val="none"/>
+        </w:rPr>
+        <w:t>"/about"</w:t>
+      </w:r>
+      <w:r>
+        <w:rPr>
+          <w:rFonts w:ascii="Consolas" w:eastAsia="Times New Roman" w:hAnsi="Consolas" w:cs="Times New Roman"/>
+          <w:color w:val="CCCCCC"/>
+          <w:kern w:val="0"/>
+          <w:sz w:val="27"/>
+          <w:szCs w:val="27"/>
+          <w:lang w:eastAsia="en-IN"/>
+          <w14:ligatures w14:val="none"/>
+        </w:rPr>
+        <w:t>, (</w:t>
+      </w:r>
+      <w:r>
+        <w:rPr>
+          <w:rFonts w:ascii="Consolas" w:eastAsia="Times New Roman" w:hAnsi="Consolas" w:cs="Times New Roman"/>
+          <w:color w:val="9CDCFE"/>
+          <w:kern w:val="0"/>
+          <w:sz w:val="27"/>
+          <w:szCs w:val="27"/>
+          <w:lang w:eastAsia="en-IN"/>
+          <w14:ligatures w14:val="none"/>
+        </w:rPr>
+        <w:t>req</w:t>
+      </w:r>
+      <w:r>
+        <w:rPr>
+          <w:rFonts w:ascii="Consolas" w:eastAsia="Times New Roman" w:hAnsi="Consolas" w:cs="Times New Roman"/>
+          <w:color w:val="CCCCCC"/>
+          <w:kern w:val="0"/>
+          <w:sz w:val="27"/>
+          <w:szCs w:val="27"/>
+          <w:lang w:eastAsia="en-IN"/>
+          <w14:ligatures w14:val="none"/>
+        </w:rPr>
+        <w:t xml:space="preserve">, </w:t>
+      </w:r>
+      <w:r>
+        <w:rPr>
+          <w:rFonts w:ascii="Consolas" w:eastAsia="Times New Roman" w:hAnsi="Consolas" w:cs="Times New Roman"/>
+          <w:color w:val="9CDCFE"/>
+          <w:kern w:val="0"/>
+          <w:sz w:val="27"/>
+          <w:szCs w:val="27"/>
+          <w:lang w:eastAsia="en-IN"/>
+          <w14:ligatures w14:val="none"/>
+        </w:rPr>
+        <w:t>res</w:t>
+      </w:r>
+      <w:r>
+        <w:rPr>
+          <w:rFonts w:ascii="Consolas" w:eastAsia="Times New Roman" w:hAnsi="Consolas" w:cs="Times New Roman"/>
+          <w:color w:val="CCCCCC"/>
+          <w:kern w:val="0"/>
+          <w:sz w:val="27"/>
+          <w:szCs w:val="27"/>
+          <w:lang w:eastAsia="en-IN"/>
+          <w14:ligatures w14:val="none"/>
+        </w:rPr>
+        <w:t xml:space="preserve">) </w:t>
+      </w:r>
+      <w:r>
+        <w:rPr>
+          <w:rFonts w:ascii="Consolas" w:eastAsia="Times New Roman" w:hAnsi="Consolas" w:cs="Times New Roman"/>
+          <w:color w:val="569CD6"/>
+          <w:kern w:val="0"/>
+          <w:sz w:val="27"/>
+          <w:szCs w:val="27"/>
+          <w:lang w:eastAsia="en-IN"/>
+          <w14:ligatures w14:val="none"/>
+        </w:rPr>
+        <w:t>=&gt;</w:t>
+      </w:r>
+      <w:r>
+        <w:rPr>
+          <w:rFonts w:ascii="Consolas" w:eastAsia="Times New Roman" w:hAnsi="Consolas" w:cs="Times New Roman"/>
+          <w:color w:val="CCCCCC"/>
+          <w:kern w:val="0"/>
+          <w:sz w:val="27"/>
+          <w:szCs w:val="27"/>
+          <w:lang w:eastAsia="en-IN"/>
+          <w14:ligatures w14:val="none"/>
+        </w:rPr>
+        <w:t xml:space="preserve"> {</w:t>
+      </w:r>
+    </w:p>
+    <w:p>
+      <w:pPr>
+        <w:shd w:val="clear" w:color="auto" w:fill="1F1F1F"/>
+        <w:spacing w:after="0" w:line="360" w:lineRule="atLeast"/>
+        <w:rPr>
+          <w:rFonts w:ascii="Consolas" w:eastAsia="Times New Roman" w:hAnsi="Consolas" w:cs="Times New Roman"/>
+          <w:color w:val="CCCCCC"/>
+          <w:kern w:val="0"/>
+          <w:sz w:val="27"/>
+          <w:szCs w:val="27"/>
+          <w:lang w:eastAsia="en-IN"/>
+          <w14:ligatures w14:val="none"/>
+        </w:rPr>
+      </w:pPr>
+      <w:r>
+        <w:rPr>
+          <w:rFonts w:ascii="Consolas" w:eastAsia="Times New Roman" w:hAnsi="Consolas" w:cs="Times New Roman"/>
+          <w:color w:val="CCCCCC"/>
+          <w:kern w:val="0"/>
+          <w:sz w:val="27"/>
+          <w:szCs w:val="27"/>
+          <w:lang w:eastAsia="en-IN"/>
+          <w14:ligatures w14:val="none"/>
+        </w:rPr>
+        <w:t xml:space="preserve">    </w:t>
+      </w:r>
+      <w:r>
+        <w:rPr>
+          <w:rFonts w:ascii="Consolas" w:eastAsia="Times New Roman" w:hAnsi="Consolas" w:cs="Times New Roman"/>
+          <w:color w:val="9CDCFE"/>
+          <w:kern w:val="0"/>
+          <w:sz w:val="27"/>
+          <w:szCs w:val="27"/>
+          <w:lang w:eastAsia="en-IN"/>
+          <w14:ligatures w14:val="none"/>
+        </w:rPr>
+        <w:t>res</w:t>
+      </w:r>
+      <w:r>
+        <w:rPr>
+          <w:rFonts w:ascii="Consolas" w:eastAsia="Times New Roman" w:hAnsi="Consolas" w:cs="Times New Roman"/>
+          <w:color w:val="CCCCCC"/>
+          <w:kern w:val="0"/>
+          <w:sz w:val="27"/>
+          <w:szCs w:val="27"/>
+          <w:lang w:eastAsia="en-IN"/>
+          <w14:ligatures w14:val="none"/>
+        </w:rPr>
+        <w:t>.</w:t>
+      </w:r>
+      <w:r>
+        <w:rPr>
+          <w:rFonts w:ascii="Consolas" w:eastAsia="Times New Roman" w:hAnsi="Consolas" w:cs="Times New Roman"/>
+          <w:color w:val="DCDCAA"/>
+          <w:kern w:val="0"/>
+          <w:sz w:val="27"/>
+          <w:szCs w:val="27"/>
+          <w:lang w:eastAsia="en-IN"/>
+          <w14:ligatures w14:val="none"/>
+        </w:rPr>
+        <w:t>send</w:t>
+      </w:r>
+      <w:r>
+        <w:rPr>
+          <w:rFonts w:ascii="Consolas" w:eastAsia="Times New Roman" w:hAnsi="Consolas" w:cs="Times New Roman"/>
+          <w:color w:val="CCCCCC"/>
+          <w:kern w:val="0"/>
+          <w:sz w:val="27"/>
+          <w:szCs w:val="27"/>
+          <w:lang w:eastAsia="en-IN"/>
+          <w14:ligatures w14:val="none"/>
+        </w:rPr>
+        <w:t>(</w:t>
+      </w:r>
+      <w:r>
+        <w:rPr>
+          <w:rFonts w:ascii="Consolas" w:eastAsia="Times New Roman" w:hAnsi="Consolas" w:cs="Times New Roman"/>
+          <w:color w:val="CE9178"/>
+          <w:kern w:val="0"/>
+          <w:sz w:val="27"/>
+          <w:szCs w:val="27"/>
+          <w:lang w:eastAsia="en-IN"/>
+          <w14:ligatures w14:val="none"/>
+        </w:rPr>
+        <w:t>"&lt;h1&gt;About Me&lt;/h1&gt;"</w:t>
       </w:r>
       <w:r>
         <w:rPr>
@@ -1110,9 +1808,9 @@
     </w:lvl>
   </w:abstractNum>
   <w:abstractNum w:abstractNumId="1" w15:restartNumberingAfterBreak="0">
-    <w:nsid w:val="4CF81348"/>
+    <w:nsid w:val="0AF626E1"/>
     <w:multiLevelType w:val="hybridMultilevel"/>
-    <w:tmpl w:val="CAAA94D8"/>
+    <w:tmpl w:val="A44201EC"/>
     <w:lvl w:ilvl="0" w:tplc="40090001">
       <w:start w:val="1"/>
       <w:numFmt w:val="bullet"/>
@@ -1222,11 +1920,127 @@
       </w:rPr>
     </w:lvl>
   </w:abstractNum>
+  <w:abstractNum w:abstractNumId="2" w15:restartNumberingAfterBreak="0">
+    <w:nsid w:val="4CF81348"/>
+    <w:multiLevelType w:val="hybridMultilevel"/>
+    <w:tmpl w:val="CAAA94D8"/>
+    <w:lvl w:ilvl="0" w:tplc="40090001">
+      <w:start w:val="1"/>
+      <w:numFmt w:val="bullet"/>
+      <w:lvlText w:val=""/>
+      <w:lvlJc w:val="left"/>
+      <w:pPr>
+        <w:ind w:left="720" w:hanging="360"/>
+      </w:pPr>
+      <w:rPr>
+        <w:rFonts w:ascii="Symbol" w:hAnsi="Symbol" w:hint="default"/>
+      </w:rPr>
+    </w:lvl>
+    <w:lvl w:ilvl="1" w:tplc="40090003">
+      <w:start w:val="1"/>
+      <w:numFmt w:val="bullet"/>
+      <w:lvlText w:val="o"/>
+      <w:lvlJc w:val="left"/>
+      <w:pPr>
+        <w:ind w:left="1440" w:hanging="360"/>
+      </w:pPr>
+      <w:rPr>
+        <w:rFonts w:ascii="Courier New" w:hAnsi="Courier New" w:cs="Courier New" w:hint="default"/>
+      </w:rPr>
+    </w:lvl>
+    <w:lvl w:ilvl="2" w:tplc="40090005" w:tentative="1">
+      <w:start w:val="1"/>
+      <w:numFmt w:val="bullet"/>
+      <w:lvlText w:val=""/>
+      <w:lvlJc w:val="left"/>
+      <w:pPr>
+        <w:ind w:left="2160" w:hanging="360"/>
+      </w:pPr>
+      <w:rPr>
+        <w:rFonts w:ascii="Wingdings" w:hAnsi="Wingdings" w:hint="default"/>
+      </w:rPr>
+    </w:lvl>
+    <w:lvl w:ilvl="3" w:tplc="40090001" w:tentative="1">
+      <w:start w:val="1"/>
+      <w:numFmt w:val="bullet"/>
+      <w:lvlText w:val=""/>
+      <w:lvlJc w:val="left"/>
+      <w:pPr>
+        <w:ind w:left="2880" w:hanging="360"/>
+      </w:pPr>
+      <w:rPr>
+        <w:rFonts w:ascii="Symbol" w:hAnsi="Symbol" w:hint="default"/>
+      </w:rPr>
+    </w:lvl>
+    <w:lvl w:ilvl="4" w:tplc="40090003" w:tentative="1">
+      <w:start w:val="1"/>
+      <w:numFmt w:val="bullet"/>
+      <w:lvlText w:val="o"/>
+      <w:lvlJc w:val="left"/>
+      <w:pPr>
+        <w:ind w:left="3600" w:hanging="360"/>
+      </w:pPr>
+      <w:rPr>
+        <w:rFonts w:ascii="Courier New" w:hAnsi="Courier New" w:cs="Courier New" w:hint="default"/>
+      </w:rPr>
+    </w:lvl>
+    <w:lvl w:ilvl="5" w:tplc="40090005" w:tentative="1">
+      <w:start w:val="1"/>
+      <w:numFmt w:val="bullet"/>
+      <w:lvlText w:val=""/>
+      <w:lvlJc w:val="left"/>
+      <w:pPr>
+        <w:ind w:left="4320" w:hanging="360"/>
+      </w:pPr>
+      <w:rPr>
+        <w:rFonts w:ascii="Wingdings" w:hAnsi="Wingdings" w:hint="default"/>
+      </w:rPr>
+    </w:lvl>
+    <w:lvl w:ilvl="6" w:tplc="40090001" w:tentative="1">
+      <w:start w:val="1"/>
+      <w:numFmt w:val="bullet"/>
+      <w:lvlText w:val=""/>
+      <w:lvlJc w:val="left"/>
+      <w:pPr>
+        <w:ind w:left="5040" w:hanging="360"/>
+      </w:pPr>
+      <w:rPr>
+        <w:rFonts w:ascii="Symbol" w:hAnsi="Symbol" w:hint="default"/>
+      </w:rPr>
+    </w:lvl>
+    <w:lvl w:ilvl="7" w:tplc="40090003" w:tentative="1">
+      <w:start w:val="1"/>
+      <w:numFmt w:val="bullet"/>
+      <w:lvlText w:val="o"/>
+      <w:lvlJc w:val="left"/>
+      <w:pPr>
+        <w:ind w:left="5760" w:hanging="360"/>
+      </w:pPr>
+      <w:rPr>
+        <w:rFonts w:ascii="Courier New" w:hAnsi="Courier New" w:cs="Courier New" w:hint="default"/>
+      </w:rPr>
+    </w:lvl>
+    <w:lvl w:ilvl="8" w:tplc="40090005" w:tentative="1">
+      <w:start w:val="1"/>
+      <w:numFmt w:val="bullet"/>
+      <w:lvlText w:val=""/>
+      <w:lvlJc w:val="left"/>
+      <w:pPr>
+        <w:ind w:left="6480" w:hanging="360"/>
+      </w:pPr>
+      <w:rPr>
+        <w:rFonts w:ascii="Wingdings" w:hAnsi="Wingdings" w:hint="default"/>
+      </w:rPr>
+    </w:lvl>
+  </w:abstractNum>
   <w:num w:numId="1" w16cid:durableId="1209604883">
-    <w:abstractNumId w:val="1"/>
+    <w:abstractNumId w:val="2"/>
   </w:num>
   <w:num w:numId="2" w16cid:durableId="1188518814">
     <w:abstractNumId w:val="0"/>
+  </w:num>
+  <w:num w:numId="3" w16cid:durableId="395398802">
+    <w:abstractNumId w:val="1"/>
   </w:num>
 </w:numbering>
 </file>

</xml_diff>

<commit_message>
Add notes for 24/203
</commit_message>
<xml_diff>
--- a/section24_express.js/section24_expressjsNotes.docx
+++ b/section24_express.js/section24_expressjsNotes.docx
@@ -1631,7 +1631,418 @@
       </w:r>
     </w:p>
     <w:p/>
-    <w:p/>
+    <w:p>
+      <w:pPr>
+        <w:rPr>
+          <w:b/>
+          <w:bCs/>
+        </w:rPr>
+      </w:pPr>
+      <w:r>
+        <w:rPr>
+          <w:b/>
+          <w:bCs/>
+        </w:rPr>
+        <w:t>203. Postman</w:t>
+      </w:r>
+    </w:p>
+    <w:p>
+      <w:pPr>
+        <w:pStyle w:val="ListParagraph"/>
+        <w:numPr>
+          <w:ilvl w:val="0"/>
+          <w:numId w:val="4"/>
+        </w:numPr>
+      </w:pPr>
+      <w:r>
+        <w:t xml:space="preserve">HTTP response status codes. Refer: </w:t>
+      </w:r>
+      <w:hyperlink r:id="rId7" w:history="1">
+        <w:r>
+          <w:rPr>
+            <w:rStyle w:val="Hyperlink"/>
+          </w:rPr>
+          <w:t>https://developer.mozilla.org/en-US/docs/Web/HTTP/Status</w:t>
+        </w:r>
+      </w:hyperlink>
+    </w:p>
+    <w:p>
+      <w:pPr>
+        <w:pStyle w:val="ListParagraph"/>
+        <w:numPr>
+          <w:ilvl w:val="1"/>
+          <w:numId w:val="4"/>
+        </w:numPr>
+      </w:pPr>
+      <w:r>
+        <w:t xml:space="preserve">Informational responses (100 - 199) </w:t>
+      </w:r>
+    </w:p>
+    <w:p>
+      <w:pPr>
+        <w:pStyle w:val="ListParagraph"/>
+        <w:numPr>
+          <w:ilvl w:val="1"/>
+          <w:numId w:val="4"/>
+        </w:numPr>
+      </w:pPr>
+      <w:r>
+        <w:t>Successful responses (200 - 299)</w:t>
+      </w:r>
+    </w:p>
+    <w:p>
+      <w:pPr>
+        <w:pStyle w:val="ListParagraph"/>
+        <w:numPr>
+          <w:ilvl w:val="2"/>
+          <w:numId w:val="4"/>
+        </w:numPr>
+      </w:pPr>
+      <w:r>
+        <w:t>200: OK</w:t>
+      </w:r>
+    </w:p>
+    <w:p>
+      <w:pPr>
+        <w:pStyle w:val="ListParagraph"/>
+        <w:numPr>
+          <w:ilvl w:val="2"/>
+          <w:numId w:val="4"/>
+        </w:numPr>
+      </w:pPr>
+      <w:r>
+        <w:t>201: Created</w:t>
+      </w:r>
+    </w:p>
+    <w:p>
+      <w:pPr>
+        <w:pStyle w:val="ListParagraph"/>
+        <w:numPr>
+          <w:ilvl w:val="1"/>
+          <w:numId w:val="4"/>
+        </w:numPr>
+      </w:pPr>
+      <w:r>
+        <w:t>Redirection messages (300 - 399)</w:t>
+      </w:r>
+    </w:p>
+    <w:p>
+      <w:pPr>
+        <w:pStyle w:val="ListParagraph"/>
+        <w:numPr>
+          <w:ilvl w:val="2"/>
+          <w:numId w:val="4"/>
+        </w:numPr>
+      </w:pPr>
+      <w:r>
+        <w:t>301: URL changed permanently, Redirection</w:t>
+      </w:r>
+    </w:p>
+    <w:p>
+      <w:pPr>
+        <w:pStyle w:val="ListParagraph"/>
+        <w:numPr>
+          <w:ilvl w:val="1"/>
+          <w:numId w:val="4"/>
+        </w:numPr>
+      </w:pPr>
+      <w:r>
+        <w:t>Client error responses (400 - 499)</w:t>
+      </w:r>
+    </w:p>
+    <w:p>
+      <w:pPr>
+        <w:pStyle w:val="ListParagraph"/>
+        <w:numPr>
+          <w:ilvl w:val="2"/>
+          <w:numId w:val="4"/>
+        </w:numPr>
+      </w:pPr>
+      <w:r>
+        <w:t>404: Resource not found</w:t>
+      </w:r>
+    </w:p>
+    <w:p>
+      <w:pPr>
+        <w:pStyle w:val="ListParagraph"/>
+        <w:numPr>
+          <w:ilvl w:val="1"/>
+          <w:numId w:val="4"/>
+        </w:numPr>
+      </w:pPr>
+      <w:r>
+        <w:t>Server error responses (500 - 599)</w:t>
+      </w:r>
+    </w:p>
+    <w:p>
+      <w:pPr>
+        <w:pStyle w:val="ListParagraph"/>
+        <w:numPr>
+          <w:ilvl w:val="0"/>
+          <w:numId w:val="4"/>
+        </w:numPr>
+      </w:pPr>
+      <w:r>
+        <w:t>Use postman to develop backend without frontend.</w:t>
+      </w:r>
+    </w:p>
+    <w:p>
+      <w:pPr>
+        <w:ind w:left="360"/>
+      </w:pPr>
+      <w:r>
+        <w:t>GET:</w:t>
+      </w:r>
+    </w:p>
+    <w:p>
+      <w:pPr>
+        <w:ind w:left="360"/>
+      </w:pPr>
+      <w:r>
+        <w:drawing>
+          <wp:inline distT="0" distB="0" distL="0" distR="0" wp14:anchorId="0957E1BC" wp14:editId="69D2DFED">
+            <wp:extent cx="5731510" cy="2438400"/>
+            <wp:effectExtent l="0" t="0" r="2540" b="0"/>
+            <wp:docPr id="2024494194" name="Picture 1"/>
+            <wp:cNvGraphicFramePr>
+              <a:graphicFrameLocks xmlns:a="http://schemas.openxmlformats.org/drawingml/2006/main" noChangeAspect="1"/>
+            </wp:cNvGraphicFramePr>
+            <a:graphic xmlns:a="http://schemas.openxmlformats.org/drawingml/2006/main">
+              <a:graphicData uri="http://schemas.openxmlformats.org/drawingml/2006/picture">
+                <pic:pic xmlns:pic="http://schemas.openxmlformats.org/drawingml/2006/picture">
+                  <pic:nvPicPr>
+                    <pic:cNvPr id="2024494194" name=""/>
+                    <pic:cNvPicPr/>
+                  </pic:nvPicPr>
+                  <pic:blipFill>
+                    <a:blip r:embed="rId8"/>
+                    <a:stretch>
+                      <a:fillRect/>
+                    </a:stretch>
+                  </pic:blipFill>
+                  <pic:spPr>
+                    <a:xfrm>
+                      <a:off x="0" y="0"/>
+                      <a:ext cx="5731510" cy="2438400"/>
+                    </a:xfrm>
+                    <a:prstGeom prst="rect">
+                      <a:avLst/>
+                    </a:prstGeom>
+                  </pic:spPr>
+                </pic:pic>
+              </a:graphicData>
+            </a:graphic>
+          </wp:inline>
+        </w:drawing>
+      </w:r>
+    </w:p>
+    <w:p>
+      <w:pPr>
+        <w:ind w:left="360"/>
+      </w:pPr>
+      <w:r>
+        <w:t>POST:</w:t>
+      </w:r>
+    </w:p>
+    <w:p>
+      <w:pPr>
+        <w:ind w:left="360"/>
+      </w:pPr>
+    </w:p>
+    <w:p>
+      <w:pPr>
+        <w:ind w:left="360"/>
+      </w:pPr>
+      <w:r>
+        <w:lastRenderedPageBreak/>
+        <w:drawing>
+          <wp:inline distT="0" distB="0" distL="0" distR="0" wp14:anchorId="0691D02D" wp14:editId="3EB94C7B">
+            <wp:extent cx="5731510" cy="2332355"/>
+            <wp:effectExtent l="0" t="0" r="2540" b="0"/>
+            <wp:docPr id="20486093" name="Picture 1"/>
+            <wp:cNvGraphicFramePr>
+              <a:graphicFrameLocks xmlns:a="http://schemas.openxmlformats.org/drawingml/2006/main" noChangeAspect="1"/>
+            </wp:cNvGraphicFramePr>
+            <a:graphic xmlns:a="http://schemas.openxmlformats.org/drawingml/2006/main">
+              <a:graphicData uri="http://schemas.openxmlformats.org/drawingml/2006/picture">
+                <pic:pic xmlns:pic="http://schemas.openxmlformats.org/drawingml/2006/picture">
+                  <pic:nvPicPr>
+                    <pic:cNvPr id="20486093" name=""/>
+                    <pic:cNvPicPr/>
+                  </pic:nvPicPr>
+                  <pic:blipFill>
+                    <a:blip r:embed="rId9"/>
+                    <a:stretch>
+                      <a:fillRect/>
+                    </a:stretch>
+                  </pic:blipFill>
+                  <pic:spPr>
+                    <a:xfrm>
+                      <a:off x="0" y="0"/>
+                      <a:ext cx="5731510" cy="2332355"/>
+                    </a:xfrm>
+                    <a:prstGeom prst="rect">
+                      <a:avLst/>
+                    </a:prstGeom>
+                  </pic:spPr>
+                </pic:pic>
+              </a:graphicData>
+            </a:graphic>
+          </wp:inline>
+        </w:drawing>
+      </w:r>
+    </w:p>
+    <w:p>
+      <w:pPr>
+        <w:ind w:left="360"/>
+      </w:pPr>
+      <w:r>
+        <w:t>PUT:</w:t>
+      </w:r>
+    </w:p>
+    <w:p>
+      <w:pPr>
+        <w:ind w:left="360"/>
+      </w:pPr>
+      <w:r>
+        <w:drawing>
+          <wp:inline distT="0" distB="0" distL="0" distR="0" wp14:anchorId="3B6B9461" wp14:editId="348AA7E5">
+            <wp:extent cx="5731510" cy="2453005"/>
+            <wp:effectExtent l="0" t="0" r="2540" b="4445"/>
+            <wp:docPr id="297267162" name="Picture 1"/>
+            <wp:cNvGraphicFramePr>
+              <a:graphicFrameLocks xmlns:a="http://schemas.openxmlformats.org/drawingml/2006/main" noChangeAspect="1"/>
+            </wp:cNvGraphicFramePr>
+            <a:graphic xmlns:a="http://schemas.openxmlformats.org/drawingml/2006/main">
+              <a:graphicData uri="http://schemas.openxmlformats.org/drawingml/2006/picture">
+                <pic:pic xmlns:pic="http://schemas.openxmlformats.org/drawingml/2006/picture">
+                  <pic:nvPicPr>
+                    <pic:cNvPr id="297267162" name=""/>
+                    <pic:cNvPicPr/>
+                  </pic:nvPicPr>
+                  <pic:blipFill>
+                    <a:blip r:embed="rId10"/>
+                    <a:stretch>
+                      <a:fillRect/>
+                    </a:stretch>
+                  </pic:blipFill>
+                  <pic:spPr>
+                    <a:xfrm>
+                      <a:off x="0" y="0"/>
+                      <a:ext cx="5731510" cy="2453005"/>
+                    </a:xfrm>
+                    <a:prstGeom prst="rect">
+                      <a:avLst/>
+                    </a:prstGeom>
+                  </pic:spPr>
+                </pic:pic>
+              </a:graphicData>
+            </a:graphic>
+          </wp:inline>
+        </w:drawing>
+      </w:r>
+    </w:p>
+    <w:p>
+      <w:pPr>
+        <w:ind w:left="360"/>
+      </w:pPr>
+      <w:r>
+        <w:t>PATCH:</w:t>
+      </w:r>
+    </w:p>
+    <w:p>
+      <w:pPr>
+        <w:ind w:left="360"/>
+      </w:pPr>
+      <w:r>
+        <w:drawing>
+          <wp:inline distT="0" distB="0" distL="0" distR="0" wp14:anchorId="1B5591FD" wp14:editId="2A83A7F1">
+            <wp:extent cx="5731510" cy="2378710"/>
+            <wp:effectExtent l="0" t="0" r="2540" b="2540"/>
+            <wp:docPr id="1260743429" name="Picture 1"/>
+            <wp:cNvGraphicFramePr>
+              <a:graphicFrameLocks xmlns:a="http://schemas.openxmlformats.org/drawingml/2006/main" noChangeAspect="1"/>
+            </wp:cNvGraphicFramePr>
+            <a:graphic xmlns:a="http://schemas.openxmlformats.org/drawingml/2006/main">
+              <a:graphicData uri="http://schemas.openxmlformats.org/drawingml/2006/picture">
+                <pic:pic xmlns:pic="http://schemas.openxmlformats.org/drawingml/2006/picture">
+                  <pic:nvPicPr>
+                    <pic:cNvPr id="1260743429" name=""/>
+                    <pic:cNvPicPr/>
+                  </pic:nvPicPr>
+                  <pic:blipFill>
+                    <a:blip r:embed="rId11"/>
+                    <a:stretch>
+                      <a:fillRect/>
+                    </a:stretch>
+                  </pic:blipFill>
+                  <pic:spPr>
+                    <a:xfrm>
+                      <a:off x="0" y="0"/>
+                      <a:ext cx="5731510" cy="2378710"/>
+                    </a:xfrm>
+                    <a:prstGeom prst="rect">
+                      <a:avLst/>
+                    </a:prstGeom>
+                  </pic:spPr>
+                </pic:pic>
+              </a:graphicData>
+            </a:graphic>
+          </wp:inline>
+        </w:drawing>
+      </w:r>
+    </w:p>
+    <w:p>
+      <w:pPr>
+        <w:ind w:left="360"/>
+      </w:pPr>
+      <w:r>
+        <w:t>DELETE:</w:t>
+      </w:r>
+    </w:p>
+    <w:p>
+      <w:pPr>
+        <w:ind w:left="360"/>
+      </w:pPr>
+      <w:r>
+        <w:lastRenderedPageBreak/>
+        <w:drawing>
+          <wp:inline distT="0" distB="0" distL="0" distR="0" wp14:anchorId="1E0C0F4B" wp14:editId="30756203">
+            <wp:extent cx="5731510" cy="2479675"/>
+            <wp:effectExtent l="0" t="0" r="2540" b="0"/>
+            <wp:docPr id="1219046331" name="Picture 1"/>
+            <wp:cNvGraphicFramePr>
+              <a:graphicFrameLocks xmlns:a="http://schemas.openxmlformats.org/drawingml/2006/main" noChangeAspect="1"/>
+            </wp:cNvGraphicFramePr>
+            <a:graphic xmlns:a="http://schemas.openxmlformats.org/drawingml/2006/main">
+              <a:graphicData uri="http://schemas.openxmlformats.org/drawingml/2006/picture">
+                <pic:pic xmlns:pic="http://schemas.openxmlformats.org/drawingml/2006/picture">
+                  <pic:nvPicPr>
+                    <pic:cNvPr id="1219046331" name=""/>
+                    <pic:cNvPicPr/>
+                  </pic:nvPicPr>
+                  <pic:blipFill>
+                    <a:blip r:embed="rId12"/>
+                    <a:stretch>
+                      <a:fillRect/>
+                    </a:stretch>
+                  </pic:blipFill>
+                  <pic:spPr>
+                    <a:xfrm>
+                      <a:off x="0" y="0"/>
+                      <a:ext cx="5731510" cy="2479675"/>
+                    </a:xfrm>
+                    <a:prstGeom prst="rect">
+                      <a:avLst/>
+                    </a:prstGeom>
+                  </pic:spPr>
+                </pic:pic>
+              </a:graphicData>
+            </a:graphic>
+          </wp:inline>
+        </w:drawing>
+      </w:r>
+    </w:p>
     <w:sectPr>
       <w:pgSz w:w="11906" w:h="16838"/>
       <w:pgMar w:top="1440" w:right="1440" w:bottom="1440" w:left="1440" w:header="708" w:footer="708" w:gutter="0"/>
@@ -1921,6 +2332,116 @@
     </w:lvl>
   </w:abstractNum>
   <w:abstractNum w:abstractNumId="2" w15:restartNumberingAfterBreak="0">
+    <w:nsid w:val="372411F5"/>
+    <w:multiLevelType w:val="hybridMultilevel"/>
+    <w:tmpl w:val="526A2798"/>
+    <w:lvl w:ilvl="0" w:tplc="40090001">
+      <w:start w:val="1"/>
+      <w:numFmt w:val="bullet"/>
+      <w:lvlText w:val=""/>
+      <w:lvlJc w:val="left"/>
+      <w:pPr>
+        <w:ind w:left="720" w:hanging="360"/>
+      </w:pPr>
+      <w:rPr>
+        <w:rFonts w:ascii="Symbol" w:hAnsi="Symbol" w:hint="default"/>
+      </w:rPr>
+    </w:lvl>
+    <w:lvl w:ilvl="1" w:tplc="4009000F">
+      <w:start w:val="1"/>
+      <w:numFmt w:val="decimal"/>
+      <w:lvlText w:val="%2."/>
+      <w:lvlJc w:val="left"/>
+      <w:pPr>
+        <w:ind w:left="1440" w:hanging="360"/>
+      </w:pPr>
+    </w:lvl>
+    <w:lvl w:ilvl="2" w:tplc="40090005">
+      <w:start w:val="1"/>
+      <w:numFmt w:val="bullet"/>
+      <w:lvlText w:val=""/>
+      <w:lvlJc w:val="left"/>
+      <w:pPr>
+        <w:ind w:left="2160" w:hanging="360"/>
+      </w:pPr>
+      <w:rPr>
+        <w:rFonts w:ascii="Wingdings" w:hAnsi="Wingdings" w:hint="default"/>
+      </w:rPr>
+    </w:lvl>
+    <w:lvl w:ilvl="3" w:tplc="40090001" w:tentative="1">
+      <w:start w:val="1"/>
+      <w:numFmt w:val="bullet"/>
+      <w:lvlText w:val=""/>
+      <w:lvlJc w:val="left"/>
+      <w:pPr>
+        <w:ind w:left="2880" w:hanging="360"/>
+      </w:pPr>
+      <w:rPr>
+        <w:rFonts w:ascii="Symbol" w:hAnsi="Symbol" w:hint="default"/>
+      </w:rPr>
+    </w:lvl>
+    <w:lvl w:ilvl="4" w:tplc="40090003" w:tentative="1">
+      <w:start w:val="1"/>
+      <w:numFmt w:val="bullet"/>
+      <w:lvlText w:val="o"/>
+      <w:lvlJc w:val="left"/>
+      <w:pPr>
+        <w:ind w:left="3600" w:hanging="360"/>
+      </w:pPr>
+      <w:rPr>
+        <w:rFonts w:ascii="Courier New" w:hAnsi="Courier New" w:cs="Courier New" w:hint="default"/>
+      </w:rPr>
+    </w:lvl>
+    <w:lvl w:ilvl="5" w:tplc="40090005" w:tentative="1">
+      <w:start w:val="1"/>
+      <w:numFmt w:val="bullet"/>
+      <w:lvlText w:val=""/>
+      <w:lvlJc w:val="left"/>
+      <w:pPr>
+        <w:ind w:left="4320" w:hanging="360"/>
+      </w:pPr>
+      <w:rPr>
+        <w:rFonts w:ascii="Wingdings" w:hAnsi="Wingdings" w:hint="default"/>
+      </w:rPr>
+    </w:lvl>
+    <w:lvl w:ilvl="6" w:tplc="40090001" w:tentative="1">
+      <w:start w:val="1"/>
+      <w:numFmt w:val="bullet"/>
+      <w:lvlText w:val=""/>
+      <w:lvlJc w:val="left"/>
+      <w:pPr>
+        <w:ind w:left="5040" w:hanging="360"/>
+      </w:pPr>
+      <w:rPr>
+        <w:rFonts w:ascii="Symbol" w:hAnsi="Symbol" w:hint="default"/>
+      </w:rPr>
+    </w:lvl>
+    <w:lvl w:ilvl="7" w:tplc="40090003" w:tentative="1">
+      <w:start w:val="1"/>
+      <w:numFmt w:val="bullet"/>
+      <w:lvlText w:val="o"/>
+      <w:lvlJc w:val="left"/>
+      <w:pPr>
+        <w:ind w:left="5760" w:hanging="360"/>
+      </w:pPr>
+      <w:rPr>
+        <w:rFonts w:ascii="Courier New" w:hAnsi="Courier New" w:cs="Courier New" w:hint="default"/>
+      </w:rPr>
+    </w:lvl>
+    <w:lvl w:ilvl="8" w:tplc="40090005" w:tentative="1">
+      <w:start w:val="1"/>
+      <w:numFmt w:val="bullet"/>
+      <w:lvlText w:val=""/>
+      <w:lvlJc w:val="left"/>
+      <w:pPr>
+        <w:ind w:left="6480" w:hanging="360"/>
+      </w:pPr>
+      <w:rPr>
+        <w:rFonts w:ascii="Wingdings" w:hAnsi="Wingdings" w:hint="default"/>
+      </w:rPr>
+    </w:lvl>
+  </w:abstractNum>
+  <w:abstractNum w:abstractNumId="3" w15:restartNumberingAfterBreak="0">
     <w:nsid w:val="4CF81348"/>
     <w:multiLevelType w:val="hybridMultilevel"/>
     <w:tmpl w:val="CAAA94D8"/>
@@ -2034,13 +2555,16 @@
     </w:lvl>
   </w:abstractNum>
   <w:num w:numId="1" w16cid:durableId="1209604883">
-    <w:abstractNumId w:val="2"/>
+    <w:abstractNumId w:val="3"/>
   </w:num>
   <w:num w:numId="2" w16cid:durableId="1188518814">
     <w:abstractNumId w:val="0"/>
   </w:num>
   <w:num w:numId="3" w16cid:durableId="395398802">
     <w:abstractNumId w:val="1"/>
+  </w:num>
+  <w:num w:numId="4" w16cid:durableId="1237058167">
+    <w:abstractNumId w:val="2"/>
   </w:num>
 </w:numbering>
 </file>
@@ -2449,6 +2973,7 @@
   <w:style w:type="character" w:default="1" w:styleId="DefaultParagraphFont">
     <w:name w:val="Default Paragraph Font"/>
     <w:uiPriority w:val="1"/>
+    <w:semiHidden/>
     <w:unhideWhenUsed/>
   </w:style>
   <w:style w:type="table" w:default="1" w:styleId="TableNormal">
@@ -2526,6 +3051,41 @@
     <w:link w:val="Footer"/>
     <w:uiPriority w:val="99"/>
     <w:rsid w:val="00326128"/>
+  </w:style>
+  <w:style w:type="character" w:styleId="Hyperlink">
+    <w:name w:val="Hyperlink"/>
+    <w:basedOn w:val="DefaultParagraphFont"/>
+    <w:uiPriority w:val="99"/>
+    <w:unhideWhenUsed/>
+    <w:rsid w:val="002D42FB"/>
+    <w:rPr>
+      <w:color w:val="0563C1" w:themeColor="hyperlink"/>
+      <w:u w:val="single"/>
+    </w:rPr>
+  </w:style>
+  <w:style w:type="character" w:styleId="UnresolvedMention">
+    <w:name w:val="Unresolved Mention"/>
+    <w:basedOn w:val="DefaultParagraphFont"/>
+    <w:uiPriority w:val="99"/>
+    <w:semiHidden/>
+    <w:unhideWhenUsed/>
+    <w:rsid w:val="002D42FB"/>
+    <w:rPr>
+      <w:color w:val="605E5C"/>
+      <w:shd w:val="clear" w:color="auto" w:fill="E1DFDD"/>
+    </w:rPr>
+  </w:style>
+  <w:style w:type="character" w:styleId="FollowedHyperlink">
+    <w:name w:val="FollowedHyperlink"/>
+    <w:basedOn w:val="DefaultParagraphFont"/>
+    <w:uiPriority w:val="99"/>
+    <w:semiHidden/>
+    <w:unhideWhenUsed/>
+    <w:rsid w:val="002D42FB"/>
+    <w:rPr>
+      <w:color w:val="954F72" w:themeColor="followedHyperlink"/>
+      <w:u w:val="single"/>
+    </w:rPr>
   </w:style>
 </w:styles>
 </file>

</xml_diff>

<commit_message>
Add notes for 24/205
</commit_message>
<xml_diff>
--- a/section24_express.js/section24_expressjsNotes.docx
+++ b/section24_express.js/section24_expressjsNotes.docx
@@ -538,18 +538,18 @@
         <w:shd w:val="clear" w:color="auto" w:fill="1F1F1F"/>
         <w:spacing w:after="0" w:line="360" w:lineRule="atLeast"/>
         <w:rPr>
-          <w:rFonts w:ascii="Times New Roman" w:eastAsia="Times New Roman" w:hAnsi="Times New Roman" w:cs="Times New Roman"/>
-          <w:color w:val="CCCCCC"/>
-          <w:kern w:val="0"/>
-          <w:sz w:val="28"/>
-          <w:szCs w:val="28"/>
-          <w:lang w:eastAsia="en-IN"/>
-          <w14:ligatures w14:val="none"/>
-        </w:rPr>
-      </w:pPr>
-      <w:r>
-        <w:rPr>
-          <w:rFonts w:ascii="Times New Roman" w:eastAsia="Times New Roman" w:hAnsi="Times New Roman" w:cs="Times New Roman"/>
+          <w:rFonts w:ascii="Consolas" w:eastAsia="Times New Roman" w:hAnsi="Consolas" w:cs="Times New Roman"/>
+          <w:color w:val="CCCCCC"/>
+          <w:kern w:val="0"/>
+          <w:sz w:val="28"/>
+          <w:szCs w:val="28"/>
+          <w:lang w:eastAsia="en-IN"/>
+          <w14:ligatures w14:val="none"/>
+        </w:rPr>
+      </w:pPr>
+      <w:r>
+        <w:rPr>
+          <w:rFonts w:ascii="Consolas" w:eastAsia="Times New Roman" w:hAnsi="Consolas" w:cs="Times New Roman"/>
           <w:color w:val="C586C0"/>
           <w:kern w:val="0"/>
           <w:sz w:val="28"/>
@@ -561,7 +561,7 @@
       </w:r>
       <w:r>
         <w:rPr>
-          <w:rFonts w:ascii="Times New Roman" w:eastAsia="Times New Roman" w:hAnsi="Times New Roman" w:cs="Times New Roman"/>
+          <w:rFonts w:ascii="Consolas" w:eastAsia="Times New Roman" w:hAnsi="Consolas" w:cs="Times New Roman"/>
           <w:color w:val="CCCCCC"/>
           <w:kern w:val="0"/>
           <w:sz w:val="28"/>
@@ -573,7 +573,7 @@
       </w:r>
       <w:r>
         <w:rPr>
-          <w:rFonts w:ascii="Times New Roman" w:eastAsia="Times New Roman" w:hAnsi="Times New Roman" w:cs="Times New Roman"/>
+          <w:rFonts w:ascii="Consolas" w:eastAsia="Times New Roman" w:hAnsi="Consolas" w:cs="Times New Roman"/>
           <w:color w:val="9CDCFE"/>
           <w:kern w:val="0"/>
           <w:sz w:val="28"/>
@@ -585,7 +585,7 @@
       </w:r>
       <w:r>
         <w:rPr>
-          <w:rFonts w:ascii="Times New Roman" w:eastAsia="Times New Roman" w:hAnsi="Times New Roman" w:cs="Times New Roman"/>
+          <w:rFonts w:ascii="Consolas" w:eastAsia="Times New Roman" w:hAnsi="Consolas" w:cs="Times New Roman"/>
           <w:color w:val="CCCCCC"/>
           <w:kern w:val="0"/>
           <w:sz w:val="28"/>
@@ -597,7 +597,7 @@
       </w:r>
       <w:r>
         <w:rPr>
-          <w:rFonts w:ascii="Times New Roman" w:eastAsia="Times New Roman" w:hAnsi="Times New Roman" w:cs="Times New Roman"/>
+          <w:rFonts w:ascii="Consolas" w:eastAsia="Times New Roman" w:hAnsi="Consolas" w:cs="Times New Roman"/>
           <w:color w:val="C586C0"/>
           <w:kern w:val="0"/>
           <w:sz w:val="28"/>
@@ -609,7 +609,7 @@
       </w:r>
       <w:r>
         <w:rPr>
-          <w:rFonts w:ascii="Times New Roman" w:eastAsia="Times New Roman" w:hAnsi="Times New Roman" w:cs="Times New Roman"/>
+          <w:rFonts w:ascii="Consolas" w:eastAsia="Times New Roman" w:hAnsi="Consolas" w:cs="Times New Roman"/>
           <w:color w:val="CCCCCC"/>
           <w:kern w:val="0"/>
           <w:sz w:val="28"/>
@@ -621,7 +621,7 @@
       </w:r>
       <w:r>
         <w:rPr>
-          <w:rFonts w:ascii="Times New Roman" w:eastAsia="Times New Roman" w:hAnsi="Times New Roman" w:cs="Times New Roman"/>
+          <w:rFonts w:ascii="Consolas" w:eastAsia="Times New Roman" w:hAnsi="Consolas" w:cs="Times New Roman"/>
           <w:color w:val="CE9178"/>
           <w:kern w:val="0"/>
           <w:sz w:val="28"/>
@@ -633,7 +633,7 @@
       </w:r>
       <w:r>
         <w:rPr>
-          <w:rFonts w:ascii="Times New Roman" w:eastAsia="Times New Roman" w:hAnsi="Times New Roman" w:cs="Times New Roman"/>
+          <w:rFonts w:ascii="Consolas" w:eastAsia="Times New Roman" w:hAnsi="Consolas" w:cs="Times New Roman"/>
           <w:color w:val="CCCCCC"/>
           <w:kern w:val="0"/>
           <w:sz w:val="28"/>
@@ -649,7 +649,7 @@
         <w:shd w:val="clear" w:color="auto" w:fill="1F1F1F"/>
         <w:spacing w:after="0" w:line="360" w:lineRule="atLeast"/>
         <w:rPr>
-          <w:rFonts w:ascii="Times New Roman" w:eastAsia="Times New Roman" w:hAnsi="Times New Roman" w:cs="Times New Roman"/>
+          <w:rFonts w:ascii="Consolas" w:eastAsia="Times New Roman" w:hAnsi="Consolas" w:cs="Times New Roman"/>
           <w:color w:val="CCCCCC"/>
           <w:kern w:val="0"/>
           <w:sz w:val="28"/>
@@ -661,7 +661,7 @@
       <w:proofErr w:type="spellStart"/>
       <w:r>
         <w:rPr>
-          <w:rFonts w:ascii="Times New Roman" w:eastAsia="Times New Roman" w:hAnsi="Times New Roman" w:cs="Times New Roman"/>
+          <w:rFonts w:ascii="Consolas" w:eastAsia="Times New Roman" w:hAnsi="Consolas" w:cs="Times New Roman"/>
           <w:color w:val="569CD6"/>
           <w:kern w:val="0"/>
           <w:sz w:val="28"/>
@@ -674,7 +674,7 @@
       <w:proofErr w:type="spellEnd"/>
       <w:r>
         <w:rPr>
-          <w:rFonts w:ascii="Times New Roman" w:eastAsia="Times New Roman" w:hAnsi="Times New Roman" w:cs="Times New Roman"/>
+          <w:rFonts w:ascii="Consolas" w:eastAsia="Times New Roman" w:hAnsi="Consolas" w:cs="Times New Roman"/>
           <w:color w:val="CCCCCC"/>
           <w:kern w:val="0"/>
           <w:sz w:val="28"/>
@@ -686,7 +686,7 @@
       </w:r>
       <w:r>
         <w:rPr>
-          <w:rFonts w:ascii="Times New Roman" w:eastAsia="Times New Roman" w:hAnsi="Times New Roman" w:cs="Times New Roman"/>
+          <w:rFonts w:ascii="Consolas" w:eastAsia="Times New Roman" w:hAnsi="Consolas" w:cs="Times New Roman"/>
           <w:color w:val="4FC1FF"/>
           <w:kern w:val="0"/>
           <w:sz w:val="28"/>
@@ -698,7 +698,7 @@
       </w:r>
       <w:r>
         <w:rPr>
-          <w:rFonts w:ascii="Times New Roman" w:eastAsia="Times New Roman" w:hAnsi="Times New Roman" w:cs="Times New Roman"/>
+          <w:rFonts w:ascii="Consolas" w:eastAsia="Times New Roman" w:hAnsi="Consolas" w:cs="Times New Roman"/>
           <w:color w:val="CCCCCC"/>
           <w:kern w:val="0"/>
           <w:sz w:val="28"/>
@@ -710,7 +710,7 @@
       </w:r>
       <w:r>
         <w:rPr>
-          <w:rFonts w:ascii="Times New Roman" w:eastAsia="Times New Roman" w:hAnsi="Times New Roman" w:cs="Times New Roman"/>
+          <w:rFonts w:ascii="Consolas" w:eastAsia="Times New Roman" w:hAnsi="Consolas" w:cs="Times New Roman"/>
           <w:color w:val="D4D4D4"/>
           <w:kern w:val="0"/>
           <w:sz w:val="28"/>
@@ -722,7 +722,7 @@
       </w:r>
       <w:r>
         <w:rPr>
-          <w:rFonts w:ascii="Times New Roman" w:eastAsia="Times New Roman" w:hAnsi="Times New Roman" w:cs="Times New Roman"/>
+          <w:rFonts w:ascii="Consolas" w:eastAsia="Times New Roman" w:hAnsi="Consolas" w:cs="Times New Roman"/>
           <w:color w:val="CCCCCC"/>
           <w:kern w:val="0"/>
           <w:sz w:val="28"/>
@@ -734,7 +734,7 @@
       </w:r>
       <w:r>
         <w:rPr>
-          <w:rFonts w:ascii="Times New Roman" w:eastAsia="Times New Roman" w:hAnsi="Times New Roman" w:cs="Times New Roman"/>
+          <w:rFonts w:ascii="Consolas" w:eastAsia="Times New Roman" w:hAnsi="Consolas" w:cs="Times New Roman"/>
           <w:color w:val="DCDCAA"/>
           <w:kern w:val="0"/>
           <w:sz w:val="28"/>
@@ -746,7 +746,7 @@
       </w:r>
       <w:r>
         <w:rPr>
-          <w:rFonts w:ascii="Times New Roman" w:eastAsia="Times New Roman" w:hAnsi="Times New Roman" w:cs="Times New Roman"/>
+          <w:rFonts w:ascii="Consolas" w:eastAsia="Times New Roman" w:hAnsi="Consolas" w:cs="Times New Roman"/>
           <w:color w:val="CCCCCC"/>
           <w:kern w:val="0"/>
           <w:sz w:val="28"/>
@@ -762,7 +762,7 @@
         <w:shd w:val="clear" w:color="auto" w:fill="1F1F1F"/>
         <w:spacing w:after="0" w:line="360" w:lineRule="atLeast"/>
         <w:rPr>
-          <w:rFonts w:ascii="Times New Roman" w:eastAsia="Times New Roman" w:hAnsi="Times New Roman" w:cs="Times New Roman"/>
+          <w:rFonts w:ascii="Consolas" w:eastAsia="Times New Roman" w:hAnsi="Consolas" w:cs="Times New Roman"/>
           <w:color w:val="CCCCCC"/>
           <w:kern w:val="0"/>
           <w:sz w:val="28"/>
@@ -774,7 +774,7 @@
       <w:proofErr w:type="spellStart"/>
       <w:r>
         <w:rPr>
-          <w:rFonts w:ascii="Times New Roman" w:eastAsia="Times New Roman" w:hAnsi="Times New Roman" w:cs="Times New Roman"/>
+          <w:rFonts w:ascii="Consolas" w:eastAsia="Times New Roman" w:hAnsi="Consolas" w:cs="Times New Roman"/>
           <w:color w:val="569CD6"/>
           <w:kern w:val="0"/>
           <w:sz w:val="28"/>
@@ -787,7 +787,7 @@
       <w:proofErr w:type="spellEnd"/>
       <w:r>
         <w:rPr>
-          <w:rFonts w:ascii="Times New Roman" w:eastAsia="Times New Roman" w:hAnsi="Times New Roman" w:cs="Times New Roman"/>
+          <w:rFonts w:ascii="Consolas" w:eastAsia="Times New Roman" w:hAnsi="Consolas" w:cs="Times New Roman"/>
           <w:color w:val="CCCCCC"/>
           <w:kern w:val="0"/>
           <w:sz w:val="28"/>
@@ -799,7 +799,7 @@
       </w:r>
       <w:r>
         <w:rPr>
-          <w:rFonts w:ascii="Times New Roman" w:eastAsia="Times New Roman" w:hAnsi="Times New Roman" w:cs="Times New Roman"/>
+          <w:rFonts w:ascii="Consolas" w:eastAsia="Times New Roman" w:hAnsi="Consolas" w:cs="Times New Roman"/>
           <w:color w:val="4FC1FF"/>
           <w:kern w:val="0"/>
           <w:sz w:val="28"/>
@@ -811,7 +811,7 @@
       </w:r>
       <w:r>
         <w:rPr>
-          <w:rFonts w:ascii="Times New Roman" w:eastAsia="Times New Roman" w:hAnsi="Times New Roman" w:cs="Times New Roman"/>
+          <w:rFonts w:ascii="Consolas" w:eastAsia="Times New Roman" w:hAnsi="Consolas" w:cs="Times New Roman"/>
           <w:color w:val="CCCCCC"/>
           <w:kern w:val="0"/>
           <w:sz w:val="28"/>
@@ -823,7 +823,7 @@
       </w:r>
       <w:r>
         <w:rPr>
-          <w:rFonts w:ascii="Times New Roman" w:eastAsia="Times New Roman" w:hAnsi="Times New Roman" w:cs="Times New Roman"/>
+          <w:rFonts w:ascii="Consolas" w:eastAsia="Times New Roman" w:hAnsi="Consolas" w:cs="Times New Roman"/>
           <w:color w:val="D4D4D4"/>
           <w:kern w:val="0"/>
           <w:sz w:val="28"/>
@@ -835,7 +835,7 @@
       </w:r>
       <w:r>
         <w:rPr>
-          <w:rFonts w:ascii="Times New Roman" w:eastAsia="Times New Roman" w:hAnsi="Times New Roman" w:cs="Times New Roman"/>
+          <w:rFonts w:ascii="Consolas" w:eastAsia="Times New Roman" w:hAnsi="Consolas" w:cs="Times New Roman"/>
           <w:color w:val="CCCCCC"/>
           <w:kern w:val="0"/>
           <w:sz w:val="28"/>
@@ -847,7 +847,7 @@
       </w:r>
       <w:r>
         <w:rPr>
-          <w:rFonts w:ascii="Times New Roman" w:eastAsia="Times New Roman" w:hAnsi="Times New Roman" w:cs="Times New Roman"/>
+          <w:rFonts w:ascii="Consolas" w:eastAsia="Times New Roman" w:hAnsi="Consolas" w:cs="Times New Roman"/>
           <w:color w:val="B5CEA8"/>
           <w:kern w:val="0"/>
           <w:sz w:val="28"/>
@@ -859,7 +859,7 @@
       </w:r>
       <w:r>
         <w:rPr>
-          <w:rFonts w:ascii="Times New Roman" w:eastAsia="Times New Roman" w:hAnsi="Times New Roman" w:cs="Times New Roman"/>
+          <w:rFonts w:ascii="Consolas" w:eastAsia="Times New Roman" w:hAnsi="Consolas" w:cs="Times New Roman"/>
           <w:color w:val="CCCCCC"/>
           <w:kern w:val="0"/>
           <w:sz w:val="28"/>
@@ -875,7 +875,7 @@
         <w:shd w:val="clear" w:color="auto" w:fill="1F1F1F"/>
         <w:spacing w:after="0" w:line="360" w:lineRule="atLeast"/>
         <w:rPr>
-          <w:rFonts w:ascii="Times New Roman" w:eastAsia="Times New Roman" w:hAnsi="Times New Roman" w:cs="Times New Roman"/>
+          <w:rFonts w:ascii="Consolas" w:eastAsia="Times New Roman" w:hAnsi="Consolas" w:cs="Times New Roman"/>
           <w:color w:val="CCCCCC"/>
           <w:kern w:val="0"/>
           <w:sz w:val="28"/>
@@ -890,7 +890,7 @@
         <w:shd w:val="clear" w:color="auto" w:fill="1F1F1F"/>
         <w:spacing w:after="0" w:line="360" w:lineRule="atLeast"/>
         <w:rPr>
-          <w:rFonts w:ascii="Times New Roman" w:eastAsia="Times New Roman" w:hAnsi="Times New Roman" w:cs="Times New Roman"/>
+          <w:rFonts w:ascii="Consolas" w:eastAsia="Times New Roman" w:hAnsi="Consolas" w:cs="Times New Roman"/>
           <w:color w:val="CCCCCC"/>
           <w:kern w:val="0"/>
           <w:sz w:val="28"/>
@@ -902,7 +902,7 @@
       <w:proofErr w:type="spellStart"/>
       <w:r>
         <w:rPr>
-          <w:rFonts w:ascii="Times New Roman" w:eastAsia="Times New Roman" w:hAnsi="Times New Roman" w:cs="Times New Roman"/>
+          <w:rFonts w:ascii="Consolas" w:eastAsia="Times New Roman" w:hAnsi="Consolas" w:cs="Times New Roman"/>
           <w:color w:val="4FC1FF"/>
           <w:kern w:val="0"/>
           <w:sz w:val="28"/>
@@ -914,7 +914,7 @@
       </w:r>
       <w:r>
         <w:rPr>
-          <w:rFonts w:ascii="Times New Roman" w:eastAsia="Times New Roman" w:hAnsi="Times New Roman" w:cs="Times New Roman"/>
+          <w:rFonts w:ascii="Consolas" w:eastAsia="Times New Roman" w:hAnsi="Consolas" w:cs="Times New Roman"/>
           <w:color w:val="CCCCCC"/>
           <w:kern w:val="0"/>
           <w:sz w:val="28"/>
@@ -926,7 +926,7 @@
       </w:r>
       <w:r>
         <w:rPr>
-          <w:rFonts w:ascii="Times New Roman" w:eastAsia="Times New Roman" w:hAnsi="Times New Roman" w:cs="Times New Roman"/>
+          <w:rFonts w:ascii="Consolas" w:eastAsia="Times New Roman" w:hAnsi="Consolas" w:cs="Times New Roman"/>
           <w:color w:val="DCDCAA"/>
           <w:kern w:val="0"/>
           <w:sz w:val="28"/>
@@ -939,7 +939,7 @@
       <w:proofErr w:type="spellEnd"/>
       <w:r>
         <w:rPr>
-          <w:rFonts w:ascii="Times New Roman" w:eastAsia="Times New Roman" w:hAnsi="Times New Roman" w:cs="Times New Roman"/>
+          <w:rFonts w:ascii="Consolas" w:eastAsia="Times New Roman" w:hAnsi="Consolas" w:cs="Times New Roman"/>
           <w:color w:val="CCCCCC"/>
           <w:kern w:val="0"/>
           <w:sz w:val="28"/>
@@ -951,7 +951,7 @@
       </w:r>
       <w:r>
         <w:rPr>
-          <w:rFonts w:ascii="Times New Roman" w:eastAsia="Times New Roman" w:hAnsi="Times New Roman" w:cs="Times New Roman"/>
+          <w:rFonts w:ascii="Consolas" w:eastAsia="Times New Roman" w:hAnsi="Consolas" w:cs="Times New Roman"/>
           <w:color w:val="4FC1FF"/>
           <w:kern w:val="0"/>
           <w:sz w:val="28"/>
@@ -963,7 +963,7 @@
       </w:r>
       <w:r>
         <w:rPr>
-          <w:rFonts w:ascii="Times New Roman" w:eastAsia="Times New Roman" w:hAnsi="Times New Roman" w:cs="Times New Roman"/>
+          <w:rFonts w:ascii="Consolas" w:eastAsia="Times New Roman" w:hAnsi="Consolas" w:cs="Times New Roman"/>
           <w:color w:val="CCCCCC"/>
           <w:kern w:val="0"/>
           <w:sz w:val="28"/>
@@ -975,7 +975,7 @@
       </w:r>
       <w:r>
         <w:rPr>
-          <w:rFonts w:ascii="Times New Roman" w:eastAsia="Times New Roman" w:hAnsi="Times New Roman" w:cs="Times New Roman"/>
+          <w:rFonts w:ascii="Consolas" w:eastAsia="Times New Roman" w:hAnsi="Consolas" w:cs="Times New Roman"/>
           <w:color w:val="569CD6"/>
           <w:kern w:val="0"/>
           <w:sz w:val="28"/>
@@ -987,7 +987,7 @@
       </w:r>
       <w:r>
         <w:rPr>
-          <w:rFonts w:ascii="Times New Roman" w:eastAsia="Times New Roman" w:hAnsi="Times New Roman" w:cs="Times New Roman"/>
+          <w:rFonts w:ascii="Consolas" w:eastAsia="Times New Roman" w:hAnsi="Consolas" w:cs="Times New Roman"/>
           <w:color w:val="CCCCCC"/>
           <w:kern w:val="0"/>
           <w:sz w:val="28"/>
@@ -1003,18 +1003,18 @@
         <w:shd w:val="clear" w:color="auto" w:fill="1F1F1F"/>
         <w:spacing w:after="0" w:line="360" w:lineRule="atLeast"/>
         <w:rPr>
-          <w:rFonts w:ascii="Times New Roman" w:eastAsia="Times New Roman" w:hAnsi="Times New Roman" w:cs="Times New Roman"/>
-          <w:color w:val="CCCCCC"/>
-          <w:kern w:val="0"/>
-          <w:sz w:val="28"/>
-          <w:szCs w:val="28"/>
-          <w:lang w:eastAsia="en-IN"/>
-          <w14:ligatures w14:val="none"/>
-        </w:rPr>
-      </w:pPr>
-      <w:r>
-        <w:rPr>
-          <w:rFonts w:ascii="Times New Roman" w:eastAsia="Times New Roman" w:hAnsi="Times New Roman" w:cs="Times New Roman"/>
+          <w:rFonts w:ascii="Consolas" w:eastAsia="Times New Roman" w:hAnsi="Consolas" w:cs="Times New Roman"/>
+          <w:color w:val="CCCCCC"/>
+          <w:kern w:val="0"/>
+          <w:sz w:val="28"/>
+          <w:szCs w:val="28"/>
+          <w:lang w:eastAsia="en-IN"/>
+          <w14:ligatures w14:val="none"/>
+        </w:rPr>
+      </w:pPr>
+      <w:r>
+        <w:rPr>
+          <w:rFonts w:ascii="Consolas" w:eastAsia="Times New Roman" w:hAnsi="Consolas" w:cs="Times New Roman"/>
           <w:color w:val="CCCCCC"/>
           <w:kern w:val="0"/>
           <w:sz w:val="28"/>
@@ -1026,7 +1026,7 @@
       </w:r>
       <w:r>
         <w:rPr>
-          <w:rFonts w:ascii="Times New Roman" w:eastAsia="Times New Roman" w:hAnsi="Times New Roman" w:cs="Times New Roman"/>
+          <w:rFonts w:ascii="Consolas" w:eastAsia="Times New Roman" w:hAnsi="Consolas" w:cs="Times New Roman"/>
           <w:color w:val="9CDCFE"/>
           <w:kern w:val="0"/>
           <w:sz w:val="28"/>
@@ -1038,7 +1038,7 @@
       </w:r>
       <w:r>
         <w:rPr>
-          <w:rFonts w:ascii="Times New Roman" w:eastAsia="Times New Roman" w:hAnsi="Times New Roman" w:cs="Times New Roman"/>
+          <w:rFonts w:ascii="Consolas" w:eastAsia="Times New Roman" w:hAnsi="Consolas" w:cs="Times New Roman"/>
           <w:color w:val="CCCCCC"/>
           <w:kern w:val="0"/>
           <w:sz w:val="28"/>
@@ -1050,7 +1050,7 @@
       </w:r>
       <w:r>
         <w:rPr>
-          <w:rFonts w:ascii="Times New Roman" w:eastAsia="Times New Roman" w:hAnsi="Times New Roman" w:cs="Times New Roman"/>
+          <w:rFonts w:ascii="Consolas" w:eastAsia="Times New Roman" w:hAnsi="Consolas" w:cs="Times New Roman"/>
           <w:color w:val="DCDCAA"/>
           <w:kern w:val="0"/>
           <w:sz w:val="28"/>
@@ -1062,7 +1062,7 @@
       </w:r>
       <w:r>
         <w:rPr>
-          <w:rFonts w:ascii="Times New Roman" w:eastAsia="Times New Roman" w:hAnsi="Times New Roman" w:cs="Times New Roman"/>
+          <w:rFonts w:ascii="Consolas" w:eastAsia="Times New Roman" w:hAnsi="Consolas" w:cs="Times New Roman"/>
           <w:color w:val="CCCCCC"/>
           <w:kern w:val="0"/>
           <w:sz w:val="28"/>
@@ -1074,7 +1074,7 @@
       </w:r>
       <w:r>
         <w:rPr>
-          <w:rFonts w:ascii="Times New Roman" w:eastAsia="Times New Roman" w:hAnsi="Times New Roman" w:cs="Times New Roman"/>
+          <w:rFonts w:ascii="Consolas" w:eastAsia="Times New Roman" w:hAnsi="Consolas" w:cs="Times New Roman"/>
           <w:color w:val="CE9178"/>
           <w:kern w:val="0"/>
           <w:sz w:val="28"/>
@@ -1086,7 +1086,7 @@
       </w:r>
       <w:r>
         <w:rPr>
-          <w:rFonts w:ascii="Times New Roman" w:eastAsia="Times New Roman" w:hAnsi="Times New Roman" w:cs="Times New Roman"/>
+          <w:rFonts w:ascii="Consolas" w:eastAsia="Times New Roman" w:hAnsi="Consolas" w:cs="Times New Roman"/>
           <w:color w:val="569CD6"/>
           <w:kern w:val="0"/>
           <w:sz w:val="28"/>
@@ -1098,7 +1098,7 @@
       </w:r>
       <w:r>
         <w:rPr>
-          <w:rFonts w:ascii="Times New Roman" w:eastAsia="Times New Roman" w:hAnsi="Times New Roman" w:cs="Times New Roman"/>
+          <w:rFonts w:ascii="Consolas" w:eastAsia="Times New Roman" w:hAnsi="Consolas" w:cs="Times New Roman"/>
           <w:color w:val="4FC1FF"/>
           <w:kern w:val="0"/>
           <w:sz w:val="28"/>
@@ -1110,7 +1110,7 @@
       </w:r>
       <w:r>
         <w:rPr>
-          <w:rFonts w:ascii="Times New Roman" w:eastAsia="Times New Roman" w:hAnsi="Times New Roman" w:cs="Times New Roman"/>
+          <w:rFonts w:ascii="Consolas" w:eastAsia="Times New Roman" w:hAnsi="Consolas" w:cs="Times New Roman"/>
           <w:color w:val="569CD6"/>
           <w:kern w:val="0"/>
           <w:sz w:val="28"/>
@@ -1122,7 +1122,7 @@
       </w:r>
       <w:r>
         <w:rPr>
-          <w:rFonts w:ascii="Times New Roman" w:eastAsia="Times New Roman" w:hAnsi="Times New Roman" w:cs="Times New Roman"/>
+          <w:rFonts w:ascii="Consolas" w:eastAsia="Times New Roman" w:hAnsi="Consolas" w:cs="Times New Roman"/>
           <w:color w:val="CE9178"/>
           <w:kern w:val="0"/>
           <w:sz w:val="28"/>
@@ -1134,7 +1134,7 @@
       </w:r>
       <w:r>
         <w:rPr>
-          <w:rFonts w:ascii="Times New Roman" w:eastAsia="Times New Roman" w:hAnsi="Times New Roman" w:cs="Times New Roman"/>
+          <w:rFonts w:ascii="Consolas" w:eastAsia="Times New Roman" w:hAnsi="Consolas" w:cs="Times New Roman"/>
           <w:color w:val="CCCCCC"/>
           <w:kern w:val="0"/>
           <w:sz w:val="28"/>
@@ -1150,18 +1150,18 @@
         <w:shd w:val="clear" w:color="auto" w:fill="1F1F1F"/>
         <w:spacing w:after="0" w:line="360" w:lineRule="atLeast"/>
         <w:rPr>
-          <w:rFonts w:ascii="Times New Roman" w:eastAsia="Times New Roman" w:hAnsi="Times New Roman" w:cs="Times New Roman"/>
-          <w:color w:val="CCCCCC"/>
-          <w:kern w:val="0"/>
-          <w:sz w:val="28"/>
-          <w:szCs w:val="28"/>
-          <w:lang w:eastAsia="en-IN"/>
-          <w14:ligatures w14:val="none"/>
-        </w:rPr>
-      </w:pPr>
-      <w:r>
-        <w:rPr>
-          <w:rFonts w:ascii="Times New Roman" w:eastAsia="Times New Roman" w:hAnsi="Times New Roman" w:cs="Times New Roman"/>
+          <w:rFonts w:ascii="Consolas" w:eastAsia="Times New Roman" w:hAnsi="Consolas" w:cs="Times New Roman"/>
+          <w:color w:val="CCCCCC"/>
+          <w:kern w:val="0"/>
+          <w:sz w:val="28"/>
+          <w:szCs w:val="28"/>
+          <w:lang w:eastAsia="en-IN"/>
+          <w14:ligatures w14:val="none"/>
+        </w:rPr>
+      </w:pPr>
+      <w:r>
+        <w:rPr>
+          <w:rFonts w:ascii="Consolas" w:eastAsia="Times New Roman" w:hAnsi="Consolas" w:cs="Times New Roman"/>
           <w:color w:val="CCCCCC"/>
           <w:kern w:val="0"/>
           <w:sz w:val="28"/>
@@ -1221,7 +1221,6 @@
           <w:sz w:val="28"/>
           <w:szCs w:val="28"/>
         </w:rPr>
-        <w:lastRenderedPageBreak/>
         <w:t xml:space="preserve">Stands for: </w:t>
       </w:r>
       <w:proofErr w:type="spellStart"/>
@@ -1314,7 +1313,7 @@
         <w:shd w:val="clear" w:color="auto" w:fill="1F1F1F"/>
         <w:spacing w:after="0" w:line="360" w:lineRule="atLeast"/>
         <w:rPr>
-          <w:rFonts w:ascii="Times New Roman" w:eastAsia="Times New Roman" w:hAnsi="Times New Roman" w:cs="Times New Roman"/>
+          <w:rFonts w:ascii="Consolas" w:eastAsia="Times New Roman" w:hAnsi="Consolas" w:cs="Times New Roman"/>
           <w:color w:val="CCCCCC"/>
           <w:kern w:val="0"/>
           <w:sz w:val="28"/>
@@ -1326,7 +1325,7 @@
       <w:proofErr w:type="spellStart"/>
       <w:r>
         <w:rPr>
-          <w:rFonts w:ascii="Times New Roman" w:eastAsia="Times New Roman" w:hAnsi="Times New Roman" w:cs="Times New Roman"/>
+          <w:rFonts w:ascii="Consolas" w:eastAsia="Times New Roman" w:hAnsi="Consolas" w:cs="Times New Roman"/>
           <w:color w:val="4FC1FF"/>
           <w:kern w:val="0"/>
           <w:sz w:val="28"/>
@@ -1338,7 +1337,7 @@
       </w:r>
       <w:r>
         <w:rPr>
-          <w:rFonts w:ascii="Times New Roman" w:eastAsia="Times New Roman" w:hAnsi="Times New Roman" w:cs="Times New Roman"/>
+          <w:rFonts w:ascii="Consolas" w:eastAsia="Times New Roman" w:hAnsi="Consolas" w:cs="Times New Roman"/>
           <w:color w:val="CCCCCC"/>
           <w:kern w:val="0"/>
           <w:sz w:val="28"/>
@@ -1350,7 +1349,7 @@
       </w:r>
       <w:r>
         <w:rPr>
-          <w:rFonts w:ascii="Times New Roman" w:eastAsia="Times New Roman" w:hAnsi="Times New Roman" w:cs="Times New Roman"/>
+          <w:rFonts w:ascii="Consolas" w:eastAsia="Times New Roman" w:hAnsi="Consolas" w:cs="Times New Roman"/>
           <w:color w:val="DCDCAA"/>
           <w:kern w:val="0"/>
           <w:sz w:val="28"/>
@@ -1363,7 +1362,7 @@
       <w:proofErr w:type="spellEnd"/>
       <w:r>
         <w:rPr>
-          <w:rFonts w:ascii="Times New Roman" w:eastAsia="Times New Roman" w:hAnsi="Times New Roman" w:cs="Times New Roman"/>
+          <w:rFonts w:ascii="Consolas" w:eastAsia="Times New Roman" w:hAnsi="Consolas" w:cs="Times New Roman"/>
           <w:color w:val="CCCCCC"/>
           <w:kern w:val="0"/>
           <w:sz w:val="28"/>
@@ -1375,7 +1374,7 @@
       </w:r>
       <w:r>
         <w:rPr>
-          <w:rFonts w:ascii="Times New Roman" w:eastAsia="Times New Roman" w:hAnsi="Times New Roman" w:cs="Times New Roman"/>
+          <w:rFonts w:ascii="Consolas" w:eastAsia="Times New Roman" w:hAnsi="Consolas" w:cs="Times New Roman"/>
           <w:color w:val="CE9178"/>
           <w:kern w:val="0"/>
           <w:sz w:val="28"/>
@@ -1387,7 +1386,7 @@
       </w:r>
       <w:r>
         <w:rPr>
-          <w:rFonts w:ascii="Times New Roman" w:eastAsia="Times New Roman" w:hAnsi="Times New Roman" w:cs="Times New Roman"/>
+          <w:rFonts w:ascii="Consolas" w:eastAsia="Times New Roman" w:hAnsi="Consolas" w:cs="Times New Roman"/>
           <w:color w:val="CCCCCC"/>
           <w:kern w:val="0"/>
           <w:sz w:val="28"/>
@@ -1400,7 +1399,7 @@
       <w:proofErr w:type="spellStart"/>
       <w:r>
         <w:rPr>
-          <w:rFonts w:ascii="Times New Roman" w:eastAsia="Times New Roman" w:hAnsi="Times New Roman" w:cs="Times New Roman"/>
+          <w:rFonts w:ascii="Consolas" w:eastAsia="Times New Roman" w:hAnsi="Consolas" w:cs="Times New Roman"/>
           <w:color w:val="9CDCFE"/>
           <w:kern w:val="0"/>
           <w:sz w:val="28"/>
@@ -1413,7 +1412,7 @@
       <w:proofErr w:type="spellEnd"/>
       <w:r>
         <w:rPr>
-          <w:rFonts w:ascii="Times New Roman" w:eastAsia="Times New Roman" w:hAnsi="Times New Roman" w:cs="Times New Roman"/>
+          <w:rFonts w:ascii="Consolas" w:eastAsia="Times New Roman" w:hAnsi="Consolas" w:cs="Times New Roman"/>
           <w:color w:val="CCCCCC"/>
           <w:kern w:val="0"/>
           <w:sz w:val="28"/>
@@ -1425,7 +1424,7 @@
       </w:r>
       <w:r>
         <w:rPr>
-          <w:rFonts w:ascii="Times New Roman" w:eastAsia="Times New Roman" w:hAnsi="Times New Roman" w:cs="Times New Roman"/>
+          <w:rFonts w:ascii="Consolas" w:eastAsia="Times New Roman" w:hAnsi="Consolas" w:cs="Times New Roman"/>
           <w:color w:val="9CDCFE"/>
           <w:kern w:val="0"/>
           <w:sz w:val="28"/>
@@ -1437,7 +1436,7 @@
       </w:r>
       <w:r>
         <w:rPr>
-          <w:rFonts w:ascii="Times New Roman" w:eastAsia="Times New Roman" w:hAnsi="Times New Roman" w:cs="Times New Roman"/>
+          <w:rFonts w:ascii="Consolas" w:eastAsia="Times New Roman" w:hAnsi="Consolas" w:cs="Times New Roman"/>
           <w:color w:val="CCCCCC"/>
           <w:kern w:val="0"/>
           <w:sz w:val="28"/>
@@ -1449,7 +1448,7 @@
       </w:r>
       <w:r>
         <w:rPr>
-          <w:rFonts w:ascii="Times New Roman" w:eastAsia="Times New Roman" w:hAnsi="Times New Roman" w:cs="Times New Roman"/>
+          <w:rFonts w:ascii="Consolas" w:eastAsia="Times New Roman" w:hAnsi="Consolas" w:cs="Times New Roman"/>
           <w:color w:val="569CD6"/>
           <w:kern w:val="0"/>
           <w:sz w:val="28"/>
@@ -1461,7 +1460,7 @@
       </w:r>
       <w:r>
         <w:rPr>
-          <w:rFonts w:ascii="Times New Roman" w:eastAsia="Times New Roman" w:hAnsi="Times New Roman" w:cs="Times New Roman"/>
+          <w:rFonts w:ascii="Consolas" w:eastAsia="Times New Roman" w:hAnsi="Consolas" w:cs="Times New Roman"/>
           <w:color w:val="CCCCCC"/>
           <w:kern w:val="0"/>
           <w:sz w:val="28"/>
@@ -1477,31 +1476,32 @@
         <w:shd w:val="clear" w:color="auto" w:fill="1F1F1F"/>
         <w:spacing w:after="0" w:line="360" w:lineRule="atLeast"/>
         <w:rPr>
-          <w:rFonts w:ascii="Times New Roman" w:eastAsia="Times New Roman" w:hAnsi="Times New Roman" w:cs="Times New Roman"/>
-          <w:color w:val="CCCCCC"/>
-          <w:kern w:val="0"/>
-          <w:sz w:val="28"/>
-          <w:szCs w:val="28"/>
-          <w:lang w:eastAsia="en-IN"/>
-          <w14:ligatures w14:val="none"/>
-        </w:rPr>
-      </w:pPr>
-      <w:r>
-        <w:rPr>
-          <w:rFonts w:ascii="Times New Roman" w:eastAsia="Times New Roman" w:hAnsi="Times New Roman" w:cs="Times New Roman"/>
-          <w:color w:val="CCCCCC"/>
-          <w:kern w:val="0"/>
-          <w:sz w:val="28"/>
-          <w:szCs w:val="28"/>
-          <w:lang w:eastAsia="en-IN"/>
-          <w14:ligatures w14:val="none"/>
-        </w:rPr>
+          <w:rFonts w:ascii="Consolas" w:eastAsia="Times New Roman" w:hAnsi="Consolas" w:cs="Times New Roman"/>
+          <w:color w:val="CCCCCC"/>
+          <w:kern w:val="0"/>
+          <w:sz w:val="28"/>
+          <w:szCs w:val="28"/>
+          <w:lang w:eastAsia="en-IN"/>
+          <w14:ligatures w14:val="none"/>
+        </w:rPr>
+      </w:pPr>
+      <w:r>
+        <w:rPr>
+          <w:rFonts w:ascii="Consolas" w:eastAsia="Times New Roman" w:hAnsi="Consolas" w:cs="Times New Roman"/>
+          <w:color w:val="CCCCCC"/>
+          <w:kern w:val="0"/>
+          <w:sz w:val="28"/>
+          <w:szCs w:val="28"/>
+          <w:lang w:eastAsia="en-IN"/>
+          <w14:ligatures w14:val="none"/>
+        </w:rPr>
+        <w:lastRenderedPageBreak/>
         <w:t xml:space="preserve">    </w:t>
       </w:r>
       <w:proofErr w:type="spellStart"/>
       <w:r>
         <w:rPr>
-          <w:rFonts w:ascii="Times New Roman" w:eastAsia="Times New Roman" w:hAnsi="Times New Roman" w:cs="Times New Roman"/>
+          <w:rFonts w:ascii="Consolas" w:eastAsia="Times New Roman" w:hAnsi="Consolas" w:cs="Times New Roman"/>
           <w:color w:val="9CDCFE"/>
           <w:kern w:val="0"/>
           <w:sz w:val="28"/>
@@ -1513,7 +1513,7 @@
       </w:r>
       <w:r>
         <w:rPr>
-          <w:rFonts w:ascii="Times New Roman" w:eastAsia="Times New Roman" w:hAnsi="Times New Roman" w:cs="Times New Roman"/>
+          <w:rFonts w:ascii="Consolas" w:eastAsia="Times New Roman" w:hAnsi="Consolas" w:cs="Times New Roman"/>
           <w:color w:val="CCCCCC"/>
           <w:kern w:val="0"/>
           <w:sz w:val="28"/>
@@ -1525,7 +1525,7 @@
       </w:r>
       <w:r>
         <w:rPr>
-          <w:rFonts w:ascii="Times New Roman" w:eastAsia="Times New Roman" w:hAnsi="Times New Roman" w:cs="Times New Roman"/>
+          <w:rFonts w:ascii="Consolas" w:eastAsia="Times New Roman" w:hAnsi="Consolas" w:cs="Times New Roman"/>
           <w:color w:val="DCDCAA"/>
           <w:kern w:val="0"/>
           <w:sz w:val="28"/>
@@ -1538,7 +1538,7 @@
       <w:proofErr w:type="spellEnd"/>
       <w:r>
         <w:rPr>
-          <w:rFonts w:ascii="Times New Roman" w:eastAsia="Times New Roman" w:hAnsi="Times New Roman" w:cs="Times New Roman"/>
+          <w:rFonts w:ascii="Consolas" w:eastAsia="Times New Roman" w:hAnsi="Consolas" w:cs="Times New Roman"/>
           <w:color w:val="CCCCCC"/>
           <w:kern w:val="0"/>
           <w:sz w:val="28"/>
@@ -1550,7 +1550,7 @@
       </w:r>
       <w:r>
         <w:rPr>
-          <w:rFonts w:ascii="Times New Roman" w:eastAsia="Times New Roman" w:hAnsi="Times New Roman" w:cs="Times New Roman"/>
+          <w:rFonts w:ascii="Consolas" w:eastAsia="Times New Roman" w:hAnsi="Consolas" w:cs="Times New Roman"/>
           <w:color w:val="CE9178"/>
           <w:kern w:val="0"/>
           <w:sz w:val="28"/>
@@ -1562,7 +1562,7 @@
       </w:r>
       <w:r>
         <w:rPr>
-          <w:rFonts w:ascii="Times New Roman" w:eastAsia="Times New Roman" w:hAnsi="Times New Roman" w:cs="Times New Roman"/>
+          <w:rFonts w:ascii="Consolas" w:eastAsia="Times New Roman" w:hAnsi="Consolas" w:cs="Times New Roman"/>
           <w:color w:val="CCCCCC"/>
           <w:kern w:val="0"/>
           <w:sz w:val="28"/>
@@ -1578,18 +1578,18 @@
         <w:shd w:val="clear" w:color="auto" w:fill="1F1F1F"/>
         <w:spacing w:after="0" w:line="360" w:lineRule="atLeast"/>
         <w:rPr>
-          <w:rFonts w:ascii="Times New Roman" w:eastAsia="Times New Roman" w:hAnsi="Times New Roman" w:cs="Times New Roman"/>
-          <w:color w:val="CCCCCC"/>
-          <w:kern w:val="0"/>
-          <w:sz w:val="28"/>
-          <w:szCs w:val="28"/>
-          <w:lang w:eastAsia="en-IN"/>
-          <w14:ligatures w14:val="none"/>
-        </w:rPr>
-      </w:pPr>
-      <w:r>
-        <w:rPr>
-          <w:rFonts w:ascii="Times New Roman" w:eastAsia="Times New Roman" w:hAnsi="Times New Roman" w:cs="Times New Roman"/>
+          <w:rFonts w:ascii="Consolas" w:eastAsia="Times New Roman" w:hAnsi="Consolas" w:cs="Times New Roman"/>
+          <w:color w:val="CCCCCC"/>
+          <w:kern w:val="0"/>
+          <w:sz w:val="28"/>
+          <w:szCs w:val="28"/>
+          <w:lang w:eastAsia="en-IN"/>
+          <w14:ligatures w14:val="none"/>
+        </w:rPr>
+      </w:pPr>
+      <w:r>
+        <w:rPr>
+          <w:rFonts w:ascii="Consolas" w:eastAsia="Times New Roman" w:hAnsi="Consolas" w:cs="Times New Roman"/>
           <w:color w:val="CCCCCC"/>
           <w:kern w:val="0"/>
           <w:sz w:val="28"/>
@@ -1793,7 +1793,7 @@
         <w:shd w:val="clear" w:color="auto" w:fill="1F1F1F"/>
         <w:spacing w:after="0" w:line="360" w:lineRule="atLeast"/>
         <w:rPr>
-          <w:rFonts w:ascii="Times New Roman" w:eastAsia="Times New Roman" w:hAnsi="Times New Roman" w:cs="Times New Roman"/>
+          <w:rFonts w:ascii="Consolas" w:eastAsia="Times New Roman" w:hAnsi="Consolas" w:cs="Times New Roman"/>
           <w:color w:val="CCCCCC"/>
           <w:kern w:val="0"/>
           <w:sz w:val="28"/>
@@ -1805,7 +1805,7 @@
       <w:proofErr w:type="spellStart"/>
       <w:r>
         <w:rPr>
-          <w:rFonts w:ascii="Times New Roman" w:eastAsia="Times New Roman" w:hAnsi="Times New Roman" w:cs="Times New Roman"/>
+          <w:rFonts w:ascii="Consolas" w:eastAsia="Times New Roman" w:hAnsi="Consolas" w:cs="Times New Roman"/>
           <w:color w:val="4FC1FF"/>
           <w:kern w:val="0"/>
           <w:sz w:val="28"/>
@@ -1817,7 +1817,7 @@
       </w:r>
       <w:r>
         <w:rPr>
-          <w:rFonts w:ascii="Times New Roman" w:eastAsia="Times New Roman" w:hAnsi="Times New Roman" w:cs="Times New Roman"/>
+          <w:rFonts w:ascii="Consolas" w:eastAsia="Times New Roman" w:hAnsi="Consolas" w:cs="Times New Roman"/>
           <w:color w:val="CCCCCC"/>
           <w:kern w:val="0"/>
           <w:sz w:val="28"/>
@@ -1829,7 +1829,7 @@
       </w:r>
       <w:r>
         <w:rPr>
-          <w:rFonts w:ascii="Times New Roman" w:eastAsia="Times New Roman" w:hAnsi="Times New Roman" w:cs="Times New Roman"/>
+          <w:rFonts w:ascii="Consolas" w:eastAsia="Times New Roman" w:hAnsi="Consolas" w:cs="Times New Roman"/>
           <w:color w:val="DCDCAA"/>
           <w:kern w:val="0"/>
           <w:sz w:val="28"/>
@@ -1842,7 +1842,7 @@
       <w:proofErr w:type="spellEnd"/>
       <w:r>
         <w:rPr>
-          <w:rFonts w:ascii="Times New Roman" w:eastAsia="Times New Roman" w:hAnsi="Times New Roman" w:cs="Times New Roman"/>
+          <w:rFonts w:ascii="Consolas" w:eastAsia="Times New Roman" w:hAnsi="Consolas" w:cs="Times New Roman"/>
           <w:color w:val="CCCCCC"/>
           <w:kern w:val="0"/>
           <w:sz w:val="28"/>
@@ -1854,7 +1854,7 @@
       </w:r>
       <w:r>
         <w:rPr>
-          <w:rFonts w:ascii="Times New Roman" w:eastAsia="Times New Roman" w:hAnsi="Times New Roman" w:cs="Times New Roman"/>
+          <w:rFonts w:ascii="Consolas" w:eastAsia="Times New Roman" w:hAnsi="Consolas" w:cs="Times New Roman"/>
           <w:color w:val="CE9178"/>
           <w:kern w:val="0"/>
           <w:sz w:val="28"/>
@@ -1866,7 +1866,7 @@
       </w:r>
       <w:r>
         <w:rPr>
-          <w:rFonts w:ascii="Times New Roman" w:eastAsia="Times New Roman" w:hAnsi="Times New Roman" w:cs="Times New Roman"/>
+          <w:rFonts w:ascii="Consolas" w:eastAsia="Times New Roman" w:hAnsi="Consolas" w:cs="Times New Roman"/>
           <w:color w:val="CCCCCC"/>
           <w:kern w:val="0"/>
           <w:sz w:val="28"/>
@@ -1879,7 +1879,7 @@
       <w:proofErr w:type="spellStart"/>
       <w:r>
         <w:rPr>
-          <w:rFonts w:ascii="Times New Roman" w:eastAsia="Times New Roman" w:hAnsi="Times New Roman" w:cs="Times New Roman"/>
+          <w:rFonts w:ascii="Consolas" w:eastAsia="Times New Roman" w:hAnsi="Consolas" w:cs="Times New Roman"/>
           <w:color w:val="9CDCFE"/>
           <w:kern w:val="0"/>
           <w:sz w:val="28"/>
@@ -1892,7 +1892,7 @@
       <w:proofErr w:type="spellEnd"/>
       <w:r>
         <w:rPr>
-          <w:rFonts w:ascii="Times New Roman" w:eastAsia="Times New Roman" w:hAnsi="Times New Roman" w:cs="Times New Roman"/>
+          <w:rFonts w:ascii="Consolas" w:eastAsia="Times New Roman" w:hAnsi="Consolas" w:cs="Times New Roman"/>
           <w:color w:val="CCCCCC"/>
           <w:kern w:val="0"/>
           <w:sz w:val="28"/>
@@ -1904,7 +1904,7 @@
       </w:r>
       <w:r>
         <w:rPr>
-          <w:rFonts w:ascii="Times New Roman" w:eastAsia="Times New Roman" w:hAnsi="Times New Roman" w:cs="Times New Roman"/>
+          <w:rFonts w:ascii="Consolas" w:eastAsia="Times New Roman" w:hAnsi="Consolas" w:cs="Times New Roman"/>
           <w:color w:val="9CDCFE"/>
           <w:kern w:val="0"/>
           <w:sz w:val="28"/>
@@ -1916,7 +1916,7 @@
       </w:r>
       <w:r>
         <w:rPr>
-          <w:rFonts w:ascii="Times New Roman" w:eastAsia="Times New Roman" w:hAnsi="Times New Roman" w:cs="Times New Roman"/>
+          <w:rFonts w:ascii="Consolas" w:eastAsia="Times New Roman" w:hAnsi="Consolas" w:cs="Times New Roman"/>
           <w:color w:val="CCCCCC"/>
           <w:kern w:val="0"/>
           <w:sz w:val="28"/>
@@ -1928,7 +1928,7 @@
       </w:r>
       <w:r>
         <w:rPr>
-          <w:rFonts w:ascii="Times New Roman" w:eastAsia="Times New Roman" w:hAnsi="Times New Roman" w:cs="Times New Roman"/>
+          <w:rFonts w:ascii="Consolas" w:eastAsia="Times New Roman" w:hAnsi="Consolas" w:cs="Times New Roman"/>
           <w:color w:val="569CD6"/>
           <w:kern w:val="0"/>
           <w:sz w:val="28"/>
@@ -1940,7 +1940,7 @@
       </w:r>
       <w:r>
         <w:rPr>
-          <w:rFonts w:ascii="Times New Roman" w:eastAsia="Times New Roman" w:hAnsi="Times New Roman" w:cs="Times New Roman"/>
+          <w:rFonts w:ascii="Consolas" w:eastAsia="Times New Roman" w:hAnsi="Consolas" w:cs="Times New Roman"/>
           <w:color w:val="CCCCCC"/>
           <w:kern w:val="0"/>
           <w:sz w:val="28"/>
@@ -1956,18 +1956,18 @@
         <w:shd w:val="clear" w:color="auto" w:fill="1F1F1F"/>
         <w:spacing w:after="0" w:line="360" w:lineRule="atLeast"/>
         <w:rPr>
-          <w:rFonts w:ascii="Times New Roman" w:eastAsia="Times New Roman" w:hAnsi="Times New Roman" w:cs="Times New Roman"/>
-          <w:color w:val="CCCCCC"/>
-          <w:kern w:val="0"/>
-          <w:sz w:val="28"/>
-          <w:szCs w:val="28"/>
-          <w:lang w:eastAsia="en-IN"/>
-          <w14:ligatures w14:val="none"/>
-        </w:rPr>
-      </w:pPr>
-      <w:r>
-        <w:rPr>
-          <w:rFonts w:ascii="Times New Roman" w:eastAsia="Times New Roman" w:hAnsi="Times New Roman" w:cs="Times New Roman"/>
+          <w:rFonts w:ascii="Consolas" w:eastAsia="Times New Roman" w:hAnsi="Consolas" w:cs="Times New Roman"/>
+          <w:color w:val="CCCCCC"/>
+          <w:kern w:val="0"/>
+          <w:sz w:val="28"/>
+          <w:szCs w:val="28"/>
+          <w:lang w:eastAsia="en-IN"/>
+          <w14:ligatures w14:val="none"/>
+        </w:rPr>
+      </w:pPr>
+      <w:r>
+        <w:rPr>
+          <w:rFonts w:ascii="Consolas" w:eastAsia="Times New Roman" w:hAnsi="Consolas" w:cs="Times New Roman"/>
           <w:color w:val="CCCCCC"/>
           <w:kern w:val="0"/>
           <w:sz w:val="28"/>
@@ -1980,7 +1980,7 @@
       <w:proofErr w:type="spellStart"/>
       <w:r>
         <w:rPr>
-          <w:rFonts w:ascii="Times New Roman" w:eastAsia="Times New Roman" w:hAnsi="Times New Roman" w:cs="Times New Roman"/>
+          <w:rFonts w:ascii="Consolas" w:eastAsia="Times New Roman" w:hAnsi="Consolas" w:cs="Times New Roman"/>
           <w:color w:val="9CDCFE"/>
           <w:kern w:val="0"/>
           <w:sz w:val="28"/>
@@ -1992,7 +1992,7 @@
       </w:r>
       <w:r>
         <w:rPr>
-          <w:rFonts w:ascii="Times New Roman" w:eastAsia="Times New Roman" w:hAnsi="Times New Roman" w:cs="Times New Roman"/>
+          <w:rFonts w:ascii="Consolas" w:eastAsia="Times New Roman" w:hAnsi="Consolas" w:cs="Times New Roman"/>
           <w:color w:val="CCCCCC"/>
           <w:kern w:val="0"/>
           <w:sz w:val="28"/>
@@ -2004,7 +2004,7 @@
       </w:r>
       <w:r>
         <w:rPr>
-          <w:rFonts w:ascii="Times New Roman" w:eastAsia="Times New Roman" w:hAnsi="Times New Roman" w:cs="Times New Roman"/>
+          <w:rFonts w:ascii="Consolas" w:eastAsia="Times New Roman" w:hAnsi="Consolas" w:cs="Times New Roman"/>
           <w:color w:val="DCDCAA"/>
           <w:kern w:val="0"/>
           <w:sz w:val="28"/>
@@ -2017,7 +2017,7 @@
       <w:proofErr w:type="spellEnd"/>
       <w:r>
         <w:rPr>
-          <w:rFonts w:ascii="Times New Roman" w:eastAsia="Times New Roman" w:hAnsi="Times New Roman" w:cs="Times New Roman"/>
+          <w:rFonts w:ascii="Consolas" w:eastAsia="Times New Roman" w:hAnsi="Consolas" w:cs="Times New Roman"/>
           <w:color w:val="CCCCCC"/>
           <w:kern w:val="0"/>
           <w:sz w:val="28"/>
@@ -2029,7 +2029,7 @@
       </w:r>
       <w:r>
         <w:rPr>
-          <w:rFonts w:ascii="Times New Roman" w:eastAsia="Times New Roman" w:hAnsi="Times New Roman" w:cs="Times New Roman"/>
+          <w:rFonts w:ascii="Consolas" w:eastAsia="Times New Roman" w:hAnsi="Consolas" w:cs="Times New Roman"/>
           <w:color w:val="CE9178"/>
           <w:kern w:val="0"/>
           <w:sz w:val="28"/>
@@ -2041,7 +2041,7 @@
       </w:r>
       <w:r>
         <w:rPr>
-          <w:rFonts w:ascii="Times New Roman" w:eastAsia="Times New Roman" w:hAnsi="Times New Roman" w:cs="Times New Roman"/>
+          <w:rFonts w:ascii="Consolas" w:eastAsia="Times New Roman" w:hAnsi="Consolas" w:cs="Times New Roman"/>
           <w:color w:val="CCCCCC"/>
           <w:kern w:val="0"/>
           <w:sz w:val="28"/>
@@ -2057,18 +2057,18 @@
         <w:shd w:val="clear" w:color="auto" w:fill="1F1F1F"/>
         <w:spacing w:after="0" w:line="360" w:lineRule="atLeast"/>
         <w:rPr>
-          <w:rFonts w:ascii="Times New Roman" w:eastAsia="Times New Roman" w:hAnsi="Times New Roman" w:cs="Times New Roman"/>
-          <w:color w:val="CCCCCC"/>
-          <w:kern w:val="0"/>
-          <w:sz w:val="28"/>
-          <w:szCs w:val="28"/>
-          <w:lang w:eastAsia="en-IN"/>
-          <w14:ligatures w14:val="none"/>
-        </w:rPr>
-      </w:pPr>
-      <w:r>
-        <w:rPr>
-          <w:rFonts w:ascii="Times New Roman" w:eastAsia="Times New Roman" w:hAnsi="Times New Roman" w:cs="Times New Roman"/>
+          <w:rFonts w:ascii="Consolas" w:eastAsia="Times New Roman" w:hAnsi="Consolas" w:cs="Times New Roman"/>
+          <w:color w:val="CCCCCC"/>
+          <w:kern w:val="0"/>
+          <w:sz w:val="28"/>
+          <w:szCs w:val="28"/>
+          <w:lang w:eastAsia="en-IN"/>
+          <w14:ligatures w14:val="none"/>
+        </w:rPr>
+      </w:pPr>
+      <w:r>
+        <w:rPr>
+          <w:rFonts w:ascii="Consolas" w:eastAsia="Times New Roman" w:hAnsi="Consolas" w:cs="Times New Roman"/>
           <w:color w:val="CCCCCC"/>
           <w:kern w:val="0"/>
           <w:sz w:val="28"/>
@@ -2396,7 +2396,6 @@
           <w:sz w:val="28"/>
           <w:szCs w:val="28"/>
         </w:rPr>
-        <w:lastRenderedPageBreak/>
         <w:drawing>
           <wp:inline distT="0" distB="0" distL="0" distR="0" wp14:anchorId="0957E1BC" wp14:editId="69D2DFED">
             <wp:extent cx="5731510" cy="2438400"/>
@@ -2620,7 +2619,6 @@
           <w:sz w:val="28"/>
           <w:szCs w:val="28"/>
         </w:rPr>
-        <w:lastRenderedPageBreak/>
         <w:drawing>
           <wp:inline distT="0" distB="0" distL="0" distR="0" wp14:anchorId="1B5591FD" wp14:editId="2A83A7F1">
             <wp:extent cx="5731510" cy="2378710"/>
@@ -2692,6 +2690,7 @@
           <w:sz w:val="28"/>
           <w:szCs w:val="28"/>
         </w:rPr>
+        <w:lastRenderedPageBreak/>
         <w:drawing>
           <wp:inline distT="0" distB="0" distL="0" distR="0" wp14:anchorId="1E0C0F4B" wp14:editId="30756203">
             <wp:extent cx="5731510" cy="2479675"/>
@@ -3505,7 +3504,6 @@
           <w:lang w:eastAsia="en-IN"/>
           <w14:ligatures w14:val="none"/>
         </w:rPr>
-        <w:lastRenderedPageBreak/>
         <w:t xml:space="preserve">    </w:t>
       </w:r>
       <w:r>
@@ -4569,6 +4567,7 @@
           <w:lang w:eastAsia="en-IN"/>
           <w14:ligatures w14:val="none"/>
         </w:rPr>
+        <w:lastRenderedPageBreak/>
         <w:t>const</w:t>
       </w:r>
       <w:proofErr w:type="spellEnd"/>
@@ -5339,6 +5338,964 @@
       <w:pPr>
         <w:rPr>
           <w:rFonts w:ascii="Times New Roman" w:hAnsi="Times New Roman" w:cs="Times New Roman"/>
+          <w:b/>
+          <w:bCs/>
+          <w:sz w:val="28"/>
+          <w:szCs w:val="28"/>
+        </w:rPr>
+      </w:pPr>
+      <w:r>
+        <w:rPr>
+          <w:rFonts w:ascii="Times New Roman" w:hAnsi="Times New Roman" w:cs="Times New Roman"/>
+          <w:b/>
+          <w:bCs/>
+          <w:sz w:val="28"/>
+          <w:szCs w:val="28"/>
+        </w:rPr>
+        <w:t>205. Custom Middlewares</w:t>
+      </w:r>
+    </w:p>
+    <w:p>
+      <w:pPr>
+        <w:pStyle w:val="ListParagraph"/>
+        <w:numPr>
+          <w:ilvl w:val="0"/>
+          <w:numId w:val="8"/>
+        </w:numPr>
+        <w:rPr>
+          <w:rFonts w:ascii="Times New Roman" w:hAnsi="Times New Roman" w:cs="Times New Roman"/>
+          <w:sz w:val="28"/>
+          <w:szCs w:val="28"/>
+        </w:rPr>
+      </w:pPr>
+      <w:r>
+        <w:rPr>
+          <w:rFonts w:ascii="Times New Roman" w:hAnsi="Times New Roman" w:cs="Times New Roman"/>
+          <w:sz w:val="28"/>
+          <w:szCs w:val="28"/>
+        </w:rPr>
+        <w:t>Middleware types:</w:t>
+      </w:r>
+    </w:p>
+    <w:p>
+      <w:pPr>
+        <w:pStyle w:val="ListParagraph"/>
+        <w:numPr>
+          <w:ilvl w:val="1"/>
+          <w:numId w:val="8"/>
+        </w:numPr>
+        <w:rPr>
+          <w:rFonts w:ascii="Times New Roman" w:hAnsi="Times New Roman" w:cs="Times New Roman"/>
+          <w:sz w:val="28"/>
+          <w:szCs w:val="28"/>
+        </w:rPr>
+      </w:pPr>
+      <w:r>
+        <w:rPr>
+          <w:rFonts w:ascii="Times New Roman" w:hAnsi="Times New Roman" w:cs="Times New Roman"/>
+          <w:sz w:val="28"/>
+          <w:szCs w:val="28"/>
+        </w:rPr>
+        <w:t>Logging Middleware.</w:t>
+      </w:r>
+    </w:p>
+    <w:p>
+      <w:pPr>
+        <w:pStyle w:val="ListParagraph"/>
+        <w:numPr>
+          <w:ilvl w:val="1"/>
+          <w:numId w:val="8"/>
+        </w:numPr>
+        <w:rPr>
+          <w:rFonts w:ascii="Times New Roman" w:hAnsi="Times New Roman" w:cs="Times New Roman"/>
+          <w:sz w:val="28"/>
+          <w:szCs w:val="28"/>
+        </w:rPr>
+      </w:pPr>
+      <w:r>
+        <w:rPr>
+          <w:rFonts w:ascii="Times New Roman" w:hAnsi="Times New Roman" w:cs="Times New Roman"/>
+          <w:sz w:val="28"/>
+          <w:szCs w:val="28"/>
+        </w:rPr>
+        <w:t xml:space="preserve">Pre-processing </w:t>
+      </w:r>
+      <w:r>
+        <w:rPr>
+          <w:rFonts w:ascii="Times New Roman" w:hAnsi="Times New Roman" w:cs="Times New Roman"/>
+          <w:sz w:val="28"/>
+          <w:szCs w:val="28"/>
+        </w:rPr>
+        <w:t>Middleware</w:t>
+      </w:r>
+      <w:r>
+        <w:rPr>
+          <w:rFonts w:ascii="Times New Roman" w:hAnsi="Times New Roman" w:cs="Times New Roman"/>
+          <w:sz w:val="28"/>
+          <w:szCs w:val="28"/>
+        </w:rPr>
+        <w:t>.</w:t>
+      </w:r>
+    </w:p>
+    <w:p>
+      <w:pPr>
+        <w:pStyle w:val="ListParagraph"/>
+        <w:numPr>
+          <w:ilvl w:val="1"/>
+          <w:numId w:val="8"/>
+        </w:numPr>
+        <w:rPr>
+          <w:rFonts w:ascii="Times New Roman" w:hAnsi="Times New Roman" w:cs="Times New Roman"/>
+          <w:sz w:val="28"/>
+          <w:szCs w:val="28"/>
+        </w:rPr>
+      </w:pPr>
+      <w:r>
+        <w:rPr>
+          <w:rFonts w:ascii="Times New Roman" w:hAnsi="Times New Roman" w:cs="Times New Roman"/>
+          <w:sz w:val="28"/>
+          <w:szCs w:val="28"/>
+        </w:rPr>
+        <w:t xml:space="preserve">Authentication </w:t>
+      </w:r>
+      <w:r>
+        <w:rPr>
+          <w:rFonts w:ascii="Times New Roman" w:hAnsi="Times New Roman" w:cs="Times New Roman"/>
+          <w:sz w:val="28"/>
+          <w:szCs w:val="28"/>
+        </w:rPr>
+        <w:t>Middleware</w:t>
+      </w:r>
+      <w:r>
+        <w:rPr>
+          <w:rFonts w:ascii="Times New Roman" w:hAnsi="Times New Roman" w:cs="Times New Roman"/>
+          <w:sz w:val="28"/>
+          <w:szCs w:val="28"/>
+        </w:rPr>
+        <w:t>.</w:t>
+      </w:r>
+    </w:p>
+    <w:p>
+      <w:pPr>
+        <w:pStyle w:val="ListParagraph"/>
+        <w:numPr>
+          <w:ilvl w:val="1"/>
+          <w:numId w:val="8"/>
+        </w:numPr>
+        <w:rPr>
+          <w:rFonts w:ascii="Times New Roman" w:hAnsi="Times New Roman" w:cs="Times New Roman"/>
+          <w:sz w:val="28"/>
+          <w:szCs w:val="28"/>
+        </w:rPr>
+      </w:pPr>
+      <w:r>
+        <w:rPr>
+          <w:rFonts w:ascii="Times New Roman" w:hAnsi="Times New Roman" w:cs="Times New Roman"/>
+          <w:sz w:val="28"/>
+          <w:szCs w:val="28"/>
+        </w:rPr>
+        <w:t xml:space="preserve">Error handling </w:t>
+      </w:r>
+      <w:r>
+        <w:rPr>
+          <w:rFonts w:ascii="Times New Roman" w:hAnsi="Times New Roman" w:cs="Times New Roman"/>
+          <w:sz w:val="28"/>
+          <w:szCs w:val="28"/>
+        </w:rPr>
+        <w:t>Middleware</w:t>
+      </w:r>
+      <w:r>
+        <w:rPr>
+          <w:rFonts w:ascii="Times New Roman" w:hAnsi="Times New Roman" w:cs="Times New Roman"/>
+          <w:sz w:val="28"/>
+          <w:szCs w:val="28"/>
+        </w:rPr>
+        <w:t>.</w:t>
+      </w:r>
+    </w:p>
+    <w:p>
+      <w:pPr>
+        <w:pStyle w:val="ListParagraph"/>
+        <w:numPr>
+          <w:ilvl w:val="0"/>
+          <w:numId w:val="8"/>
+        </w:numPr>
+        <w:rPr>
+          <w:rFonts w:ascii="Times New Roman" w:hAnsi="Times New Roman" w:cs="Times New Roman"/>
+          <w:sz w:val="28"/>
+          <w:szCs w:val="28"/>
+        </w:rPr>
+      </w:pPr>
+      <w:r>
+        <w:rPr>
+          <w:rFonts w:ascii="Times New Roman" w:hAnsi="Times New Roman" w:cs="Times New Roman"/>
+          <w:sz w:val="28"/>
+          <w:szCs w:val="28"/>
+        </w:rPr>
+        <w:t>`morgan` is a logging middleware. Used to log requests coming through server.</w:t>
+      </w:r>
+    </w:p>
+    <w:p>
+      <w:pPr>
+        <w:pStyle w:val="ListParagraph"/>
+        <w:numPr>
+          <w:ilvl w:val="1"/>
+          <w:numId w:val="8"/>
+        </w:numPr>
+        <w:rPr>
+          <w:rFonts w:ascii="Courier New" w:hAnsi="Courier New" w:cs="Courier New"/>
+          <w:sz w:val="28"/>
+          <w:szCs w:val="28"/>
+        </w:rPr>
+      </w:pPr>
+      <w:r>
+        <w:rPr>
+          <w:rFonts w:ascii="Courier New" w:hAnsi="Courier New" w:cs="Courier New"/>
+          <w:sz w:val="28"/>
+          <w:szCs w:val="28"/>
+        </w:rPr>
+        <w:t>import morgan from “morgan”;</w:t>
+      </w:r>
+    </w:p>
+    <w:p>
+      <w:pPr>
+        <w:pStyle w:val="ListParagraph"/>
+        <w:numPr>
+          <w:ilvl w:val="1"/>
+          <w:numId w:val="8"/>
+        </w:numPr>
+        <w:rPr>
+          <w:rFonts w:ascii="Courier New" w:hAnsi="Courier New" w:cs="Courier New"/>
+          <w:sz w:val="28"/>
+          <w:szCs w:val="28"/>
+        </w:rPr>
+      </w:pPr>
+      <w:proofErr w:type="spellStart"/>
+      <w:r>
+        <w:rPr>
+          <w:rFonts w:ascii="Courier New" w:hAnsi="Courier New" w:cs="Courier New"/>
+          <w:sz w:val="28"/>
+          <w:szCs w:val="28"/>
+        </w:rPr>
+        <w:t>APP.use</w:t>
+      </w:r>
+      <w:proofErr w:type="spellEnd"/>
+      <w:r>
+        <w:rPr>
+          <w:rFonts w:ascii="Courier New" w:hAnsi="Courier New" w:cs="Courier New"/>
+          <w:sz w:val="28"/>
+          <w:szCs w:val="28"/>
+        </w:rPr>
+        <w:t>(morgan(“combined”));</w:t>
+      </w:r>
+    </w:p>
+    <w:p>
+      <w:pPr>
+        <w:shd w:val="clear" w:color="auto" w:fill="1F1F1F"/>
+        <w:spacing w:after="0" w:line="360" w:lineRule="atLeast"/>
+        <w:rPr>
+          <w:rFonts w:ascii="Consolas" w:eastAsia="Times New Roman" w:hAnsi="Consolas" w:cs="Times New Roman"/>
+          <w:color w:val="CCCCCC"/>
+          <w:kern w:val="0"/>
+          <w:sz w:val="27"/>
+          <w:szCs w:val="27"/>
+          <w:lang w:eastAsia="en-IN"/>
+          <w14:ligatures w14:val="none"/>
+        </w:rPr>
+      </w:pPr>
+      <w:proofErr w:type="spellStart"/>
+      <w:r>
+        <w:rPr>
+          <w:rFonts w:ascii="Consolas" w:eastAsia="Times New Roman" w:hAnsi="Consolas" w:cs="Times New Roman"/>
+          <w:color w:val="4FC1FF"/>
+          <w:kern w:val="0"/>
+          <w:sz w:val="27"/>
+          <w:szCs w:val="27"/>
+          <w:lang w:eastAsia="en-IN"/>
+          <w14:ligatures w14:val="none"/>
+        </w:rPr>
+        <w:t>APP</w:t>
+      </w:r>
+      <w:r>
+        <w:rPr>
+          <w:rFonts w:ascii="Consolas" w:eastAsia="Times New Roman" w:hAnsi="Consolas" w:cs="Times New Roman"/>
+          <w:color w:val="CCCCCC"/>
+          <w:kern w:val="0"/>
+          <w:sz w:val="27"/>
+          <w:szCs w:val="27"/>
+          <w:lang w:eastAsia="en-IN"/>
+          <w14:ligatures w14:val="none"/>
+        </w:rPr>
+        <w:t>.</w:t>
+      </w:r>
+      <w:r>
+        <w:rPr>
+          <w:rFonts w:ascii="Consolas" w:eastAsia="Times New Roman" w:hAnsi="Consolas" w:cs="Times New Roman"/>
+          <w:color w:val="DCDCAA"/>
+          <w:kern w:val="0"/>
+          <w:sz w:val="27"/>
+          <w:szCs w:val="27"/>
+          <w:lang w:eastAsia="en-IN"/>
+          <w14:ligatures w14:val="none"/>
+        </w:rPr>
+        <w:t>use</w:t>
+      </w:r>
+      <w:proofErr w:type="spellEnd"/>
+      <w:r>
+        <w:rPr>
+          <w:rFonts w:ascii="Consolas" w:eastAsia="Times New Roman" w:hAnsi="Consolas" w:cs="Times New Roman"/>
+          <w:color w:val="CCCCCC"/>
+          <w:kern w:val="0"/>
+          <w:sz w:val="27"/>
+          <w:szCs w:val="27"/>
+          <w:lang w:eastAsia="en-IN"/>
+          <w14:ligatures w14:val="none"/>
+        </w:rPr>
+        <w:t>(</w:t>
+      </w:r>
+      <w:r>
+        <w:rPr>
+          <w:rFonts w:ascii="Consolas" w:eastAsia="Times New Roman" w:hAnsi="Consolas" w:cs="Times New Roman"/>
+          <w:color w:val="DCDCAA"/>
+          <w:kern w:val="0"/>
+          <w:sz w:val="27"/>
+          <w:szCs w:val="27"/>
+          <w:lang w:eastAsia="en-IN"/>
+          <w14:ligatures w14:val="none"/>
+        </w:rPr>
+        <w:t>morgan</w:t>
+      </w:r>
+      <w:r>
+        <w:rPr>
+          <w:rFonts w:ascii="Consolas" w:eastAsia="Times New Roman" w:hAnsi="Consolas" w:cs="Times New Roman"/>
+          <w:color w:val="CCCCCC"/>
+          <w:kern w:val="0"/>
+          <w:sz w:val="27"/>
+          <w:szCs w:val="27"/>
+          <w:lang w:eastAsia="en-IN"/>
+          <w14:ligatures w14:val="none"/>
+        </w:rPr>
+        <w:t>(</w:t>
+      </w:r>
+      <w:r>
+        <w:rPr>
+          <w:rFonts w:ascii="Consolas" w:eastAsia="Times New Roman" w:hAnsi="Consolas" w:cs="Times New Roman"/>
+          <w:color w:val="CE9178"/>
+          <w:kern w:val="0"/>
+          <w:sz w:val="27"/>
+          <w:szCs w:val="27"/>
+          <w:lang w:eastAsia="en-IN"/>
+          <w14:ligatures w14:val="none"/>
+        </w:rPr>
+        <w:t>"tiny"</w:t>
+      </w:r>
+      <w:r>
+        <w:rPr>
+          <w:rFonts w:ascii="Consolas" w:eastAsia="Times New Roman" w:hAnsi="Consolas" w:cs="Times New Roman"/>
+          <w:color w:val="CCCCCC"/>
+          <w:kern w:val="0"/>
+          <w:sz w:val="27"/>
+          <w:szCs w:val="27"/>
+          <w:lang w:eastAsia="en-IN"/>
+          <w14:ligatures w14:val="none"/>
+        </w:rPr>
+        <w:t>));</w:t>
+      </w:r>
+    </w:p>
+    <w:p>
+      <w:pPr>
+        <w:pStyle w:val="ListParagraph"/>
+        <w:numPr>
+          <w:ilvl w:val="0"/>
+          <w:numId w:val="8"/>
+        </w:numPr>
+        <w:rPr>
+          <w:rFonts w:ascii="Courier New" w:hAnsi="Courier New" w:cs="Courier New"/>
+          <w:sz w:val="28"/>
+          <w:szCs w:val="28"/>
+        </w:rPr>
+      </w:pPr>
+      <w:r>
+        <w:rPr>
+          <w:rFonts w:ascii="Times New Roman" w:hAnsi="Times New Roman" w:cs="Times New Roman"/>
+          <w:sz w:val="28"/>
+          <w:szCs w:val="28"/>
+        </w:rPr>
+        <w:t xml:space="preserve">In DIY MW, need to use </w:t>
+      </w:r>
+      <w:r>
+        <w:rPr>
+          <w:rFonts w:ascii="Courier New" w:hAnsi="Courier New" w:cs="Courier New"/>
+          <w:sz w:val="28"/>
+          <w:szCs w:val="28"/>
+        </w:rPr>
+        <w:t>next();</w:t>
+      </w:r>
+      <w:r>
+        <w:rPr>
+          <w:rFonts w:ascii="Times New Roman" w:hAnsi="Times New Roman" w:cs="Times New Roman"/>
+          <w:sz w:val="28"/>
+          <w:szCs w:val="28"/>
+        </w:rPr>
+        <w:t xml:space="preserve"> at the end of function.</w:t>
+      </w:r>
+    </w:p>
+    <w:p>
+      <w:pPr>
+        <w:shd w:val="clear" w:color="auto" w:fill="1F1F1F"/>
+        <w:spacing w:after="0" w:line="360" w:lineRule="atLeast"/>
+        <w:rPr>
+          <w:rFonts w:ascii="Consolas" w:eastAsia="Times New Roman" w:hAnsi="Consolas" w:cs="Times New Roman"/>
+          <w:color w:val="CCCCCC"/>
+          <w:kern w:val="0"/>
+          <w:sz w:val="27"/>
+          <w:szCs w:val="27"/>
+          <w:lang w:eastAsia="en-IN"/>
+          <w14:ligatures w14:val="none"/>
+        </w:rPr>
+      </w:pPr>
+      <w:proofErr w:type="spellStart"/>
+      <w:r>
+        <w:rPr>
+          <w:rFonts w:ascii="Consolas" w:eastAsia="Times New Roman" w:hAnsi="Consolas" w:cs="Times New Roman"/>
+          <w:color w:val="4FC1FF"/>
+          <w:kern w:val="0"/>
+          <w:sz w:val="27"/>
+          <w:szCs w:val="27"/>
+          <w:lang w:eastAsia="en-IN"/>
+          <w14:ligatures w14:val="none"/>
+        </w:rPr>
+        <w:t>APP</w:t>
+      </w:r>
+      <w:r>
+        <w:rPr>
+          <w:rFonts w:ascii="Consolas" w:eastAsia="Times New Roman" w:hAnsi="Consolas" w:cs="Times New Roman"/>
+          <w:color w:val="CCCCCC"/>
+          <w:kern w:val="0"/>
+          <w:sz w:val="27"/>
+          <w:szCs w:val="27"/>
+          <w:lang w:eastAsia="en-IN"/>
+          <w14:ligatures w14:val="none"/>
+        </w:rPr>
+        <w:t>.</w:t>
+      </w:r>
+      <w:r>
+        <w:rPr>
+          <w:rFonts w:ascii="Consolas" w:eastAsia="Times New Roman" w:hAnsi="Consolas" w:cs="Times New Roman"/>
+          <w:color w:val="DCDCAA"/>
+          <w:kern w:val="0"/>
+          <w:sz w:val="27"/>
+          <w:szCs w:val="27"/>
+          <w:lang w:eastAsia="en-IN"/>
+          <w14:ligatures w14:val="none"/>
+        </w:rPr>
+        <w:t>use</w:t>
+      </w:r>
+      <w:proofErr w:type="spellEnd"/>
+      <w:r>
+        <w:rPr>
+          <w:rFonts w:ascii="Consolas" w:eastAsia="Times New Roman" w:hAnsi="Consolas" w:cs="Times New Roman"/>
+          <w:color w:val="CCCCCC"/>
+          <w:kern w:val="0"/>
+          <w:sz w:val="27"/>
+          <w:szCs w:val="27"/>
+          <w:lang w:eastAsia="en-IN"/>
+          <w14:ligatures w14:val="none"/>
+        </w:rPr>
+        <w:t>(</w:t>
+      </w:r>
+      <w:r>
+        <w:rPr>
+          <w:rFonts w:ascii="Consolas" w:eastAsia="Times New Roman" w:hAnsi="Consolas" w:cs="Times New Roman"/>
+          <w:color w:val="DCDCAA"/>
+          <w:kern w:val="0"/>
+          <w:sz w:val="27"/>
+          <w:szCs w:val="27"/>
+          <w:lang w:eastAsia="en-IN"/>
+          <w14:ligatures w14:val="none"/>
+        </w:rPr>
+        <w:t>logger</w:t>
+      </w:r>
+      <w:r>
+        <w:rPr>
+          <w:rFonts w:ascii="Consolas" w:eastAsia="Times New Roman" w:hAnsi="Consolas" w:cs="Times New Roman"/>
+          <w:color w:val="CCCCCC"/>
+          <w:kern w:val="0"/>
+          <w:sz w:val="27"/>
+          <w:szCs w:val="27"/>
+          <w:lang w:eastAsia="en-IN"/>
+          <w14:ligatures w14:val="none"/>
+        </w:rPr>
+        <w:t>);</w:t>
+      </w:r>
+    </w:p>
+    <w:p>
+      <w:pPr>
+        <w:shd w:val="clear" w:color="auto" w:fill="1F1F1F"/>
+        <w:spacing w:after="0" w:line="360" w:lineRule="atLeast"/>
+        <w:rPr>
+          <w:rFonts w:ascii="Consolas" w:eastAsia="Times New Roman" w:hAnsi="Consolas" w:cs="Times New Roman"/>
+          <w:color w:val="CCCCCC"/>
+          <w:kern w:val="0"/>
+          <w:sz w:val="27"/>
+          <w:szCs w:val="27"/>
+          <w:lang w:eastAsia="en-IN"/>
+          <w14:ligatures w14:val="none"/>
+        </w:rPr>
+      </w:pPr>
+      <w:r>
+        <w:rPr>
+          <w:rFonts w:ascii="Consolas" w:eastAsia="Times New Roman" w:hAnsi="Consolas" w:cs="Times New Roman"/>
+          <w:color w:val="569CD6"/>
+          <w:kern w:val="0"/>
+          <w:sz w:val="27"/>
+          <w:szCs w:val="27"/>
+          <w:lang w:eastAsia="en-IN"/>
+          <w14:ligatures w14:val="none"/>
+        </w:rPr>
+        <w:t>function</w:t>
+      </w:r>
+      <w:r>
+        <w:rPr>
+          <w:rFonts w:ascii="Consolas" w:eastAsia="Times New Roman" w:hAnsi="Consolas" w:cs="Times New Roman"/>
+          <w:color w:val="CCCCCC"/>
+          <w:kern w:val="0"/>
+          <w:sz w:val="27"/>
+          <w:szCs w:val="27"/>
+          <w:lang w:eastAsia="en-IN"/>
+          <w14:ligatures w14:val="none"/>
+        </w:rPr>
+        <w:t xml:space="preserve"> </w:t>
+      </w:r>
+      <w:r>
+        <w:rPr>
+          <w:rFonts w:ascii="Consolas" w:eastAsia="Times New Roman" w:hAnsi="Consolas" w:cs="Times New Roman"/>
+          <w:color w:val="DCDCAA"/>
+          <w:kern w:val="0"/>
+          <w:sz w:val="27"/>
+          <w:szCs w:val="27"/>
+          <w:lang w:eastAsia="en-IN"/>
+          <w14:ligatures w14:val="none"/>
+        </w:rPr>
+        <w:t>logger</w:t>
+      </w:r>
+      <w:r>
+        <w:rPr>
+          <w:rFonts w:ascii="Consolas" w:eastAsia="Times New Roman" w:hAnsi="Consolas" w:cs="Times New Roman"/>
+          <w:color w:val="CCCCCC"/>
+          <w:kern w:val="0"/>
+          <w:sz w:val="27"/>
+          <w:szCs w:val="27"/>
+          <w:lang w:eastAsia="en-IN"/>
+          <w14:ligatures w14:val="none"/>
+        </w:rPr>
+        <w:t>(</w:t>
+      </w:r>
+      <w:proofErr w:type="spellStart"/>
+      <w:r>
+        <w:rPr>
+          <w:rFonts w:ascii="Consolas" w:eastAsia="Times New Roman" w:hAnsi="Consolas" w:cs="Times New Roman"/>
+          <w:color w:val="9CDCFE"/>
+          <w:kern w:val="0"/>
+          <w:sz w:val="27"/>
+          <w:szCs w:val="27"/>
+          <w:lang w:eastAsia="en-IN"/>
+          <w14:ligatures w14:val="none"/>
+        </w:rPr>
+        <w:t>req</w:t>
+      </w:r>
+      <w:proofErr w:type="spellEnd"/>
+      <w:r>
+        <w:rPr>
+          <w:rFonts w:ascii="Consolas" w:eastAsia="Times New Roman" w:hAnsi="Consolas" w:cs="Times New Roman"/>
+          <w:color w:val="CCCCCC"/>
+          <w:kern w:val="0"/>
+          <w:sz w:val="27"/>
+          <w:szCs w:val="27"/>
+          <w:lang w:eastAsia="en-IN"/>
+          <w14:ligatures w14:val="none"/>
+        </w:rPr>
+        <w:t xml:space="preserve">, </w:t>
+      </w:r>
+      <w:r>
+        <w:rPr>
+          <w:rFonts w:ascii="Consolas" w:eastAsia="Times New Roman" w:hAnsi="Consolas" w:cs="Times New Roman"/>
+          <w:color w:val="9CDCFE"/>
+          <w:kern w:val="0"/>
+          <w:sz w:val="27"/>
+          <w:szCs w:val="27"/>
+          <w:lang w:eastAsia="en-IN"/>
+          <w14:ligatures w14:val="none"/>
+        </w:rPr>
+        <w:t>res</w:t>
+      </w:r>
+      <w:r>
+        <w:rPr>
+          <w:rFonts w:ascii="Consolas" w:eastAsia="Times New Roman" w:hAnsi="Consolas" w:cs="Times New Roman"/>
+          <w:color w:val="CCCCCC"/>
+          <w:kern w:val="0"/>
+          <w:sz w:val="27"/>
+          <w:szCs w:val="27"/>
+          <w:lang w:eastAsia="en-IN"/>
+          <w14:ligatures w14:val="none"/>
+        </w:rPr>
+        <w:t xml:space="preserve">, </w:t>
+      </w:r>
+      <w:r>
+        <w:rPr>
+          <w:rFonts w:ascii="Consolas" w:eastAsia="Times New Roman" w:hAnsi="Consolas" w:cs="Times New Roman"/>
+          <w:color w:val="9CDCFE"/>
+          <w:kern w:val="0"/>
+          <w:sz w:val="27"/>
+          <w:szCs w:val="27"/>
+          <w:lang w:eastAsia="en-IN"/>
+          <w14:ligatures w14:val="none"/>
+        </w:rPr>
+        <w:t>next</w:t>
+      </w:r>
+      <w:r>
+        <w:rPr>
+          <w:rFonts w:ascii="Consolas" w:eastAsia="Times New Roman" w:hAnsi="Consolas" w:cs="Times New Roman"/>
+          <w:color w:val="CCCCCC"/>
+          <w:kern w:val="0"/>
+          <w:sz w:val="27"/>
+          <w:szCs w:val="27"/>
+          <w:lang w:eastAsia="en-IN"/>
+          <w14:ligatures w14:val="none"/>
+        </w:rPr>
+        <w:t>) {</w:t>
+      </w:r>
+    </w:p>
+    <w:p>
+      <w:pPr>
+        <w:shd w:val="clear" w:color="auto" w:fill="1F1F1F"/>
+        <w:spacing w:after="0" w:line="360" w:lineRule="atLeast"/>
+        <w:rPr>
+          <w:rFonts w:ascii="Consolas" w:eastAsia="Times New Roman" w:hAnsi="Consolas" w:cs="Times New Roman"/>
+          <w:color w:val="CCCCCC"/>
+          <w:kern w:val="0"/>
+          <w:sz w:val="27"/>
+          <w:szCs w:val="27"/>
+          <w:lang w:eastAsia="en-IN"/>
+          <w14:ligatures w14:val="none"/>
+        </w:rPr>
+      </w:pPr>
+      <w:r>
+        <w:rPr>
+          <w:rFonts w:ascii="Consolas" w:eastAsia="Times New Roman" w:hAnsi="Consolas" w:cs="Times New Roman"/>
+          <w:color w:val="CCCCCC"/>
+          <w:kern w:val="0"/>
+          <w:sz w:val="27"/>
+          <w:szCs w:val="27"/>
+          <w:lang w:eastAsia="en-IN"/>
+          <w14:ligatures w14:val="none"/>
+        </w:rPr>
+        <w:t xml:space="preserve">    </w:t>
+      </w:r>
+      <w:r>
+        <w:rPr>
+          <w:rFonts w:ascii="Consolas" w:eastAsia="Times New Roman" w:hAnsi="Consolas" w:cs="Times New Roman"/>
+          <w:color w:val="9CDCFE"/>
+          <w:kern w:val="0"/>
+          <w:sz w:val="27"/>
+          <w:szCs w:val="27"/>
+          <w:lang w:eastAsia="en-IN"/>
+          <w14:ligatures w14:val="none"/>
+        </w:rPr>
+        <w:t>console</w:t>
+      </w:r>
+      <w:r>
+        <w:rPr>
+          <w:rFonts w:ascii="Consolas" w:eastAsia="Times New Roman" w:hAnsi="Consolas" w:cs="Times New Roman"/>
+          <w:color w:val="CCCCCC"/>
+          <w:kern w:val="0"/>
+          <w:sz w:val="27"/>
+          <w:szCs w:val="27"/>
+          <w:lang w:eastAsia="en-IN"/>
+          <w14:ligatures w14:val="none"/>
+        </w:rPr>
+        <w:t>.</w:t>
+      </w:r>
+      <w:r>
+        <w:rPr>
+          <w:rFonts w:ascii="Consolas" w:eastAsia="Times New Roman" w:hAnsi="Consolas" w:cs="Times New Roman"/>
+          <w:color w:val="DCDCAA"/>
+          <w:kern w:val="0"/>
+          <w:sz w:val="27"/>
+          <w:szCs w:val="27"/>
+          <w:lang w:eastAsia="en-IN"/>
+          <w14:ligatures w14:val="none"/>
+        </w:rPr>
+        <w:t>log</w:t>
+      </w:r>
+      <w:r>
+        <w:rPr>
+          <w:rFonts w:ascii="Consolas" w:eastAsia="Times New Roman" w:hAnsi="Consolas" w:cs="Times New Roman"/>
+          <w:color w:val="CCCCCC"/>
+          <w:kern w:val="0"/>
+          <w:sz w:val="27"/>
+          <w:szCs w:val="27"/>
+          <w:lang w:eastAsia="en-IN"/>
+          <w14:ligatures w14:val="none"/>
+        </w:rPr>
+        <w:t>(</w:t>
+      </w:r>
+      <w:proofErr w:type="spellStart"/>
+      <w:r>
+        <w:rPr>
+          <w:rFonts w:ascii="Consolas" w:eastAsia="Times New Roman" w:hAnsi="Consolas" w:cs="Times New Roman"/>
+          <w:color w:val="9CDCFE"/>
+          <w:kern w:val="0"/>
+          <w:sz w:val="27"/>
+          <w:szCs w:val="27"/>
+          <w:lang w:eastAsia="en-IN"/>
+          <w14:ligatures w14:val="none"/>
+        </w:rPr>
+        <w:t>req</w:t>
+      </w:r>
+      <w:r>
+        <w:rPr>
+          <w:rFonts w:ascii="Consolas" w:eastAsia="Times New Roman" w:hAnsi="Consolas" w:cs="Times New Roman"/>
+          <w:color w:val="CCCCCC"/>
+          <w:kern w:val="0"/>
+          <w:sz w:val="27"/>
+          <w:szCs w:val="27"/>
+          <w:lang w:eastAsia="en-IN"/>
+          <w14:ligatures w14:val="none"/>
+        </w:rPr>
+        <w:t>.</w:t>
+      </w:r>
+      <w:r>
+        <w:rPr>
+          <w:rFonts w:ascii="Consolas" w:eastAsia="Times New Roman" w:hAnsi="Consolas" w:cs="Times New Roman"/>
+          <w:color w:val="9CDCFE"/>
+          <w:kern w:val="0"/>
+          <w:sz w:val="27"/>
+          <w:szCs w:val="27"/>
+          <w:lang w:eastAsia="en-IN"/>
+          <w14:ligatures w14:val="none"/>
+        </w:rPr>
+        <w:t>method</w:t>
+      </w:r>
+      <w:proofErr w:type="spellEnd"/>
+      <w:r>
+        <w:rPr>
+          <w:rFonts w:ascii="Consolas" w:eastAsia="Times New Roman" w:hAnsi="Consolas" w:cs="Times New Roman"/>
+          <w:color w:val="CCCCCC"/>
+          <w:kern w:val="0"/>
+          <w:sz w:val="27"/>
+          <w:szCs w:val="27"/>
+          <w:lang w:eastAsia="en-IN"/>
+          <w14:ligatures w14:val="none"/>
+        </w:rPr>
+        <w:t>);</w:t>
+      </w:r>
+    </w:p>
+    <w:p>
+      <w:pPr>
+        <w:shd w:val="clear" w:color="auto" w:fill="1F1F1F"/>
+        <w:spacing w:after="0" w:line="360" w:lineRule="atLeast"/>
+        <w:rPr>
+          <w:rFonts w:ascii="Consolas" w:eastAsia="Times New Roman" w:hAnsi="Consolas" w:cs="Times New Roman"/>
+          <w:color w:val="CCCCCC"/>
+          <w:kern w:val="0"/>
+          <w:sz w:val="27"/>
+          <w:szCs w:val="27"/>
+          <w:lang w:eastAsia="en-IN"/>
+          <w14:ligatures w14:val="none"/>
+        </w:rPr>
+      </w:pPr>
+      <w:r>
+        <w:rPr>
+          <w:rFonts w:ascii="Consolas" w:eastAsia="Times New Roman" w:hAnsi="Consolas" w:cs="Times New Roman"/>
+          <w:color w:val="CCCCCC"/>
+          <w:kern w:val="0"/>
+          <w:sz w:val="27"/>
+          <w:szCs w:val="27"/>
+          <w:lang w:eastAsia="en-IN"/>
+          <w14:ligatures w14:val="none"/>
+        </w:rPr>
+        <w:t xml:space="preserve">    </w:t>
+      </w:r>
+      <w:r>
+        <w:rPr>
+          <w:rFonts w:ascii="Consolas" w:eastAsia="Times New Roman" w:hAnsi="Consolas" w:cs="Times New Roman"/>
+          <w:color w:val="9CDCFE"/>
+          <w:kern w:val="0"/>
+          <w:sz w:val="27"/>
+          <w:szCs w:val="27"/>
+          <w:lang w:eastAsia="en-IN"/>
+          <w14:ligatures w14:val="none"/>
+        </w:rPr>
+        <w:t>console</w:t>
+      </w:r>
+      <w:r>
+        <w:rPr>
+          <w:rFonts w:ascii="Consolas" w:eastAsia="Times New Roman" w:hAnsi="Consolas" w:cs="Times New Roman"/>
+          <w:color w:val="CCCCCC"/>
+          <w:kern w:val="0"/>
+          <w:sz w:val="27"/>
+          <w:szCs w:val="27"/>
+          <w:lang w:eastAsia="en-IN"/>
+          <w14:ligatures w14:val="none"/>
+        </w:rPr>
+        <w:t>.</w:t>
+      </w:r>
+      <w:r>
+        <w:rPr>
+          <w:rFonts w:ascii="Consolas" w:eastAsia="Times New Roman" w:hAnsi="Consolas" w:cs="Times New Roman"/>
+          <w:color w:val="DCDCAA"/>
+          <w:kern w:val="0"/>
+          <w:sz w:val="27"/>
+          <w:szCs w:val="27"/>
+          <w:lang w:eastAsia="en-IN"/>
+          <w14:ligatures w14:val="none"/>
+        </w:rPr>
+        <w:t>log</w:t>
+      </w:r>
+      <w:r>
+        <w:rPr>
+          <w:rFonts w:ascii="Consolas" w:eastAsia="Times New Roman" w:hAnsi="Consolas" w:cs="Times New Roman"/>
+          <w:color w:val="CCCCCC"/>
+          <w:kern w:val="0"/>
+          <w:sz w:val="27"/>
+          <w:szCs w:val="27"/>
+          <w:lang w:eastAsia="en-IN"/>
+          <w14:ligatures w14:val="none"/>
+        </w:rPr>
+        <w:t>(</w:t>
+      </w:r>
+      <w:r>
+        <w:rPr>
+          <w:rFonts w:ascii="Consolas" w:eastAsia="Times New Roman" w:hAnsi="Consolas" w:cs="Times New Roman"/>
+          <w:color w:val="9CDCFE"/>
+          <w:kern w:val="0"/>
+          <w:sz w:val="27"/>
+          <w:szCs w:val="27"/>
+          <w:lang w:eastAsia="en-IN"/>
+          <w14:ligatures w14:val="none"/>
+        </w:rPr>
+        <w:t>req</w:t>
+      </w:r>
+      <w:r>
+        <w:rPr>
+          <w:rFonts w:ascii="Consolas" w:eastAsia="Times New Roman" w:hAnsi="Consolas" w:cs="Times New Roman"/>
+          <w:color w:val="CCCCCC"/>
+          <w:kern w:val="0"/>
+          <w:sz w:val="27"/>
+          <w:szCs w:val="27"/>
+          <w:lang w:eastAsia="en-IN"/>
+          <w14:ligatures w14:val="none"/>
+        </w:rPr>
+        <w:t>.</w:t>
+      </w:r>
+      <w:r>
+        <w:rPr>
+          <w:rFonts w:ascii="Consolas" w:eastAsia="Times New Roman" w:hAnsi="Consolas" w:cs="Times New Roman"/>
+          <w:color w:val="9CDCFE"/>
+          <w:kern w:val="0"/>
+          <w:sz w:val="27"/>
+          <w:szCs w:val="27"/>
+          <w:lang w:eastAsia="en-IN"/>
+          <w14:ligatures w14:val="none"/>
+        </w:rPr>
+        <w:t>url</w:t>
+      </w:r>
+      <w:r>
+        <w:rPr>
+          <w:rFonts w:ascii="Consolas" w:eastAsia="Times New Roman" w:hAnsi="Consolas" w:cs="Times New Roman"/>
+          <w:color w:val="CCCCCC"/>
+          <w:kern w:val="0"/>
+          <w:sz w:val="27"/>
+          <w:szCs w:val="27"/>
+          <w:lang w:eastAsia="en-IN"/>
+          <w14:ligatures w14:val="none"/>
+        </w:rPr>
+        <w:t>);</w:t>
+      </w:r>
+    </w:p>
+    <w:p>
+      <w:pPr>
+        <w:shd w:val="clear" w:color="auto" w:fill="1F1F1F"/>
+        <w:spacing w:after="0" w:line="360" w:lineRule="atLeast"/>
+        <w:rPr>
+          <w:rFonts w:ascii="Consolas" w:eastAsia="Times New Roman" w:hAnsi="Consolas" w:cs="Times New Roman"/>
+          <w:color w:val="CCCCCC"/>
+          <w:kern w:val="0"/>
+          <w:sz w:val="27"/>
+          <w:szCs w:val="27"/>
+          <w:lang w:eastAsia="en-IN"/>
+          <w14:ligatures w14:val="none"/>
+        </w:rPr>
+      </w:pPr>
+      <w:r>
+        <w:rPr>
+          <w:rFonts w:ascii="Consolas" w:eastAsia="Times New Roman" w:hAnsi="Consolas" w:cs="Times New Roman"/>
+          <w:color w:val="CCCCCC"/>
+          <w:kern w:val="0"/>
+          <w:sz w:val="27"/>
+          <w:szCs w:val="27"/>
+          <w:lang w:eastAsia="en-IN"/>
+          <w14:ligatures w14:val="none"/>
+        </w:rPr>
+        <w:t xml:space="preserve">    </w:t>
+      </w:r>
+      <w:r>
+        <w:rPr>
+          <w:rFonts w:ascii="Consolas" w:eastAsia="Times New Roman" w:hAnsi="Consolas" w:cs="Times New Roman"/>
+          <w:color w:val="DCDCAA"/>
+          <w:kern w:val="0"/>
+          <w:sz w:val="27"/>
+          <w:szCs w:val="27"/>
+          <w:lang w:eastAsia="en-IN"/>
+          <w14:ligatures w14:val="none"/>
+        </w:rPr>
+        <w:t>next</w:t>
+      </w:r>
+      <w:r>
+        <w:rPr>
+          <w:rFonts w:ascii="Consolas" w:eastAsia="Times New Roman" w:hAnsi="Consolas" w:cs="Times New Roman"/>
+          <w:color w:val="CCCCCC"/>
+          <w:kern w:val="0"/>
+          <w:sz w:val="27"/>
+          <w:szCs w:val="27"/>
+          <w:lang w:eastAsia="en-IN"/>
+          <w14:ligatures w14:val="none"/>
+        </w:rPr>
+        <w:t>();</w:t>
+      </w:r>
+    </w:p>
+    <w:p>
+      <w:pPr>
+        <w:shd w:val="clear" w:color="auto" w:fill="1F1F1F"/>
+        <w:spacing w:after="0" w:line="360" w:lineRule="atLeast"/>
+        <w:rPr>
+          <w:rFonts w:ascii="Consolas" w:eastAsia="Times New Roman" w:hAnsi="Consolas" w:cs="Times New Roman"/>
+          <w:color w:val="CCCCCC"/>
+          <w:kern w:val="0"/>
+          <w:sz w:val="27"/>
+          <w:szCs w:val="27"/>
+          <w:lang w:eastAsia="en-IN"/>
+          <w14:ligatures w14:val="none"/>
+        </w:rPr>
+      </w:pPr>
+      <w:r>
+        <w:rPr>
+          <w:rFonts w:ascii="Consolas" w:eastAsia="Times New Roman" w:hAnsi="Consolas" w:cs="Times New Roman"/>
+          <w:color w:val="CCCCCC"/>
+          <w:kern w:val="0"/>
+          <w:sz w:val="27"/>
+          <w:szCs w:val="27"/>
+          <w:lang w:eastAsia="en-IN"/>
+          <w14:ligatures w14:val="none"/>
+        </w:rPr>
+        <w:t>}</w:t>
+      </w:r>
+    </w:p>
+    <w:p>
+      <w:pPr>
+        <w:rPr>
+          <w:rFonts w:ascii="Times New Roman" w:hAnsi="Times New Roman" w:cs="Times New Roman"/>
           <w:sz w:val="28"/>
           <w:szCs w:val="28"/>
         </w:rPr>
@@ -5355,7 +6312,7 @@
     </w:p>
     <w:sectPr>
       <w:pgSz w:w="11906" w:h="16838"/>
-      <w:pgMar w:top="1440" w:right="1440" w:bottom="1440" w:left="1440" w:header="708" w:footer="708" w:gutter="0"/>
+      <w:pgMar w:top="720" w:right="720" w:bottom="720" w:left="720" w:header="708" w:footer="708" w:gutter="0"/>
       <w:cols w:space="708"/>
       <w:docGrid w:linePitch="360"/>
     </w:sectPr>
@@ -5752,6 +6709,119 @@
     </w:lvl>
   </w:abstractNum>
   <w:abstractNum w:abstractNumId="3" w15:restartNumberingAfterBreak="0">
+    <w:nsid w:val="3C042222"/>
+    <w:multiLevelType w:val="hybridMultilevel"/>
+    <w:tmpl w:val="41CA5CEC"/>
+    <w:lvl w:ilvl="0" w:tplc="40090001">
+      <w:start w:val="1"/>
+      <w:numFmt w:val="bullet"/>
+      <w:lvlText w:val=""/>
+      <w:lvlJc w:val="left"/>
+      <w:pPr>
+        <w:ind w:left="720" w:hanging="360"/>
+      </w:pPr>
+      <w:rPr>
+        <w:rFonts w:ascii="Symbol" w:hAnsi="Symbol" w:hint="default"/>
+      </w:rPr>
+    </w:lvl>
+    <w:lvl w:ilvl="1" w:tplc="40090003">
+      <w:start w:val="1"/>
+      <w:numFmt w:val="bullet"/>
+      <w:lvlText w:val="o"/>
+      <w:lvlJc w:val="left"/>
+      <w:pPr>
+        <w:ind w:left="1440" w:hanging="360"/>
+      </w:pPr>
+      <w:rPr>
+        <w:rFonts w:ascii="Courier New" w:hAnsi="Courier New" w:cs="Courier New" w:hint="default"/>
+      </w:rPr>
+    </w:lvl>
+    <w:lvl w:ilvl="2" w:tplc="40090005" w:tentative="1">
+      <w:start w:val="1"/>
+      <w:numFmt w:val="bullet"/>
+      <w:lvlText w:val=""/>
+      <w:lvlJc w:val="left"/>
+      <w:pPr>
+        <w:ind w:left="2160" w:hanging="360"/>
+      </w:pPr>
+      <w:rPr>
+        <w:rFonts w:ascii="Wingdings" w:hAnsi="Wingdings" w:hint="default"/>
+      </w:rPr>
+    </w:lvl>
+    <w:lvl w:ilvl="3" w:tplc="40090001" w:tentative="1">
+      <w:start w:val="1"/>
+      <w:numFmt w:val="bullet"/>
+      <w:lvlText w:val=""/>
+      <w:lvlJc w:val="left"/>
+      <w:pPr>
+        <w:ind w:left="2880" w:hanging="360"/>
+      </w:pPr>
+      <w:rPr>
+        <w:rFonts w:ascii="Symbol" w:hAnsi="Symbol" w:hint="default"/>
+      </w:rPr>
+    </w:lvl>
+    <w:lvl w:ilvl="4" w:tplc="40090003" w:tentative="1">
+      <w:start w:val="1"/>
+      <w:numFmt w:val="bullet"/>
+      <w:lvlText w:val="o"/>
+      <w:lvlJc w:val="left"/>
+      <w:pPr>
+        <w:ind w:left="3600" w:hanging="360"/>
+      </w:pPr>
+      <w:rPr>
+        <w:rFonts w:ascii="Courier New" w:hAnsi="Courier New" w:cs="Courier New" w:hint="default"/>
+      </w:rPr>
+    </w:lvl>
+    <w:lvl w:ilvl="5" w:tplc="40090005" w:tentative="1">
+      <w:start w:val="1"/>
+      <w:numFmt w:val="bullet"/>
+      <w:lvlText w:val=""/>
+      <w:lvlJc w:val="left"/>
+      <w:pPr>
+        <w:ind w:left="4320" w:hanging="360"/>
+      </w:pPr>
+      <w:rPr>
+        <w:rFonts w:ascii="Wingdings" w:hAnsi="Wingdings" w:hint="default"/>
+      </w:rPr>
+    </w:lvl>
+    <w:lvl w:ilvl="6" w:tplc="40090001" w:tentative="1">
+      <w:start w:val="1"/>
+      <w:numFmt w:val="bullet"/>
+      <w:lvlText w:val=""/>
+      <w:lvlJc w:val="left"/>
+      <w:pPr>
+        <w:ind w:left="5040" w:hanging="360"/>
+      </w:pPr>
+      <w:rPr>
+        <w:rFonts w:ascii="Symbol" w:hAnsi="Symbol" w:hint="default"/>
+      </w:rPr>
+    </w:lvl>
+    <w:lvl w:ilvl="7" w:tplc="40090003" w:tentative="1">
+      <w:start w:val="1"/>
+      <w:numFmt w:val="bullet"/>
+      <w:lvlText w:val="o"/>
+      <w:lvlJc w:val="left"/>
+      <w:pPr>
+        <w:ind w:left="5760" w:hanging="360"/>
+      </w:pPr>
+      <w:rPr>
+        <w:rFonts w:ascii="Courier New" w:hAnsi="Courier New" w:cs="Courier New" w:hint="default"/>
+      </w:rPr>
+    </w:lvl>
+    <w:lvl w:ilvl="8" w:tplc="40090005" w:tentative="1">
+      <w:start w:val="1"/>
+      <w:numFmt w:val="bullet"/>
+      <w:lvlText w:val=""/>
+      <w:lvlJc w:val="left"/>
+      <w:pPr>
+        <w:ind w:left="6480" w:hanging="360"/>
+      </w:pPr>
+      <w:rPr>
+        <w:rFonts w:ascii="Wingdings" w:hAnsi="Wingdings" w:hint="default"/>
+      </w:rPr>
+    </w:lvl>
+  </w:abstractNum>
+  <w:abstractNum w:abstractNumId="4" w15:restartNumberingAfterBreak="0">
     <w:nsid w:val="44DA190F"/>
     <w:multiLevelType w:val="hybridMultilevel"/>
     <w:tmpl w:val="0F3CE090"/>
@@ -5864,7 +6934,7 @@
       </w:rPr>
     </w:lvl>
   </w:abstractNum>
-  <w:abstractNum w:abstractNumId="4" w15:restartNumberingAfterBreak="0">
+  <w:abstractNum w:abstractNumId="5" w15:restartNumberingAfterBreak="0">
     <w:nsid w:val="45AE587F"/>
     <w:multiLevelType w:val="hybridMultilevel"/>
     <w:tmpl w:val="B792EA7E"/>
@@ -5977,7 +7047,7 @@
       </w:rPr>
     </w:lvl>
   </w:abstractNum>
-  <w:abstractNum w:abstractNumId="5" w15:restartNumberingAfterBreak="0">
+  <w:abstractNum w:abstractNumId="6" w15:restartNumberingAfterBreak="0">
     <w:nsid w:val="4CF81348"/>
     <w:multiLevelType w:val="hybridMultilevel"/>
     <w:tmpl w:val="CAAA94D8"/>
@@ -6090,7 +7160,7 @@
       </w:rPr>
     </w:lvl>
   </w:abstractNum>
-  <w:abstractNum w:abstractNumId="6" w15:restartNumberingAfterBreak="0">
+  <w:abstractNum w:abstractNumId="7" w15:restartNumberingAfterBreak="0">
     <w:nsid w:val="6E347D91"/>
     <w:multiLevelType w:val="hybridMultilevel"/>
     <w:tmpl w:val="CE72685C"/>
@@ -6204,7 +7274,7 @@
     </w:lvl>
   </w:abstractNum>
   <w:num w:numId="1" w16cid:durableId="1209604883">
-    <w:abstractNumId w:val="5"/>
+    <w:abstractNumId w:val="6"/>
   </w:num>
   <w:num w:numId="2" w16cid:durableId="1188518814">
     <w:abstractNumId w:val="0"/>
@@ -6216,13 +7286,16 @@
     <w:abstractNumId w:val="2"/>
   </w:num>
   <w:num w:numId="5" w16cid:durableId="1075709319">
+    <w:abstractNumId w:val="5"/>
+  </w:num>
+  <w:num w:numId="6" w16cid:durableId="559558587">
     <w:abstractNumId w:val="4"/>
   </w:num>
-  <w:num w:numId="6" w16cid:durableId="559558587">
+  <w:num w:numId="7" w16cid:durableId="1056010984">
+    <w:abstractNumId w:val="7"/>
+  </w:num>
+  <w:num w:numId="8" w16cid:durableId="1077746837">
     <w:abstractNumId w:val="3"/>
-  </w:num>
-  <w:num w:numId="7" w16cid:durableId="1056010984">
-    <w:abstractNumId w:val="6"/>
   </w:num>
 </w:numbering>
 </file>

</xml_diff>